<commit_message>
Add PDF generator app with web UI and assets
Add a new certificate generator: "sección 7. generador de PDF" with app_certificados.py (HTTP server + Mac file dialogs) and frontend files (index.html, estilos.css, app.js). Includes command script, sample generated PDFs, __pycache__, and supporting assets. Also add a simple pdf/inicial_pdf.py (FPDF) and move mi_primer_certificado.pdf into pdf/. Adds certificado_paso2.pdf and updates .DS_Store and PYTHON.docx. The server uses openpyxl and paso9_excel_con_borde.GeneradorCertificado to produce PDFs.
</commit_message>
<xml_diff>
--- a/sección 7. generador de PDF/GENERADOR DE PDF CON PYTHON.docx
+++ b/sección 7. generador de PDF/GENERADOR DE PDF CON PYTHON.docx
@@ -23,7 +23,7 @@
           <w:szCs w:val="36"/>
           <w:lang w:val="es-ES_tradnl"/>
         </w:rPr>
-        <w:t>GENERADOR DE PDF CON PYTHON</w:t>
+        <w:t xml:space="preserve">GENERADOR DE PDF </w:t>
       </w:r>
     </w:p>
     <w:p>
@@ -38,6 +38,30 @@
           <w:lang w:val="es-ES_tradnl"/>
         </w:rPr>
       </w:pPr>
+      <w:r>
+        <w:rPr>
+          <w:rFonts w:ascii="Times New Roman" w:hAnsi="Times New Roman" w:cs="Times New Roman"/>
+          <w:b/>
+          <w:bCs/>
+          <w:sz w:val="36"/>
+          <w:szCs w:val="36"/>
+          <w:lang w:val="es-ES_tradnl"/>
+        </w:rPr>
+        <w:t>CON PYTHON</w:t>
+      </w:r>
+    </w:p>
+    <w:p>
+      <w:pPr>
+        <w:jc w:val="center"/>
+        <w:rPr>
+          <w:rFonts w:ascii="Times New Roman" w:hAnsi="Times New Roman" w:cs="Times New Roman"/>
+          <w:b/>
+          <w:bCs/>
+          <w:sz w:val="36"/>
+          <w:szCs w:val="36"/>
+          <w:lang w:val="es-ES_tradnl"/>
+        </w:rPr>
+      </w:pPr>
     </w:p>
     <w:p>
       <w:pPr>
@@ -53,14 +77,2412 @@
         </w:rPr>
         <w:t xml:space="preserve">Vamos a crear un generador de PDF con Python. </w:t>
       </w:r>
-    </w:p>
-    <w:p>
-      <w:pPr>
-        <w:rPr>
-          <w:rFonts w:ascii="Times New Roman" w:hAnsi="Times New Roman" w:cs="Times New Roman"/>
-          <w:lang w:val="es-ES_tradnl"/>
-        </w:rPr>
-      </w:pPr>
+      <w:r>
+        <w:rPr>
+          <w:rFonts w:ascii="Times New Roman" w:hAnsi="Times New Roman" w:cs="Times New Roman"/>
+          <w:lang w:val="es-ES_tradnl"/>
+        </w:rPr>
+        <w:t xml:space="preserve">Pedimos nombre, curso y fecha, por ejemplo y se creará un PDF. utilizaremos la librería fpdf2 que es más sencilla </w:t>
+      </w:r>
+    </w:p>
+    <w:p>
+      <w:pPr>
+        <w:rPr>
+          <w:rFonts w:ascii="Times New Roman" w:hAnsi="Times New Roman" w:cs="Times New Roman"/>
+          <w:b/>
+          <w:bCs/>
+          <w:sz w:val="28"/>
+          <w:szCs w:val="28"/>
+          <w:lang w:val="es-ES_tradnl"/>
+        </w:rPr>
+      </w:pPr>
+      <w:r>
+        <w:rPr>
+          <w:rFonts w:ascii="Times New Roman" w:hAnsi="Times New Roman" w:cs="Times New Roman"/>
+          <w:b/>
+          <w:bCs/>
+          <w:sz w:val="28"/>
+          <w:szCs w:val="28"/>
+          <w:lang w:val="es-ES_tradnl"/>
+        </w:rPr>
+        <w:t>Plan paso a paso</w:t>
+      </w:r>
+    </w:p>
+    <w:p>
+      <w:pPr>
+        <w:rPr>
+          <w:rFonts w:ascii="Times New Roman" w:hAnsi="Times New Roman" w:cs="Times New Roman"/>
+          <w:b/>
+          <w:bCs/>
+          <w:sz w:val="28"/>
+          <w:szCs w:val="28"/>
+          <w:lang w:val="es-ES_tradnl"/>
+        </w:rPr>
+      </w:pPr>
+    </w:p>
+    <w:tbl>
+      <w:tblPr>
+        <w:tblStyle w:val="Tablaconcuadrcula"/>
+        <w:tblpPr w:leftFromText="141" w:rightFromText="141" w:vertAnchor="text" w:horzAnchor="margin" w:tblpY="139"/>
+        <w:tblW w:w="0" w:type="auto"/>
+        <w:tblCellMar>
+          <w:top w:w="85" w:type="dxa"/>
+          <w:bottom w:w="85" w:type="dxa"/>
+        </w:tblCellMar>
+        <w:tblLook w:val="04A0" w:firstRow="1" w:lastRow="0" w:firstColumn="1" w:lastColumn="0" w:noHBand="0" w:noVBand="1"/>
+      </w:tblPr>
+      <w:tblGrid>
+        <w:gridCol w:w="4414"/>
+        <w:gridCol w:w="4414"/>
+      </w:tblGrid>
+      <w:tr>
+        <w:tc>
+          <w:tcPr>
+            <w:tcW w:w="4414" w:type="dxa"/>
+          </w:tcPr>
+          <w:p>
+            <w:pPr>
+              <w:jc w:val="center"/>
+              <w:rPr>
+                <w:rFonts w:ascii="Times New Roman" w:hAnsi="Times New Roman" w:cs="Times New Roman"/>
+                <w:b/>
+                <w:bCs/>
+                <w:lang w:val="es-ES_tradnl"/>
+              </w:rPr>
+            </w:pPr>
+            <w:r>
+              <w:rPr>
+                <w:rFonts w:ascii="Times New Roman" w:hAnsi="Times New Roman" w:cs="Times New Roman"/>
+                <w:b/>
+                <w:bCs/>
+                <w:color w:val="47D459" w:themeColor="accent3" w:themeTint="99"/>
+                <w:lang w:val="es-ES_tradnl"/>
+              </w:rPr>
+              <w:t xml:space="preserve">PASO </w:t>
+            </w:r>
+          </w:p>
+        </w:tc>
+        <w:tc>
+          <w:tcPr>
+            <w:tcW w:w="4414" w:type="dxa"/>
+          </w:tcPr>
+          <w:p>
+            <w:pPr>
+              <w:jc w:val="center"/>
+              <w:rPr>
+                <w:rFonts w:ascii="Times New Roman" w:hAnsi="Times New Roman" w:cs="Times New Roman"/>
+                <w:b/>
+                <w:bCs/>
+                <w:lang w:val="es-ES_tradnl"/>
+              </w:rPr>
+            </w:pPr>
+            <w:r>
+              <w:rPr>
+                <w:rFonts w:ascii="Times New Roman" w:hAnsi="Times New Roman" w:cs="Times New Roman"/>
+                <w:b/>
+                <w:bCs/>
+                <w:color w:val="00B050"/>
+                <w:lang w:val="es-ES_tradnl"/>
+              </w:rPr>
+              <w:t xml:space="preserve">QUÉ </w:t>
+            </w:r>
+            <w:proofErr w:type="gramStart"/>
+            <w:r>
+              <w:rPr>
+                <w:rFonts w:ascii="Times New Roman" w:hAnsi="Times New Roman" w:cs="Times New Roman"/>
+                <w:b/>
+                <w:bCs/>
+                <w:color w:val="00B050"/>
+                <w:lang w:val="es-ES_tradnl"/>
+              </w:rPr>
+              <w:t>APRENDES ?</w:t>
+            </w:r>
+            <w:proofErr w:type="gramEnd"/>
+          </w:p>
+        </w:tc>
+      </w:tr>
+      <w:tr>
+        <w:trPr>
+          <w:trHeight w:val="156"/>
+        </w:trPr>
+        <w:tc>
+          <w:tcPr>
+            <w:tcW w:w="4414" w:type="dxa"/>
+          </w:tcPr>
+          <w:p>
+            <w:pPr>
+              <w:jc w:val="center"/>
+              <w:rPr>
+                <w:rFonts w:ascii="Times New Roman" w:hAnsi="Times New Roman" w:cs="Times New Roman"/>
+                <w:b/>
+                <w:bCs/>
+                <w:sz w:val="15"/>
+                <w:szCs w:val="15"/>
+                <w:lang w:val="es-ES_tradnl"/>
+              </w:rPr>
+            </w:pPr>
+            <w:r>
+              <w:rPr>
+                <w:rFonts w:ascii="Times New Roman" w:hAnsi="Times New Roman" w:cs="Times New Roman"/>
+                <w:b/>
+                <w:bCs/>
+                <w:sz w:val="15"/>
+                <w:szCs w:val="15"/>
+                <w:lang w:val="es-ES_tradnl"/>
+              </w:rPr>
+              <w:t>Paso 1</w:t>
+            </w:r>
+          </w:p>
+        </w:tc>
+        <w:tc>
+          <w:tcPr>
+            <w:tcW w:w="4414" w:type="dxa"/>
+          </w:tcPr>
+          <w:p>
+            <w:pPr>
+              <w:rPr>
+                <w:rFonts w:ascii="Times New Roman" w:hAnsi="Times New Roman" w:cs="Times New Roman"/>
+                <w:b/>
+                <w:bCs/>
+                <w:sz w:val="15"/>
+                <w:szCs w:val="15"/>
+                <w:lang w:val="es-ES_tradnl"/>
+              </w:rPr>
+            </w:pPr>
+            <w:r>
+              <w:rPr>
+                <w:rFonts w:ascii="Times New Roman" w:hAnsi="Times New Roman" w:cs="Times New Roman"/>
+                <w:b/>
+                <w:bCs/>
+                <w:sz w:val="15"/>
+                <w:szCs w:val="15"/>
+                <w:lang w:val="es-ES_tradnl"/>
+              </w:rPr>
+              <w:t>Instalar fpdf2 y crear un PDF vacío con un título</w:t>
+            </w:r>
+          </w:p>
+        </w:tc>
+      </w:tr>
+      <w:tr>
+        <w:tc>
+          <w:tcPr>
+            <w:tcW w:w="4414" w:type="dxa"/>
+          </w:tcPr>
+          <w:p>
+            <w:pPr>
+              <w:jc w:val="center"/>
+              <w:rPr>
+                <w:rFonts w:ascii="Times New Roman" w:hAnsi="Times New Roman" w:cs="Times New Roman"/>
+                <w:b/>
+                <w:bCs/>
+                <w:sz w:val="15"/>
+                <w:szCs w:val="15"/>
+                <w:lang w:val="es-ES_tradnl"/>
+              </w:rPr>
+            </w:pPr>
+            <w:r>
+              <w:rPr>
+                <w:rFonts w:ascii="Times New Roman" w:hAnsi="Times New Roman" w:cs="Times New Roman"/>
+                <w:b/>
+                <w:bCs/>
+                <w:sz w:val="15"/>
+                <w:szCs w:val="15"/>
+                <w:lang w:val="es-ES_tradnl"/>
+              </w:rPr>
+              <w:t>Paso 2</w:t>
+            </w:r>
+          </w:p>
+        </w:tc>
+        <w:tc>
+          <w:tcPr>
+            <w:tcW w:w="4414" w:type="dxa"/>
+          </w:tcPr>
+          <w:p>
+            <w:pPr>
+              <w:rPr>
+                <w:rFonts w:ascii="Times New Roman" w:hAnsi="Times New Roman" w:cs="Times New Roman"/>
+                <w:b/>
+                <w:bCs/>
+                <w:sz w:val="15"/>
+                <w:szCs w:val="15"/>
+                <w:lang w:val="es-ES_tradnl"/>
+              </w:rPr>
+            </w:pPr>
+            <w:r>
+              <w:rPr>
+                <w:rFonts w:ascii="Times New Roman" w:hAnsi="Times New Roman" w:cs="Times New Roman"/>
+                <w:b/>
+                <w:bCs/>
+                <w:sz w:val="15"/>
+                <w:szCs w:val="15"/>
+                <w:lang w:val="es-ES_tradnl"/>
+              </w:rPr>
+              <w:t>Añadir texto, tipografía y saltos de línea</w:t>
+            </w:r>
+          </w:p>
+        </w:tc>
+      </w:tr>
+      <w:tr>
+        <w:tc>
+          <w:tcPr>
+            <w:tcW w:w="4414" w:type="dxa"/>
+          </w:tcPr>
+          <w:p>
+            <w:pPr>
+              <w:jc w:val="center"/>
+              <w:rPr>
+                <w:rFonts w:ascii="Times New Roman" w:hAnsi="Times New Roman" w:cs="Times New Roman"/>
+                <w:b/>
+                <w:bCs/>
+                <w:sz w:val="15"/>
+                <w:szCs w:val="15"/>
+                <w:lang w:val="es-ES_tradnl"/>
+              </w:rPr>
+            </w:pPr>
+            <w:r>
+              <w:rPr>
+                <w:rFonts w:ascii="Times New Roman" w:hAnsi="Times New Roman" w:cs="Times New Roman"/>
+                <w:b/>
+                <w:bCs/>
+                <w:sz w:val="15"/>
+                <w:szCs w:val="15"/>
+                <w:lang w:val="es-ES_tradnl"/>
+              </w:rPr>
+              <w:t>Paso 3</w:t>
+            </w:r>
+          </w:p>
+        </w:tc>
+        <w:tc>
+          <w:tcPr>
+            <w:tcW w:w="4414" w:type="dxa"/>
+          </w:tcPr>
+          <w:p>
+            <w:pPr>
+              <w:rPr>
+                <w:rFonts w:ascii="Times New Roman" w:hAnsi="Times New Roman" w:cs="Times New Roman"/>
+                <w:b/>
+                <w:bCs/>
+                <w:sz w:val="15"/>
+                <w:szCs w:val="15"/>
+                <w:lang w:val="es-ES_tradnl"/>
+              </w:rPr>
+            </w:pPr>
+            <w:r>
+              <w:rPr>
+                <w:rFonts w:ascii="Times New Roman" w:hAnsi="Times New Roman" w:cs="Times New Roman"/>
+                <w:b/>
+                <w:bCs/>
+                <w:sz w:val="15"/>
+                <w:szCs w:val="15"/>
+                <w:lang w:val="es-ES_tradnl"/>
+              </w:rPr>
+              <w:t>Pedir datos con input</w:t>
+            </w:r>
+            <w:r>
+              <w:rPr>
+                <w:rFonts w:ascii="Times New Roman" w:hAnsi="Times New Roman" w:cs="Times New Roman"/>
+                <w:b/>
+                <w:bCs/>
+                <w:sz w:val="15"/>
+                <w:szCs w:val="15"/>
+                <w:lang w:val="es-ES_tradnl"/>
+              </w:rPr>
+              <w:t xml:space="preserve"> </w:t>
+            </w:r>
+            <w:proofErr w:type="gramStart"/>
+            <w:r>
+              <w:rPr>
+                <w:rFonts w:ascii="Times New Roman" w:hAnsi="Times New Roman" w:cs="Times New Roman"/>
+                <w:b/>
+                <w:bCs/>
+                <w:sz w:val="15"/>
+                <w:szCs w:val="15"/>
+                <w:lang w:val="es-ES_tradnl"/>
+              </w:rPr>
+              <w:t>( )</w:t>
+            </w:r>
+            <w:proofErr w:type="gramEnd"/>
+            <w:r>
+              <w:rPr>
+                <w:rFonts w:ascii="Times New Roman" w:hAnsi="Times New Roman" w:cs="Times New Roman"/>
+                <w:b/>
+                <w:bCs/>
+                <w:sz w:val="15"/>
+                <w:szCs w:val="15"/>
+                <w:lang w:val="es-ES_tradnl"/>
+              </w:rPr>
+              <w:t xml:space="preserve"> y meterlos en el PDF</w:t>
+            </w:r>
+          </w:p>
+        </w:tc>
+      </w:tr>
+      <w:tr>
+        <w:tc>
+          <w:tcPr>
+            <w:tcW w:w="4414" w:type="dxa"/>
+          </w:tcPr>
+          <w:p>
+            <w:pPr>
+              <w:jc w:val="center"/>
+              <w:rPr>
+                <w:rFonts w:ascii="Times New Roman" w:hAnsi="Times New Roman" w:cs="Times New Roman"/>
+                <w:b/>
+                <w:bCs/>
+                <w:sz w:val="15"/>
+                <w:szCs w:val="15"/>
+                <w:lang w:val="es-ES_tradnl"/>
+              </w:rPr>
+            </w:pPr>
+            <w:r>
+              <w:rPr>
+                <w:rFonts w:ascii="Times New Roman" w:hAnsi="Times New Roman" w:cs="Times New Roman"/>
+                <w:b/>
+                <w:bCs/>
+                <w:sz w:val="15"/>
+                <w:szCs w:val="15"/>
+                <w:lang w:val="es-ES_tradnl"/>
+              </w:rPr>
+              <w:t>Paso 4</w:t>
+            </w:r>
+          </w:p>
+        </w:tc>
+        <w:tc>
+          <w:tcPr>
+            <w:tcW w:w="4414" w:type="dxa"/>
+          </w:tcPr>
+          <w:p>
+            <w:pPr>
+              <w:rPr>
+                <w:rFonts w:ascii="Times New Roman" w:hAnsi="Times New Roman" w:cs="Times New Roman"/>
+                <w:b/>
+                <w:bCs/>
+                <w:sz w:val="15"/>
+                <w:szCs w:val="15"/>
+                <w:lang w:val="es-ES_tradnl"/>
+              </w:rPr>
+            </w:pPr>
+            <w:r>
+              <w:rPr>
+                <w:rFonts w:ascii="Times New Roman" w:hAnsi="Times New Roman" w:cs="Times New Roman"/>
+                <w:b/>
+                <w:bCs/>
+                <w:sz w:val="15"/>
+                <w:szCs w:val="15"/>
+                <w:lang w:val="es-ES_tradnl"/>
+              </w:rPr>
+              <w:t xml:space="preserve">Organizar el código en una clase </w:t>
+            </w:r>
+            <w:proofErr w:type="spellStart"/>
+            <w:r>
+              <w:rPr>
+                <w:rFonts w:ascii="Times New Roman" w:hAnsi="Times New Roman" w:cs="Times New Roman"/>
+                <w:b/>
+                <w:bCs/>
+                <w:sz w:val="15"/>
+                <w:szCs w:val="15"/>
+                <w:lang w:val="es-ES_tradnl"/>
+              </w:rPr>
+              <w:t>GeneradorCertificado</w:t>
+            </w:r>
+            <w:proofErr w:type="spellEnd"/>
+            <w:r>
+              <w:rPr>
+                <w:rFonts w:ascii="Times New Roman" w:hAnsi="Times New Roman" w:cs="Times New Roman"/>
+                <w:b/>
+                <w:bCs/>
+                <w:sz w:val="15"/>
+                <w:szCs w:val="15"/>
+                <w:lang w:val="es-ES_tradnl"/>
+              </w:rPr>
+              <w:t xml:space="preserve"> (POO)</w:t>
+            </w:r>
+          </w:p>
+        </w:tc>
+      </w:tr>
+      <w:tr>
+        <w:tc>
+          <w:tcPr>
+            <w:tcW w:w="4414" w:type="dxa"/>
+          </w:tcPr>
+          <w:p>
+            <w:pPr>
+              <w:jc w:val="center"/>
+              <w:rPr>
+                <w:rFonts w:ascii="Times New Roman" w:hAnsi="Times New Roman" w:cs="Times New Roman"/>
+                <w:b/>
+                <w:bCs/>
+                <w:sz w:val="15"/>
+                <w:szCs w:val="15"/>
+                <w:lang w:val="es-ES_tradnl"/>
+              </w:rPr>
+            </w:pPr>
+            <w:r>
+              <w:rPr>
+                <w:rFonts w:ascii="Times New Roman" w:hAnsi="Times New Roman" w:cs="Times New Roman"/>
+                <w:b/>
+                <w:bCs/>
+                <w:sz w:val="15"/>
+                <w:szCs w:val="15"/>
+                <w:lang w:val="es-ES_tradnl"/>
+              </w:rPr>
+              <w:t>Paso 5</w:t>
+            </w:r>
+          </w:p>
+        </w:tc>
+        <w:tc>
+          <w:tcPr>
+            <w:tcW w:w="4414" w:type="dxa"/>
+          </w:tcPr>
+          <w:p>
+            <w:pPr>
+              <w:rPr>
+                <w:rFonts w:ascii="Times New Roman" w:hAnsi="Times New Roman" w:cs="Times New Roman"/>
+                <w:b/>
+                <w:bCs/>
+                <w:sz w:val="15"/>
+                <w:szCs w:val="15"/>
+                <w:lang w:val="es-ES_tradnl"/>
+              </w:rPr>
+            </w:pPr>
+            <w:r>
+              <w:rPr>
+                <w:rFonts w:ascii="Times New Roman" w:hAnsi="Times New Roman" w:cs="Times New Roman"/>
+                <w:b/>
+                <w:bCs/>
+                <w:sz w:val="15"/>
+                <w:szCs w:val="15"/>
+                <w:lang w:val="es-ES_tradnl"/>
+              </w:rPr>
+              <w:t>Guardar el archivo y abrirlo</w:t>
+            </w:r>
+          </w:p>
+        </w:tc>
+      </w:tr>
+    </w:tbl>
+    <w:p>
+      <w:pPr>
+        <w:rPr>
+          <w:rFonts w:ascii="Times New Roman" w:hAnsi="Times New Roman" w:cs="Times New Roman"/>
+          <w:b/>
+          <w:bCs/>
+          <w:sz w:val="28"/>
+          <w:szCs w:val="28"/>
+          <w:lang w:val="es-ES_tradnl"/>
+        </w:rPr>
+      </w:pPr>
+    </w:p>
+    <w:p>
+      <w:pPr>
+        <w:rPr>
+          <w:rFonts w:ascii="Times New Roman" w:hAnsi="Times New Roman" w:cs="Times New Roman"/>
+          <w:b/>
+          <w:bCs/>
+          <w:sz w:val="28"/>
+          <w:szCs w:val="28"/>
+          <w:lang w:val="es-ES_tradnl"/>
+        </w:rPr>
+      </w:pPr>
+      <w:proofErr w:type="gramStart"/>
+      <w:r>
+        <w:rPr>
+          <w:rFonts w:ascii="Times New Roman" w:hAnsi="Times New Roman" w:cs="Times New Roman"/>
+          <w:b/>
+          <w:bCs/>
+          <w:sz w:val="28"/>
+          <w:szCs w:val="28"/>
+          <w:lang w:val="es-ES_tradnl"/>
+        </w:rPr>
+        <w:t>Qué hace el</w:t>
+      </w:r>
+      <w:r>
+        <w:rPr>
+          <w:rFonts w:ascii="Times New Roman" w:hAnsi="Times New Roman" w:cs="Times New Roman"/>
+          <w:b/>
+          <w:bCs/>
+          <w:sz w:val="28"/>
+          <w:szCs w:val="28"/>
+          <w:lang w:val="es-ES_tradnl"/>
+        </w:rPr>
+        <w:t xml:space="preserve"> paso</w:t>
+      </w:r>
+      <w:r>
+        <w:rPr>
+          <w:rFonts w:ascii="Times New Roman" w:hAnsi="Times New Roman" w:cs="Times New Roman"/>
+          <w:b/>
+          <w:bCs/>
+          <w:sz w:val="28"/>
+          <w:szCs w:val="28"/>
+          <w:lang w:val="es-ES_tradnl"/>
+        </w:rPr>
+        <w:t xml:space="preserve"> 1?</w:t>
+      </w:r>
+      <w:proofErr w:type="gramEnd"/>
+    </w:p>
+    <w:p>
+      <w:pPr>
+        <w:rPr>
+          <w:rFonts w:ascii="Times New Roman" w:hAnsi="Times New Roman" w:cs="Times New Roman"/>
+          <w:lang w:val="es-ES_tradnl"/>
+        </w:rPr>
+      </w:pPr>
+      <w:r>
+        <w:rPr>
+          <w:rFonts w:ascii="Times New Roman" w:hAnsi="Times New Roman" w:cs="Times New Roman"/>
+          <w:lang w:val="es-ES_tradnl"/>
+        </w:rPr>
+        <w:t xml:space="preserve">Importa </w:t>
+      </w:r>
+      <w:proofErr w:type="spellStart"/>
+      <w:r>
+        <w:rPr>
+          <w:rFonts w:ascii="Times New Roman" w:hAnsi="Times New Roman" w:cs="Times New Roman"/>
+          <w:lang w:val="es-ES_tradnl"/>
+        </w:rPr>
+        <w:t>fpdf</w:t>
+      </w:r>
+      <w:proofErr w:type="spellEnd"/>
+      <w:r>
+        <w:rPr>
+          <w:rFonts w:ascii="Times New Roman" w:hAnsi="Times New Roman" w:cs="Times New Roman"/>
+          <w:lang w:val="es-ES_tradnl"/>
+        </w:rPr>
+        <w:t>, crea un documento en blanco en horizontal L = (</w:t>
+      </w:r>
+      <w:proofErr w:type="spellStart"/>
+      <w:r>
+        <w:rPr>
+          <w:rFonts w:ascii="Times New Roman" w:hAnsi="Times New Roman" w:cs="Times New Roman"/>
+          <w:lang w:val="es-ES_tradnl"/>
+        </w:rPr>
+        <w:t>landescape</w:t>
+      </w:r>
+      <w:proofErr w:type="spellEnd"/>
+      <w:r>
+        <w:rPr>
+          <w:rFonts w:ascii="Times New Roman" w:hAnsi="Times New Roman" w:cs="Times New Roman"/>
+          <w:lang w:val="es-ES_tradnl"/>
+        </w:rPr>
+        <w:t>) ideal para certificados</w:t>
+      </w:r>
+      <w:r>
+        <w:rPr>
+          <w:rFonts w:ascii="Times New Roman" w:hAnsi="Times New Roman" w:cs="Times New Roman"/>
+          <w:lang w:val="es-ES_tradnl"/>
+        </w:rPr>
+        <w:t>, escribe un título en horizontal centrado: CERTIFICADO DE CURSO y gu</w:t>
+      </w:r>
+      <w:r>
+        <w:rPr>
+          <w:rFonts w:ascii="Times New Roman" w:hAnsi="Times New Roman" w:cs="Times New Roman"/>
+          <w:lang w:val="es-ES_tradnl"/>
+        </w:rPr>
+        <w:t>a</w:t>
+      </w:r>
+      <w:r>
+        <w:rPr>
+          <w:rFonts w:ascii="Times New Roman" w:hAnsi="Times New Roman" w:cs="Times New Roman"/>
+          <w:lang w:val="es-ES_tradnl"/>
+        </w:rPr>
+        <w:t>rda el archivo como: mi_primer_certificado.pdf</w:t>
+      </w:r>
+      <w:r>
+        <w:rPr>
+          <w:rFonts w:ascii="Times New Roman" w:hAnsi="Times New Roman" w:cs="Times New Roman"/>
+          <w:lang w:val="es-ES_tradnl"/>
+        </w:rPr>
+        <w:t>.</w:t>
+      </w:r>
+    </w:p>
+    <w:p>
+      <w:pPr>
+        <w:rPr>
+          <w:rFonts w:ascii="Times New Roman" w:hAnsi="Times New Roman" w:cs="Times New Roman"/>
+          <w:lang w:val="es-ES_tradnl"/>
+        </w:rPr>
+      </w:pPr>
+      <w:r>
+        <w:rPr>
+          <w:rFonts w:ascii="Times New Roman" w:hAnsi="Times New Roman" w:cs="Times New Roman"/>
+          <w:noProof/>
+          <w:lang w:val="es-ES_tradnl"/>
+        </w:rPr>
+        <w:lastRenderedPageBreak/>
+        <w:drawing>
+          <wp:inline distT="0" distB="0" distL="0" distR="0" wp14:anchorId="0D4F5ECD" wp14:editId="67BD638B">
+            <wp:extent cx="5612130" cy="5160645"/>
+            <wp:effectExtent l="0" t="0" r="1270" b="0"/>
+            <wp:docPr id="191468368" name="Imagen 1"/>
+            <wp:cNvGraphicFramePr>
+              <a:graphicFrameLocks xmlns:a="http://schemas.openxmlformats.org/drawingml/2006/main" noChangeAspect="1"/>
+            </wp:cNvGraphicFramePr>
+            <a:graphic xmlns:a="http://schemas.openxmlformats.org/drawingml/2006/main">
+              <a:graphicData uri="http://schemas.openxmlformats.org/drawingml/2006/picture">
+                <pic:pic xmlns:pic="http://schemas.openxmlformats.org/drawingml/2006/picture">
+                  <pic:nvPicPr>
+                    <pic:cNvPr id="191468368" name="Imagen 191468368"/>
+                    <pic:cNvPicPr/>
+                  </pic:nvPicPr>
+                  <pic:blipFill>
+                    <a:blip r:embed="rId4" cstate="print">
+                      <a:extLst>
+                        <a:ext uri="{28A0092B-C50C-407E-A947-70E740481C1C}">
+                          <a14:useLocalDpi xmlns:a14="http://schemas.microsoft.com/office/drawing/2010/main" val="0"/>
+                        </a:ext>
+                      </a:extLst>
+                    </a:blip>
+                    <a:stretch>
+                      <a:fillRect/>
+                    </a:stretch>
+                  </pic:blipFill>
+                  <pic:spPr>
+                    <a:xfrm>
+                      <a:off x="0" y="0"/>
+                      <a:ext cx="5612130" cy="5160645"/>
+                    </a:xfrm>
+                    <a:prstGeom prst="rect">
+                      <a:avLst/>
+                    </a:prstGeom>
+                  </pic:spPr>
+                </pic:pic>
+              </a:graphicData>
+            </a:graphic>
+          </wp:inline>
+        </w:drawing>
+      </w:r>
+    </w:p>
+    <w:p>
+      <w:pPr>
+        <w:rPr>
+          <w:rFonts w:ascii="Times New Roman" w:hAnsi="Times New Roman" w:cs="Times New Roman"/>
+          <w:lang w:val="es-ES_tradnl"/>
+        </w:rPr>
+      </w:pPr>
+    </w:p>
+    <w:p>
+      <w:pPr>
+        <w:rPr>
+          <w:rFonts w:ascii="Times New Roman" w:hAnsi="Times New Roman" w:cs="Times New Roman"/>
+          <w:lang w:val="es-ES_tradnl"/>
+        </w:rPr>
+      </w:pPr>
+      <w:r>
+        <w:rPr>
+          <w:rFonts w:ascii="Times New Roman" w:hAnsi="Times New Roman" w:cs="Times New Roman"/>
+          <w:noProof/>
+          <w:lang w:val="es-ES_tradnl"/>
+        </w:rPr>
+        <w:drawing>
+          <wp:inline distT="0" distB="0" distL="0" distR="0" wp14:anchorId="6D910479" wp14:editId="46B6A3F9">
+            <wp:extent cx="5612130" cy="2364105"/>
+            <wp:effectExtent l="0" t="0" r="1270" b="0"/>
+            <wp:docPr id="853063432" name="Imagen 2"/>
+            <wp:cNvGraphicFramePr>
+              <a:graphicFrameLocks xmlns:a="http://schemas.openxmlformats.org/drawingml/2006/main" noChangeAspect="1"/>
+            </wp:cNvGraphicFramePr>
+            <a:graphic xmlns:a="http://schemas.openxmlformats.org/drawingml/2006/main">
+              <a:graphicData uri="http://schemas.openxmlformats.org/drawingml/2006/picture">
+                <pic:pic xmlns:pic="http://schemas.openxmlformats.org/drawingml/2006/picture">
+                  <pic:nvPicPr>
+                    <pic:cNvPr id="853063432" name="Imagen 853063432"/>
+                    <pic:cNvPicPr/>
+                  </pic:nvPicPr>
+                  <pic:blipFill>
+                    <a:blip r:embed="rId5" cstate="print">
+                      <a:extLst>
+                        <a:ext uri="{28A0092B-C50C-407E-A947-70E740481C1C}">
+                          <a14:useLocalDpi xmlns:a14="http://schemas.microsoft.com/office/drawing/2010/main" val="0"/>
+                        </a:ext>
+                      </a:extLst>
+                    </a:blip>
+                    <a:stretch>
+                      <a:fillRect/>
+                    </a:stretch>
+                  </pic:blipFill>
+                  <pic:spPr>
+                    <a:xfrm>
+                      <a:off x="0" y="0"/>
+                      <a:ext cx="5612130" cy="2364105"/>
+                    </a:xfrm>
+                    <a:prstGeom prst="rect">
+                      <a:avLst/>
+                    </a:prstGeom>
+                  </pic:spPr>
+                </pic:pic>
+              </a:graphicData>
+            </a:graphic>
+          </wp:inline>
+        </w:drawing>
+      </w:r>
+    </w:p>
+    <w:p>
+      <w:pPr>
+        <w:rPr>
+          <w:rFonts w:ascii="Times New Roman" w:hAnsi="Times New Roman" w:cs="Times New Roman"/>
+          <w:lang w:val="es-ES_tradnl"/>
+        </w:rPr>
+      </w:pPr>
+      <w:r>
+        <w:rPr>
+          <w:rFonts w:ascii="Times New Roman" w:hAnsi="Times New Roman" w:cs="Times New Roman"/>
+          <w:lang w:val="es-ES_tradnl"/>
+        </w:rPr>
+        <w:lastRenderedPageBreak/>
+        <w:t xml:space="preserve">Inicialmente importamos </w:t>
+      </w:r>
+      <w:proofErr w:type="spellStart"/>
+      <w:r>
+        <w:rPr>
+          <w:rFonts w:ascii="Times New Roman" w:hAnsi="Times New Roman" w:cs="Times New Roman"/>
+          <w:lang w:val="es-ES_tradnl"/>
+        </w:rPr>
+        <w:t>fpdf</w:t>
+      </w:r>
+      <w:proofErr w:type="spellEnd"/>
+      <w:r>
+        <w:rPr>
+          <w:rFonts w:ascii="Times New Roman" w:hAnsi="Times New Roman" w:cs="Times New Roman"/>
+          <w:lang w:val="es-ES_tradnl"/>
+        </w:rPr>
+        <w:t xml:space="preserve"> que es la máquina que crea </w:t>
+      </w:r>
+      <w:proofErr w:type="spellStart"/>
+      <w:r>
+        <w:rPr>
+          <w:rFonts w:ascii="Times New Roman" w:hAnsi="Times New Roman" w:cs="Times New Roman"/>
+          <w:lang w:val="es-ES_tradnl"/>
+        </w:rPr>
+        <w:t>PDFs</w:t>
+      </w:r>
+      <w:proofErr w:type="spellEnd"/>
+      <w:r>
+        <w:rPr>
+          <w:rFonts w:ascii="Times New Roman" w:hAnsi="Times New Roman" w:cs="Times New Roman"/>
+          <w:lang w:val="es-ES_tradnl"/>
+        </w:rPr>
+        <w:t xml:space="preserve">. </w:t>
+      </w:r>
+      <w:r>
+        <w:rPr>
+          <w:rFonts w:ascii="Times New Roman" w:hAnsi="Times New Roman" w:cs="Times New Roman"/>
+          <w:color w:val="00B050"/>
+          <w:lang w:val="es-ES_tradnl"/>
+        </w:rPr>
+        <w:t xml:space="preserve">from </w:t>
+      </w:r>
+      <w:proofErr w:type="spellStart"/>
+      <w:r>
+        <w:rPr>
+          <w:rFonts w:ascii="Times New Roman" w:hAnsi="Times New Roman" w:cs="Times New Roman"/>
+          <w:color w:val="00B050"/>
+          <w:lang w:val="es-ES_tradnl"/>
+        </w:rPr>
+        <w:t>fpdf</w:t>
+      </w:r>
+      <w:proofErr w:type="spellEnd"/>
+      <w:r>
+        <w:rPr>
+          <w:rFonts w:ascii="Times New Roman" w:hAnsi="Times New Roman" w:cs="Times New Roman"/>
+          <w:color w:val="00B050"/>
+          <w:lang w:val="es-ES_tradnl"/>
+        </w:rPr>
+        <w:t xml:space="preserve"> </w:t>
+      </w:r>
+      <w:proofErr w:type="spellStart"/>
+      <w:r>
+        <w:rPr>
+          <w:rFonts w:ascii="Times New Roman" w:hAnsi="Times New Roman" w:cs="Times New Roman"/>
+          <w:color w:val="00B050"/>
+          <w:lang w:val="es-ES_tradnl"/>
+        </w:rPr>
+        <w:t>import</w:t>
+      </w:r>
+      <w:proofErr w:type="spellEnd"/>
+      <w:r>
+        <w:rPr>
+          <w:rFonts w:ascii="Times New Roman" w:hAnsi="Times New Roman" w:cs="Times New Roman"/>
+          <w:color w:val="00B050"/>
+          <w:lang w:val="es-ES_tradnl"/>
+        </w:rPr>
+        <w:t xml:space="preserve"> PDF</w:t>
+      </w:r>
+    </w:p>
+    <w:p>
+      <w:pPr>
+        <w:rPr>
+          <w:rFonts w:ascii="Times New Roman" w:hAnsi="Times New Roman" w:cs="Times New Roman"/>
+          <w:color w:val="00B050"/>
+          <w:lang w:val="es-ES_tradnl"/>
+        </w:rPr>
+      </w:pPr>
+      <w:r>
+        <w:rPr>
+          <w:rFonts w:ascii="Times New Roman" w:hAnsi="Times New Roman" w:cs="Times New Roman"/>
+          <w:lang w:val="es-ES_tradnl"/>
+        </w:rPr>
+        <w:t xml:space="preserve">Creamos el documento con su formato y sus medidas respectivas, luego creamos una página en blanco. </w:t>
+      </w:r>
+      <w:proofErr w:type="spellStart"/>
+      <w:r>
+        <w:rPr>
+          <w:rFonts w:ascii="Times New Roman" w:hAnsi="Times New Roman" w:cs="Times New Roman"/>
+          <w:color w:val="00B050"/>
+          <w:lang w:val="es-ES_tradnl"/>
+        </w:rPr>
+        <w:t>p</w:t>
+      </w:r>
+      <w:r>
+        <w:rPr>
+          <w:rFonts w:ascii="Times New Roman" w:hAnsi="Times New Roman" w:cs="Times New Roman"/>
+          <w:color w:val="00B050"/>
+          <w:lang w:val="es-ES_tradnl"/>
+        </w:rPr>
+        <w:t>df</w:t>
+      </w:r>
+      <w:proofErr w:type="spellEnd"/>
+      <w:r>
+        <w:rPr>
+          <w:rFonts w:ascii="Times New Roman" w:hAnsi="Times New Roman" w:cs="Times New Roman"/>
+          <w:color w:val="00B050"/>
+          <w:lang w:val="es-ES_tradnl"/>
+        </w:rPr>
+        <w:t xml:space="preserve"> = FPDF</w:t>
+      </w:r>
+      <w:r>
+        <w:rPr>
+          <w:rFonts w:ascii="Times New Roman" w:hAnsi="Times New Roman" w:cs="Times New Roman"/>
+          <w:color w:val="00B050"/>
+          <w:lang w:val="es-ES_tradnl"/>
+        </w:rPr>
+        <w:t xml:space="preserve"> (</w:t>
+      </w:r>
+      <w:r>
+        <w:rPr>
+          <w:rFonts w:ascii="Times New Roman" w:hAnsi="Times New Roman" w:cs="Times New Roman"/>
+          <w:color w:val="00B050"/>
+          <w:lang w:val="es-ES_tradnl"/>
+        </w:rPr>
+        <w:t>orientación</w:t>
+      </w:r>
+      <w:proofErr w:type="gramStart"/>
+      <w:r>
+        <w:rPr>
+          <w:rFonts w:ascii="Times New Roman" w:hAnsi="Times New Roman" w:cs="Times New Roman"/>
+          <w:color w:val="00B050"/>
+          <w:lang w:val="es-ES_tradnl"/>
+        </w:rPr>
+        <w:t>=”L</w:t>
+      </w:r>
+      <w:proofErr w:type="gramEnd"/>
+      <w:r>
+        <w:rPr>
+          <w:rFonts w:ascii="Times New Roman" w:hAnsi="Times New Roman" w:cs="Times New Roman"/>
+          <w:color w:val="00B050"/>
+          <w:lang w:val="es-ES_tradnl"/>
+        </w:rPr>
+        <w:t xml:space="preserve">”, </w:t>
+      </w:r>
+      <w:proofErr w:type="spellStart"/>
+      <w:r>
+        <w:rPr>
+          <w:rFonts w:ascii="Times New Roman" w:hAnsi="Times New Roman" w:cs="Times New Roman"/>
+          <w:color w:val="00B050"/>
+          <w:lang w:val="es-ES_tradnl"/>
+        </w:rPr>
+        <w:t>unit</w:t>
+      </w:r>
+      <w:proofErr w:type="spellEnd"/>
+      <w:r>
+        <w:rPr>
+          <w:rFonts w:ascii="Times New Roman" w:hAnsi="Times New Roman" w:cs="Times New Roman"/>
+          <w:color w:val="00B050"/>
+          <w:lang w:val="es-ES_tradnl"/>
+        </w:rPr>
+        <w:t xml:space="preserve">=”mm”, </w:t>
+      </w:r>
+      <w:proofErr w:type="spellStart"/>
+      <w:r>
+        <w:rPr>
+          <w:rFonts w:ascii="Times New Roman" w:hAnsi="Times New Roman" w:cs="Times New Roman"/>
+          <w:color w:val="00B050"/>
+          <w:lang w:val="es-ES_tradnl"/>
+        </w:rPr>
+        <w:t>format</w:t>
+      </w:r>
+      <w:proofErr w:type="spellEnd"/>
+      <w:proofErr w:type="gramStart"/>
+      <w:r>
+        <w:rPr>
+          <w:rFonts w:ascii="Times New Roman" w:hAnsi="Times New Roman" w:cs="Times New Roman"/>
+          <w:color w:val="00B050"/>
+          <w:lang w:val="es-ES_tradnl"/>
+        </w:rPr>
+        <w:t>=”A</w:t>
+      </w:r>
+      <w:proofErr w:type="gramEnd"/>
+      <w:r>
+        <w:rPr>
+          <w:rFonts w:ascii="Times New Roman" w:hAnsi="Times New Roman" w:cs="Times New Roman"/>
+          <w:color w:val="00B050"/>
+          <w:lang w:val="es-ES_tradnl"/>
+        </w:rPr>
+        <w:t>4”)</w:t>
+      </w:r>
+    </w:p>
+    <w:p>
+      <w:pPr>
+        <w:rPr>
+          <w:rFonts w:ascii="Times New Roman" w:hAnsi="Times New Roman" w:cs="Times New Roman"/>
+          <w:color w:val="00B050"/>
+          <w:lang w:val="es-ES_tradnl"/>
+        </w:rPr>
+      </w:pPr>
+      <w:proofErr w:type="spellStart"/>
+      <w:r>
+        <w:rPr>
+          <w:rFonts w:ascii="Times New Roman" w:hAnsi="Times New Roman" w:cs="Times New Roman"/>
+          <w:color w:val="00B050"/>
+          <w:lang w:val="es-ES_tradnl"/>
+        </w:rPr>
+        <w:t>Pdf.add_</w:t>
+      </w:r>
+      <w:proofErr w:type="gramStart"/>
+      <w:r>
+        <w:rPr>
+          <w:rFonts w:ascii="Times New Roman" w:hAnsi="Times New Roman" w:cs="Times New Roman"/>
+          <w:color w:val="00B050"/>
+          <w:lang w:val="es-ES_tradnl"/>
+        </w:rPr>
+        <w:t>page</w:t>
+      </w:r>
+      <w:proofErr w:type="spellEnd"/>
+      <w:r>
+        <w:rPr>
+          <w:rFonts w:ascii="Times New Roman" w:hAnsi="Times New Roman" w:cs="Times New Roman"/>
+          <w:color w:val="00B050"/>
+          <w:lang w:val="es-ES_tradnl"/>
+        </w:rPr>
+        <w:t>( )</w:t>
+      </w:r>
+      <w:proofErr w:type="gramEnd"/>
+    </w:p>
+    <w:p>
+      <w:pPr>
+        <w:rPr>
+          <w:rFonts w:ascii="Times New Roman" w:hAnsi="Times New Roman" w:cs="Times New Roman"/>
+          <w:color w:val="00B050"/>
+          <w:lang w:val="es-ES_tradnl"/>
+        </w:rPr>
+      </w:pPr>
+      <w:r>
+        <w:rPr>
+          <w:rFonts w:ascii="Times New Roman" w:hAnsi="Times New Roman" w:cs="Times New Roman"/>
+          <w:lang w:val="es-ES_tradnl"/>
+        </w:rPr>
+        <w:t xml:space="preserve">Luego elegimos la tipografía y el tamaño del texto. </w:t>
+      </w:r>
+      <w:proofErr w:type="spellStart"/>
+      <w:r>
+        <w:rPr>
+          <w:rFonts w:ascii="Times New Roman" w:hAnsi="Times New Roman" w:cs="Times New Roman"/>
+          <w:color w:val="00B050"/>
+          <w:lang w:val="es-ES_tradnl"/>
+        </w:rPr>
+        <w:t>Pdf.set_</w:t>
+      </w:r>
+      <w:proofErr w:type="gramStart"/>
+      <w:r>
+        <w:rPr>
+          <w:rFonts w:ascii="Times New Roman" w:hAnsi="Times New Roman" w:cs="Times New Roman"/>
+          <w:color w:val="00B050"/>
+          <w:lang w:val="es-ES_tradnl"/>
+        </w:rPr>
+        <w:t>font</w:t>
+      </w:r>
+      <w:proofErr w:type="spellEnd"/>
+      <w:r>
+        <w:rPr>
+          <w:rFonts w:ascii="Times New Roman" w:hAnsi="Times New Roman" w:cs="Times New Roman"/>
+          <w:color w:val="00B050"/>
+          <w:lang w:val="es-ES_tradnl"/>
+        </w:rPr>
+        <w:t>(</w:t>
+      </w:r>
+      <w:proofErr w:type="gramEnd"/>
+      <w:r>
+        <w:rPr>
+          <w:rFonts w:ascii="Times New Roman" w:hAnsi="Times New Roman" w:cs="Times New Roman"/>
+          <w:color w:val="00B050"/>
+          <w:lang w:val="es-ES_tradnl"/>
+        </w:rPr>
+        <w:t xml:space="preserve">“Helvética”, </w:t>
+      </w:r>
+      <w:proofErr w:type="spellStart"/>
+      <w:r>
+        <w:rPr>
+          <w:rFonts w:ascii="Times New Roman" w:hAnsi="Times New Roman" w:cs="Times New Roman"/>
+          <w:color w:val="00B050"/>
+          <w:lang w:val="es-ES_tradnl"/>
+        </w:rPr>
+        <w:t>style</w:t>
+      </w:r>
+      <w:proofErr w:type="spellEnd"/>
+      <w:proofErr w:type="gramStart"/>
+      <w:r>
+        <w:rPr>
+          <w:rFonts w:ascii="Times New Roman" w:hAnsi="Times New Roman" w:cs="Times New Roman"/>
+          <w:color w:val="00B050"/>
+          <w:lang w:val="es-ES_tradnl"/>
+        </w:rPr>
+        <w:t>=”B</w:t>
+      </w:r>
+      <w:proofErr w:type="gramEnd"/>
+      <w:r>
+        <w:rPr>
+          <w:rFonts w:ascii="Times New Roman" w:hAnsi="Times New Roman" w:cs="Times New Roman"/>
+          <w:color w:val="00B050"/>
+          <w:lang w:val="es-ES_tradnl"/>
+        </w:rPr>
+        <w:t>”, sise=28)</w:t>
+      </w:r>
+    </w:p>
+    <w:p>
+      <w:pPr>
+        <w:rPr>
+          <w:rFonts w:ascii="Times New Roman" w:hAnsi="Times New Roman" w:cs="Times New Roman"/>
+          <w:color w:val="00B050"/>
+          <w:lang w:val="es-ES_tradnl"/>
+        </w:rPr>
+      </w:pPr>
+      <w:r>
+        <w:rPr>
+          <w:rFonts w:ascii="Times New Roman" w:hAnsi="Times New Roman" w:cs="Times New Roman"/>
+          <w:lang w:val="es-ES_tradnl"/>
+        </w:rPr>
+        <w:t xml:space="preserve">Escribimos el título con sus propiedades. </w:t>
+      </w:r>
+      <w:proofErr w:type="spellStart"/>
+      <w:proofErr w:type="gramStart"/>
+      <w:r>
+        <w:rPr>
+          <w:rFonts w:ascii="Times New Roman" w:hAnsi="Times New Roman" w:cs="Times New Roman"/>
+          <w:color w:val="00B050"/>
+          <w:lang w:val="es-ES_tradnl"/>
+        </w:rPr>
+        <w:t>pdf.cell</w:t>
+      </w:r>
+      <w:proofErr w:type="spellEnd"/>
+      <w:proofErr w:type="gramEnd"/>
+      <w:r>
+        <w:rPr>
+          <w:rFonts w:ascii="Times New Roman" w:hAnsi="Times New Roman" w:cs="Times New Roman"/>
+          <w:color w:val="00B050"/>
+          <w:lang w:val="es-ES_tradnl"/>
+        </w:rPr>
+        <w:t xml:space="preserve">(w=0, h=20, </w:t>
+      </w:r>
+      <w:proofErr w:type="spellStart"/>
+      <w:r>
+        <w:rPr>
+          <w:rFonts w:ascii="Times New Roman" w:hAnsi="Times New Roman" w:cs="Times New Roman"/>
+          <w:color w:val="00B050"/>
+          <w:lang w:val="es-ES_tradnl"/>
+        </w:rPr>
+        <w:t>text</w:t>
+      </w:r>
+      <w:proofErr w:type="spellEnd"/>
+      <w:proofErr w:type="gramStart"/>
+      <w:r>
+        <w:rPr>
+          <w:rFonts w:ascii="Times New Roman" w:hAnsi="Times New Roman" w:cs="Times New Roman"/>
+          <w:color w:val="00B050"/>
+          <w:lang w:val="es-ES_tradnl"/>
+        </w:rPr>
+        <w:t>=”certificado</w:t>
+      </w:r>
+      <w:proofErr w:type="gramEnd"/>
+      <w:r>
+        <w:rPr>
+          <w:rFonts w:ascii="Times New Roman" w:hAnsi="Times New Roman" w:cs="Times New Roman"/>
+          <w:color w:val="00B050"/>
+          <w:lang w:val="es-ES_tradnl"/>
+        </w:rPr>
+        <w:t xml:space="preserve"> de curso”, </w:t>
+      </w:r>
+      <w:proofErr w:type="spellStart"/>
+      <w:r>
+        <w:rPr>
+          <w:rFonts w:ascii="Times New Roman" w:hAnsi="Times New Roman" w:cs="Times New Roman"/>
+          <w:color w:val="00B050"/>
+          <w:lang w:val="es-ES_tradnl"/>
+        </w:rPr>
+        <w:t>aligen</w:t>
+      </w:r>
+      <w:proofErr w:type="spellEnd"/>
+      <w:r>
+        <w:rPr>
+          <w:rFonts w:ascii="Times New Roman" w:hAnsi="Times New Roman" w:cs="Times New Roman"/>
+          <w:color w:val="00B050"/>
+          <w:lang w:val="es-ES_tradnl"/>
+        </w:rPr>
+        <w:t>=”C”)</w:t>
+      </w:r>
+    </w:p>
+    <w:p>
+      <w:pPr>
+        <w:rPr>
+          <w:rFonts w:ascii="Times New Roman" w:hAnsi="Times New Roman" w:cs="Times New Roman"/>
+          <w:color w:val="00B050"/>
+          <w:lang w:val="es-ES_tradnl"/>
+        </w:rPr>
+      </w:pPr>
+      <w:r>
+        <w:rPr>
+          <w:rFonts w:ascii="Times New Roman" w:hAnsi="Times New Roman" w:cs="Times New Roman"/>
+          <w:lang w:val="es-ES_tradnl"/>
+        </w:rPr>
+        <w:t>Guardamos el documento</w:t>
+      </w:r>
+      <w:r>
+        <w:rPr>
+          <w:rFonts w:ascii="Times New Roman" w:hAnsi="Times New Roman" w:cs="Times New Roman"/>
+          <w:lang w:val="es-ES_tradnl"/>
+        </w:rPr>
+        <w:t xml:space="preserve">. </w:t>
+      </w:r>
+      <w:proofErr w:type="spellStart"/>
+      <w:proofErr w:type="gramStart"/>
+      <w:r>
+        <w:rPr>
+          <w:rFonts w:ascii="Times New Roman" w:hAnsi="Times New Roman" w:cs="Times New Roman"/>
+          <w:color w:val="00B050"/>
+          <w:lang w:val="es-ES_tradnl"/>
+        </w:rPr>
+        <w:t>pdf.output</w:t>
+      </w:r>
+      <w:proofErr w:type="spellEnd"/>
+      <w:proofErr w:type="gramEnd"/>
+      <w:r>
+        <w:rPr>
+          <w:rFonts w:ascii="Times New Roman" w:hAnsi="Times New Roman" w:cs="Times New Roman"/>
+          <w:color w:val="00B050"/>
+          <w:lang w:val="es-ES_tradnl"/>
+        </w:rPr>
+        <w:t>(“mi_primer_certificado.pdf”)</w:t>
+      </w:r>
+    </w:p>
+    <w:p>
+      <w:pPr>
+        <w:rPr>
+          <w:rFonts w:ascii="Times New Roman" w:hAnsi="Times New Roman" w:cs="Times New Roman"/>
+          <w:lang w:val="es-ES_tradnl"/>
+        </w:rPr>
+      </w:pPr>
+      <w:r>
+        <w:rPr>
+          <w:rFonts w:ascii="Times New Roman" w:hAnsi="Times New Roman" w:cs="Times New Roman"/>
+          <w:lang w:val="es-ES_tradnl"/>
+        </w:rPr>
+        <w:t xml:space="preserve">Ahora imprimimos un mensaje </w:t>
+      </w:r>
+      <w:r>
+        <w:rPr>
+          <w:rFonts w:ascii="Times New Roman" w:hAnsi="Times New Roman" w:cs="Times New Roman"/>
+          <w:lang w:val="es-ES_tradnl"/>
+        </w:rPr>
+        <w:t>de la siguiente manera:</w:t>
+      </w:r>
+    </w:p>
+    <w:p>
+      <w:pPr>
+        <w:rPr>
+          <w:rFonts w:ascii="Times New Roman" w:hAnsi="Times New Roman" w:cs="Times New Roman"/>
+          <w:color w:val="00B050"/>
+          <w:lang w:val="es-ES_tradnl"/>
+        </w:rPr>
+      </w:pPr>
+      <w:proofErr w:type="spellStart"/>
+      <w:proofErr w:type="gramStart"/>
+      <w:r>
+        <w:rPr>
+          <w:rFonts w:ascii="Times New Roman" w:hAnsi="Times New Roman" w:cs="Times New Roman"/>
+          <w:color w:val="00B050"/>
+          <w:lang w:val="es-ES_tradnl"/>
+        </w:rPr>
+        <w:t>print</w:t>
+      </w:r>
+      <w:proofErr w:type="spellEnd"/>
+      <w:r>
+        <w:rPr>
+          <w:rFonts w:ascii="Times New Roman" w:hAnsi="Times New Roman" w:cs="Times New Roman"/>
+          <w:color w:val="00B050"/>
+          <w:lang w:val="es-ES_tradnl"/>
+        </w:rPr>
+        <w:t>(</w:t>
+      </w:r>
+      <w:proofErr w:type="gramEnd"/>
+      <w:r>
+        <w:rPr>
+          <w:rFonts w:ascii="Times New Roman" w:hAnsi="Times New Roman" w:cs="Times New Roman"/>
+          <w:color w:val="00B050"/>
+          <w:lang w:val="es-ES_tradnl"/>
+        </w:rPr>
+        <w:t>“Listo…”)</w:t>
+      </w:r>
+    </w:p>
+    <w:p>
+      <w:pPr>
+        <w:rPr>
+          <w:rFonts w:ascii="Times New Roman" w:hAnsi="Times New Roman" w:cs="Times New Roman"/>
+          <w:color w:val="00B050"/>
+          <w:lang w:val="es-ES_tradnl"/>
+        </w:rPr>
+      </w:pPr>
+    </w:p>
+    <w:p>
+      <w:pPr>
+        <w:rPr>
+          <w:rFonts w:ascii="Times New Roman" w:hAnsi="Times New Roman" w:cs="Times New Roman"/>
+          <w:lang w:val="es-ES_tradnl"/>
+        </w:rPr>
+      </w:pPr>
+      <w:r>
+        <w:rPr>
+          <w:rFonts w:ascii="Times New Roman" w:hAnsi="Times New Roman" w:cs="Times New Roman"/>
+          <w:noProof/>
+          <w:lang w:val="es-ES_tradnl"/>
+        </w:rPr>
+        <w:drawing>
+          <wp:inline distT="0" distB="0" distL="0" distR="0" wp14:anchorId="70776137" wp14:editId="556F42BC">
+            <wp:extent cx="5612130" cy="1562735"/>
+            <wp:effectExtent l="0" t="0" r="1270" b="0"/>
+            <wp:docPr id="120338181" name="Imagen 3"/>
+            <wp:cNvGraphicFramePr>
+              <a:graphicFrameLocks xmlns:a="http://schemas.openxmlformats.org/drawingml/2006/main" noChangeAspect="1"/>
+            </wp:cNvGraphicFramePr>
+            <a:graphic xmlns:a="http://schemas.openxmlformats.org/drawingml/2006/main">
+              <a:graphicData uri="http://schemas.openxmlformats.org/drawingml/2006/picture">
+                <pic:pic xmlns:pic="http://schemas.openxmlformats.org/drawingml/2006/picture">
+                  <pic:nvPicPr>
+                    <pic:cNvPr id="120338181" name="Imagen 120338181"/>
+                    <pic:cNvPicPr/>
+                  </pic:nvPicPr>
+                  <pic:blipFill>
+                    <a:blip r:embed="rId6" cstate="print">
+                      <a:extLst>
+                        <a:ext uri="{28A0092B-C50C-407E-A947-70E740481C1C}">
+                          <a14:useLocalDpi xmlns:a14="http://schemas.microsoft.com/office/drawing/2010/main" val="0"/>
+                        </a:ext>
+                      </a:extLst>
+                    </a:blip>
+                    <a:stretch>
+                      <a:fillRect/>
+                    </a:stretch>
+                  </pic:blipFill>
+                  <pic:spPr>
+                    <a:xfrm>
+                      <a:off x="0" y="0"/>
+                      <a:ext cx="5612130" cy="1562735"/>
+                    </a:xfrm>
+                    <a:prstGeom prst="rect">
+                      <a:avLst/>
+                    </a:prstGeom>
+                  </pic:spPr>
+                </pic:pic>
+              </a:graphicData>
+            </a:graphic>
+          </wp:inline>
+        </w:drawing>
+      </w:r>
+    </w:p>
+    <w:p>
+      <w:pPr>
+        <w:rPr>
+          <w:rFonts w:ascii="Times New Roman" w:hAnsi="Times New Roman" w:cs="Times New Roman"/>
+          <w:lang w:val="es-ES_tradnl"/>
+        </w:rPr>
+      </w:pPr>
+    </w:p>
+    <w:p>
+      <w:pPr>
+        <w:rPr>
+          <w:rFonts w:ascii="Times New Roman" w:hAnsi="Times New Roman" w:cs="Times New Roman"/>
+          <w:lang w:val="es-ES_tradnl"/>
+        </w:rPr>
+      </w:pPr>
+    </w:p>
+    <w:p>
+      <w:pPr>
+        <w:rPr>
+          <w:rFonts w:ascii="Times New Roman" w:hAnsi="Times New Roman" w:cs="Times New Roman"/>
+          <w:b/>
+          <w:bCs/>
+          <w:sz w:val="28"/>
+          <w:szCs w:val="28"/>
+          <w:lang w:val="es-ES_tradnl"/>
+        </w:rPr>
+      </w:pPr>
+      <w:proofErr w:type="gramStart"/>
+      <w:r>
+        <w:rPr>
+          <w:rFonts w:ascii="Times New Roman" w:hAnsi="Times New Roman" w:cs="Times New Roman"/>
+          <w:b/>
+          <w:bCs/>
+          <w:sz w:val="28"/>
+          <w:szCs w:val="28"/>
+          <w:lang w:val="es-ES_tradnl"/>
+        </w:rPr>
+        <w:t>Qué hace el</w:t>
+      </w:r>
+      <w:r>
+        <w:rPr>
+          <w:rFonts w:ascii="Times New Roman" w:hAnsi="Times New Roman" w:cs="Times New Roman"/>
+          <w:b/>
+          <w:bCs/>
+          <w:sz w:val="28"/>
+          <w:szCs w:val="28"/>
+          <w:lang w:val="es-ES_tradnl"/>
+        </w:rPr>
+        <w:t xml:space="preserve"> paso</w:t>
+      </w:r>
+      <w:r>
+        <w:rPr>
+          <w:rFonts w:ascii="Times New Roman" w:hAnsi="Times New Roman" w:cs="Times New Roman"/>
+          <w:b/>
+          <w:bCs/>
+          <w:sz w:val="28"/>
+          <w:szCs w:val="28"/>
+          <w:lang w:val="es-ES_tradnl"/>
+        </w:rPr>
+        <w:t xml:space="preserve"> </w:t>
+      </w:r>
+      <w:r>
+        <w:rPr>
+          <w:rFonts w:ascii="Times New Roman" w:hAnsi="Times New Roman" w:cs="Times New Roman"/>
+          <w:b/>
+          <w:bCs/>
+          <w:sz w:val="28"/>
+          <w:szCs w:val="28"/>
+          <w:lang w:val="es-ES_tradnl"/>
+        </w:rPr>
+        <w:t>2</w:t>
+      </w:r>
+      <w:r>
+        <w:rPr>
+          <w:rFonts w:ascii="Times New Roman" w:hAnsi="Times New Roman" w:cs="Times New Roman"/>
+          <w:b/>
+          <w:bCs/>
+          <w:sz w:val="28"/>
+          <w:szCs w:val="28"/>
+          <w:lang w:val="es-ES_tradnl"/>
+        </w:rPr>
+        <w:t>?</w:t>
+      </w:r>
+      <w:proofErr w:type="gramEnd"/>
+    </w:p>
+    <w:p>
+      <w:pPr>
+        <w:rPr>
+          <w:rFonts w:ascii="Times New Roman" w:hAnsi="Times New Roman" w:cs="Times New Roman"/>
+          <w:b/>
+          <w:bCs/>
+          <w:sz w:val="28"/>
+          <w:szCs w:val="28"/>
+          <w:lang w:val="es-ES_tradnl"/>
+        </w:rPr>
+      </w:pPr>
+    </w:p>
+    <w:tbl>
+      <w:tblPr>
+        <w:tblStyle w:val="Tablaconcuadrcula"/>
+        <w:tblpPr w:leftFromText="141" w:rightFromText="141" w:vertAnchor="text" w:horzAnchor="margin" w:tblpY="139"/>
+        <w:tblW w:w="0" w:type="auto"/>
+        <w:tblCellMar>
+          <w:top w:w="85" w:type="dxa"/>
+          <w:bottom w:w="85" w:type="dxa"/>
+        </w:tblCellMar>
+        <w:tblLook w:val="04A0" w:firstRow="1" w:lastRow="0" w:firstColumn="1" w:lastColumn="0" w:noHBand="0" w:noVBand="1"/>
+      </w:tblPr>
+      <w:tblGrid>
+        <w:gridCol w:w="4414"/>
+        <w:gridCol w:w="4414"/>
+      </w:tblGrid>
+      <w:tr>
+        <w:tc>
+          <w:tcPr>
+            <w:tcW w:w="4414" w:type="dxa"/>
+          </w:tcPr>
+          <w:p>
+            <w:pPr>
+              <w:jc w:val="center"/>
+              <w:rPr>
+                <w:rFonts w:ascii="Times New Roman" w:hAnsi="Times New Roman" w:cs="Times New Roman"/>
+                <w:b/>
+                <w:bCs/>
+                <w:lang w:val="es-ES_tradnl"/>
+              </w:rPr>
+            </w:pPr>
+            <w:r>
+              <w:rPr>
+                <w:rFonts w:ascii="Times New Roman" w:hAnsi="Times New Roman" w:cs="Times New Roman"/>
+                <w:b/>
+                <w:bCs/>
+                <w:color w:val="00B050"/>
+                <w:lang w:val="es-ES_tradnl"/>
+              </w:rPr>
+              <w:t>CONCEPTO</w:t>
+            </w:r>
+          </w:p>
+        </w:tc>
+        <w:tc>
+          <w:tcPr>
+            <w:tcW w:w="4414" w:type="dxa"/>
+          </w:tcPr>
+          <w:p>
+            <w:pPr>
+              <w:jc w:val="center"/>
+              <w:rPr>
+                <w:rFonts w:ascii="Times New Roman" w:hAnsi="Times New Roman" w:cs="Times New Roman"/>
+                <w:b/>
+                <w:bCs/>
+                <w:lang w:val="es-ES_tradnl"/>
+              </w:rPr>
+            </w:pPr>
+            <w:r>
+              <w:rPr>
+                <w:rFonts w:ascii="Times New Roman" w:hAnsi="Times New Roman" w:cs="Times New Roman"/>
+                <w:b/>
+                <w:bCs/>
+                <w:color w:val="00B050"/>
+                <w:lang w:val="es-ES_tradnl"/>
+              </w:rPr>
+              <w:t xml:space="preserve">QUÉ </w:t>
+            </w:r>
+            <w:proofErr w:type="gramStart"/>
+            <w:r>
+              <w:rPr>
+                <w:rFonts w:ascii="Times New Roman" w:hAnsi="Times New Roman" w:cs="Times New Roman"/>
+                <w:b/>
+                <w:bCs/>
+                <w:color w:val="00B050"/>
+                <w:lang w:val="es-ES_tradnl"/>
+              </w:rPr>
+              <w:t xml:space="preserve">HACE </w:t>
+            </w:r>
+            <w:r>
+              <w:rPr>
+                <w:rFonts w:ascii="Times New Roman" w:hAnsi="Times New Roman" w:cs="Times New Roman"/>
+                <w:b/>
+                <w:bCs/>
+                <w:color w:val="00B050"/>
+                <w:lang w:val="es-ES_tradnl"/>
+              </w:rPr>
+              <w:t>?</w:t>
+            </w:r>
+            <w:proofErr w:type="gramEnd"/>
+          </w:p>
+        </w:tc>
+      </w:tr>
+      <w:tr>
+        <w:trPr>
+          <w:trHeight w:val="156"/>
+        </w:trPr>
+        <w:tc>
+          <w:tcPr>
+            <w:tcW w:w="4414" w:type="dxa"/>
+          </w:tcPr>
+          <w:p>
+            <w:pPr>
+              <w:jc w:val="center"/>
+              <w:rPr>
+                <w:rFonts w:ascii="Times New Roman" w:hAnsi="Times New Roman" w:cs="Times New Roman"/>
+                <w:b/>
+                <w:bCs/>
+                <w:sz w:val="15"/>
+                <w:szCs w:val="15"/>
+                <w:lang w:val="es-ES_tradnl"/>
+              </w:rPr>
+            </w:pPr>
+            <w:proofErr w:type="spellStart"/>
+            <w:proofErr w:type="gramStart"/>
+            <w:r>
+              <w:rPr>
+                <w:rFonts w:ascii="Times New Roman" w:hAnsi="Times New Roman" w:cs="Times New Roman"/>
+                <w:b/>
+                <w:bCs/>
+                <w:sz w:val="15"/>
+                <w:szCs w:val="15"/>
+                <w:lang w:val="es-ES_tradnl"/>
+              </w:rPr>
+              <w:t>pdf.ln</w:t>
+            </w:r>
+            <w:proofErr w:type="spellEnd"/>
+            <w:proofErr w:type="gramEnd"/>
+            <w:r>
+              <w:rPr>
+                <w:rFonts w:ascii="Times New Roman" w:hAnsi="Times New Roman" w:cs="Times New Roman"/>
+                <w:b/>
+                <w:bCs/>
+                <w:sz w:val="15"/>
+                <w:szCs w:val="15"/>
+                <w:lang w:val="es-ES_tradnl"/>
+              </w:rPr>
+              <w:t>(30)</w:t>
+            </w:r>
+          </w:p>
+        </w:tc>
+        <w:tc>
+          <w:tcPr>
+            <w:tcW w:w="4414" w:type="dxa"/>
+          </w:tcPr>
+          <w:p>
+            <w:pPr>
+              <w:rPr>
+                <w:rFonts w:ascii="Times New Roman" w:hAnsi="Times New Roman" w:cs="Times New Roman"/>
+                <w:b/>
+                <w:bCs/>
+                <w:sz w:val="15"/>
+                <w:szCs w:val="15"/>
+                <w:lang w:val="es-ES_tradnl"/>
+              </w:rPr>
+            </w:pPr>
+            <w:r>
+              <w:rPr>
+                <w:rFonts w:ascii="Times New Roman" w:hAnsi="Times New Roman" w:cs="Times New Roman"/>
+                <w:b/>
+                <w:bCs/>
+                <w:sz w:val="15"/>
+                <w:szCs w:val="15"/>
+                <w:lang w:val="es-ES_tradnl"/>
+              </w:rPr>
+              <w:t>Baja el cursor como un enter. Deja espacio</w:t>
+            </w:r>
+          </w:p>
+        </w:tc>
+      </w:tr>
+      <w:tr>
+        <w:tc>
+          <w:tcPr>
+            <w:tcW w:w="4414" w:type="dxa"/>
+          </w:tcPr>
+          <w:p>
+            <w:pPr>
+              <w:jc w:val="center"/>
+              <w:rPr>
+                <w:rFonts w:ascii="Times New Roman" w:hAnsi="Times New Roman" w:cs="Times New Roman"/>
+                <w:b/>
+                <w:bCs/>
+                <w:sz w:val="15"/>
+                <w:szCs w:val="15"/>
+                <w:lang w:val="es-ES_tradnl"/>
+              </w:rPr>
+            </w:pPr>
+            <w:proofErr w:type="spellStart"/>
+            <w:r>
+              <w:rPr>
+                <w:rFonts w:ascii="Times New Roman" w:hAnsi="Times New Roman" w:cs="Times New Roman"/>
+                <w:b/>
+                <w:bCs/>
+                <w:sz w:val="15"/>
+                <w:szCs w:val="15"/>
+                <w:lang w:val="es-ES_tradnl"/>
+              </w:rPr>
+              <w:t>style</w:t>
+            </w:r>
+            <w:proofErr w:type="spellEnd"/>
+            <w:proofErr w:type="gramStart"/>
+            <w:r>
+              <w:rPr>
+                <w:rFonts w:ascii="Times New Roman" w:hAnsi="Times New Roman" w:cs="Times New Roman"/>
+                <w:b/>
+                <w:bCs/>
+                <w:sz w:val="15"/>
+                <w:szCs w:val="15"/>
+                <w:lang w:val="es-ES_tradnl"/>
+              </w:rPr>
+              <w:t>=”B</w:t>
+            </w:r>
+            <w:proofErr w:type="gramEnd"/>
+            <w:r>
+              <w:rPr>
+                <w:rFonts w:ascii="Times New Roman" w:hAnsi="Times New Roman" w:cs="Times New Roman"/>
+                <w:b/>
+                <w:bCs/>
+                <w:sz w:val="15"/>
+                <w:szCs w:val="15"/>
+                <w:lang w:val="es-ES_tradnl"/>
+              </w:rPr>
+              <w:t>”</w:t>
+            </w:r>
+          </w:p>
+        </w:tc>
+        <w:tc>
+          <w:tcPr>
+            <w:tcW w:w="4414" w:type="dxa"/>
+          </w:tcPr>
+          <w:p>
+            <w:pPr>
+              <w:rPr>
+                <w:rFonts w:ascii="Times New Roman" w:hAnsi="Times New Roman" w:cs="Times New Roman"/>
+                <w:b/>
+                <w:bCs/>
+                <w:sz w:val="15"/>
+                <w:szCs w:val="15"/>
+                <w:lang w:val="es-ES_tradnl"/>
+              </w:rPr>
+            </w:pPr>
+            <w:r>
+              <w:rPr>
+                <w:rFonts w:ascii="Times New Roman" w:hAnsi="Times New Roman" w:cs="Times New Roman"/>
+                <w:b/>
+                <w:bCs/>
+                <w:sz w:val="15"/>
+                <w:szCs w:val="15"/>
+                <w:lang w:val="es-ES_tradnl"/>
+              </w:rPr>
+              <w:t>Fuente en negrita</w:t>
+            </w:r>
+          </w:p>
+        </w:tc>
+      </w:tr>
+      <w:tr>
+        <w:tc>
+          <w:tcPr>
+            <w:tcW w:w="4414" w:type="dxa"/>
+          </w:tcPr>
+          <w:p>
+            <w:pPr>
+              <w:jc w:val="center"/>
+              <w:rPr>
+                <w:rFonts w:ascii="Times New Roman" w:hAnsi="Times New Roman" w:cs="Times New Roman"/>
+                <w:b/>
+                <w:bCs/>
+                <w:sz w:val="15"/>
+                <w:szCs w:val="15"/>
+                <w:lang w:val="es-ES_tradnl"/>
+              </w:rPr>
+            </w:pPr>
+            <w:proofErr w:type="spellStart"/>
+            <w:r>
+              <w:rPr>
+                <w:rFonts w:ascii="Times New Roman" w:hAnsi="Times New Roman" w:cs="Times New Roman"/>
+                <w:b/>
+                <w:bCs/>
+                <w:sz w:val="15"/>
+                <w:szCs w:val="15"/>
+                <w:lang w:val="es-ES_tradnl"/>
+              </w:rPr>
+              <w:t>s</w:t>
+            </w:r>
+            <w:r>
+              <w:rPr>
+                <w:rFonts w:ascii="Times New Roman" w:hAnsi="Times New Roman" w:cs="Times New Roman"/>
+                <w:b/>
+                <w:bCs/>
+                <w:sz w:val="15"/>
+                <w:szCs w:val="15"/>
+                <w:lang w:val="es-ES_tradnl"/>
+              </w:rPr>
+              <w:t>tyle</w:t>
+            </w:r>
+            <w:proofErr w:type="spellEnd"/>
+            <w:r>
+              <w:rPr>
+                <w:rFonts w:ascii="Times New Roman" w:hAnsi="Times New Roman" w:cs="Times New Roman"/>
+                <w:b/>
+                <w:bCs/>
+                <w:sz w:val="15"/>
+                <w:szCs w:val="15"/>
+                <w:lang w:val="es-ES_tradnl"/>
+              </w:rPr>
+              <w:t>=””</w:t>
+            </w:r>
+          </w:p>
+        </w:tc>
+        <w:tc>
+          <w:tcPr>
+            <w:tcW w:w="4414" w:type="dxa"/>
+          </w:tcPr>
+          <w:p>
+            <w:pPr>
+              <w:rPr>
+                <w:rFonts w:ascii="Times New Roman" w:hAnsi="Times New Roman" w:cs="Times New Roman"/>
+                <w:b/>
+                <w:bCs/>
+                <w:sz w:val="15"/>
+                <w:szCs w:val="15"/>
+                <w:lang w:val="es-ES_tradnl"/>
+              </w:rPr>
+            </w:pPr>
+            <w:r>
+              <w:rPr>
+                <w:rFonts w:ascii="Times New Roman" w:hAnsi="Times New Roman" w:cs="Times New Roman"/>
+                <w:b/>
+                <w:bCs/>
+                <w:sz w:val="15"/>
+                <w:szCs w:val="15"/>
+                <w:lang w:val="es-ES_tradnl"/>
+              </w:rPr>
+              <w:t>Texto normal</w:t>
+            </w:r>
+          </w:p>
+        </w:tc>
+      </w:tr>
+      <w:tr>
+        <w:tc>
+          <w:tcPr>
+            <w:tcW w:w="4414" w:type="dxa"/>
+          </w:tcPr>
+          <w:p>
+            <w:pPr>
+              <w:jc w:val="center"/>
+              <w:rPr>
+                <w:rFonts w:ascii="Times New Roman" w:hAnsi="Times New Roman" w:cs="Times New Roman"/>
+                <w:b/>
+                <w:bCs/>
+                <w:sz w:val="15"/>
+                <w:szCs w:val="15"/>
+                <w:lang w:val="es-ES_tradnl"/>
+              </w:rPr>
+            </w:pPr>
+            <w:proofErr w:type="spellStart"/>
+            <w:r>
+              <w:rPr>
+                <w:rFonts w:ascii="Times New Roman" w:hAnsi="Times New Roman" w:cs="Times New Roman"/>
+                <w:b/>
+                <w:bCs/>
+                <w:sz w:val="15"/>
+                <w:szCs w:val="15"/>
+                <w:lang w:val="es-ES_tradnl"/>
+              </w:rPr>
+              <w:t>style</w:t>
+            </w:r>
+            <w:proofErr w:type="spellEnd"/>
+            <w:proofErr w:type="gramStart"/>
+            <w:r>
+              <w:rPr>
+                <w:rFonts w:ascii="Times New Roman" w:hAnsi="Times New Roman" w:cs="Times New Roman"/>
+                <w:b/>
+                <w:bCs/>
+                <w:sz w:val="15"/>
+                <w:szCs w:val="15"/>
+                <w:lang w:val="es-ES_tradnl"/>
+              </w:rPr>
+              <w:t>=”I</w:t>
+            </w:r>
+            <w:proofErr w:type="gramEnd"/>
+            <w:r>
+              <w:rPr>
+                <w:rFonts w:ascii="Times New Roman" w:hAnsi="Times New Roman" w:cs="Times New Roman"/>
+                <w:b/>
+                <w:bCs/>
+                <w:sz w:val="15"/>
+                <w:szCs w:val="15"/>
+                <w:lang w:val="es-ES_tradnl"/>
+              </w:rPr>
+              <w:t>”</w:t>
+            </w:r>
+          </w:p>
+        </w:tc>
+        <w:tc>
+          <w:tcPr>
+            <w:tcW w:w="4414" w:type="dxa"/>
+          </w:tcPr>
+          <w:p>
+            <w:pPr>
+              <w:rPr>
+                <w:rFonts w:ascii="Times New Roman" w:hAnsi="Times New Roman" w:cs="Times New Roman"/>
+                <w:b/>
+                <w:bCs/>
+                <w:sz w:val="15"/>
+                <w:szCs w:val="15"/>
+                <w:lang w:val="es-ES_tradnl"/>
+              </w:rPr>
+            </w:pPr>
+            <w:r>
+              <w:rPr>
+                <w:rFonts w:ascii="Times New Roman" w:hAnsi="Times New Roman" w:cs="Times New Roman"/>
+                <w:b/>
+                <w:bCs/>
+                <w:sz w:val="15"/>
+                <w:szCs w:val="15"/>
+                <w:lang w:val="es-ES_tradnl"/>
+              </w:rPr>
+              <w:t>Texto en cursiva</w:t>
+            </w:r>
+          </w:p>
+        </w:tc>
+      </w:tr>
+      <w:tr>
+        <w:tc>
+          <w:tcPr>
+            <w:tcW w:w="4414" w:type="dxa"/>
+          </w:tcPr>
+          <w:p>
+            <w:pPr>
+              <w:jc w:val="center"/>
+              <w:rPr>
+                <w:rFonts w:ascii="Times New Roman" w:hAnsi="Times New Roman" w:cs="Times New Roman"/>
+                <w:b/>
+                <w:bCs/>
+                <w:sz w:val="15"/>
+                <w:szCs w:val="15"/>
+                <w:lang w:val="es-ES_tradnl"/>
+              </w:rPr>
+            </w:pPr>
+            <w:r>
+              <w:rPr>
+                <w:rFonts w:ascii="Times New Roman" w:hAnsi="Times New Roman" w:cs="Times New Roman"/>
+                <w:b/>
+                <w:bCs/>
+                <w:sz w:val="15"/>
+                <w:szCs w:val="15"/>
+                <w:lang w:val="es-ES_tradnl"/>
+              </w:rPr>
+              <w:t xml:space="preserve">Cambiar </w:t>
+            </w:r>
+            <w:proofErr w:type="spellStart"/>
+            <w:r>
+              <w:rPr>
+                <w:rFonts w:ascii="Times New Roman" w:hAnsi="Times New Roman" w:cs="Times New Roman"/>
+                <w:b/>
+                <w:bCs/>
+                <w:sz w:val="15"/>
+                <w:szCs w:val="15"/>
+                <w:lang w:val="es-ES_tradnl"/>
+              </w:rPr>
+              <w:t>size</w:t>
+            </w:r>
+            <w:proofErr w:type="spellEnd"/>
+            <w:r>
+              <w:rPr>
+                <w:rFonts w:ascii="Times New Roman" w:hAnsi="Times New Roman" w:cs="Times New Roman"/>
+                <w:b/>
+                <w:bCs/>
+                <w:sz w:val="15"/>
+                <w:szCs w:val="15"/>
+                <w:lang w:val="es-ES_tradnl"/>
+              </w:rPr>
+              <w:t>=</w:t>
+            </w:r>
+          </w:p>
+        </w:tc>
+        <w:tc>
+          <w:tcPr>
+            <w:tcW w:w="4414" w:type="dxa"/>
+          </w:tcPr>
+          <w:p>
+            <w:pPr>
+              <w:rPr>
+                <w:rFonts w:ascii="Times New Roman" w:hAnsi="Times New Roman" w:cs="Times New Roman"/>
+                <w:b/>
+                <w:bCs/>
+                <w:sz w:val="15"/>
+                <w:szCs w:val="15"/>
+                <w:lang w:val="es-ES_tradnl"/>
+              </w:rPr>
+            </w:pPr>
+            <w:r>
+              <w:rPr>
+                <w:rFonts w:ascii="Times New Roman" w:hAnsi="Times New Roman" w:cs="Times New Roman"/>
+                <w:b/>
+                <w:bCs/>
+                <w:sz w:val="15"/>
+                <w:szCs w:val="15"/>
+                <w:lang w:val="es-ES_tradnl"/>
+              </w:rPr>
+              <w:t xml:space="preserve">Letras </w:t>
+            </w:r>
+            <w:proofErr w:type="gramStart"/>
+            <w:r>
+              <w:rPr>
+                <w:rFonts w:ascii="Times New Roman" w:hAnsi="Times New Roman" w:cs="Times New Roman"/>
+                <w:b/>
+                <w:bCs/>
+                <w:sz w:val="15"/>
+                <w:szCs w:val="15"/>
+                <w:lang w:val="es-ES_tradnl"/>
+              </w:rPr>
+              <w:t>más grandes o más pequeñas</w:t>
+            </w:r>
+            <w:proofErr w:type="gramEnd"/>
+          </w:p>
+        </w:tc>
+      </w:tr>
+    </w:tbl>
+    <w:p>
+      <w:pPr>
+        <w:rPr>
+          <w:rFonts w:ascii="Times New Roman" w:hAnsi="Times New Roman" w:cs="Times New Roman"/>
+          <w:b/>
+          <w:bCs/>
+          <w:sz w:val="28"/>
+          <w:szCs w:val="28"/>
+          <w:lang w:val="es-ES_tradnl"/>
+        </w:rPr>
+      </w:pPr>
+    </w:p>
+    <w:p>
+      <w:pPr>
+        <w:rPr>
+          <w:rFonts w:ascii="Times New Roman" w:hAnsi="Times New Roman" w:cs="Times New Roman"/>
+          <w:b/>
+          <w:bCs/>
+          <w:sz w:val="28"/>
+          <w:szCs w:val="28"/>
+          <w:lang w:val="es-ES_tradnl"/>
+        </w:rPr>
+      </w:pPr>
+      <w:r>
+        <w:rPr>
+          <w:rFonts w:ascii="Times New Roman" w:hAnsi="Times New Roman" w:cs="Times New Roman"/>
+          <w:b/>
+          <w:bCs/>
+          <w:noProof/>
+          <w:sz w:val="28"/>
+          <w:szCs w:val="28"/>
+          <w:lang w:val="es-ES_tradnl"/>
+        </w:rPr>
+        <w:lastRenderedPageBreak/>
+        <w:drawing>
+          <wp:inline distT="0" distB="0" distL="0" distR="0" wp14:anchorId="4897BCC9" wp14:editId="033A953F">
+            <wp:extent cx="5612130" cy="5207635"/>
+            <wp:effectExtent l="0" t="0" r="1270" b="0"/>
+            <wp:docPr id="357420074" name="Imagen 4"/>
+            <wp:cNvGraphicFramePr>
+              <a:graphicFrameLocks xmlns:a="http://schemas.openxmlformats.org/drawingml/2006/main" noChangeAspect="1"/>
+            </wp:cNvGraphicFramePr>
+            <a:graphic xmlns:a="http://schemas.openxmlformats.org/drawingml/2006/main">
+              <a:graphicData uri="http://schemas.openxmlformats.org/drawingml/2006/picture">
+                <pic:pic xmlns:pic="http://schemas.openxmlformats.org/drawingml/2006/picture">
+                  <pic:nvPicPr>
+                    <pic:cNvPr id="357420074" name="Imagen 357420074"/>
+                    <pic:cNvPicPr/>
+                  </pic:nvPicPr>
+                  <pic:blipFill>
+                    <a:blip r:embed="rId7" cstate="print">
+                      <a:extLst>
+                        <a:ext uri="{28A0092B-C50C-407E-A947-70E740481C1C}">
+                          <a14:useLocalDpi xmlns:a14="http://schemas.microsoft.com/office/drawing/2010/main" val="0"/>
+                        </a:ext>
+                      </a:extLst>
+                    </a:blip>
+                    <a:stretch>
+                      <a:fillRect/>
+                    </a:stretch>
+                  </pic:blipFill>
+                  <pic:spPr>
+                    <a:xfrm>
+                      <a:off x="0" y="0"/>
+                      <a:ext cx="5612130" cy="5207635"/>
+                    </a:xfrm>
+                    <a:prstGeom prst="rect">
+                      <a:avLst/>
+                    </a:prstGeom>
+                  </pic:spPr>
+                </pic:pic>
+              </a:graphicData>
+            </a:graphic>
+          </wp:inline>
+        </w:drawing>
+      </w:r>
+    </w:p>
+    <w:p>
+      <w:pPr>
+        <w:rPr>
+          <w:rFonts w:ascii="Times New Roman" w:hAnsi="Times New Roman" w:cs="Times New Roman"/>
+          <w:b/>
+          <w:bCs/>
+          <w:sz w:val="28"/>
+          <w:szCs w:val="28"/>
+          <w:lang w:val="es-ES_tradnl"/>
+        </w:rPr>
+      </w:pPr>
+    </w:p>
+    <w:p>
+      <w:pPr>
+        <w:rPr>
+          <w:rFonts w:ascii="Times New Roman" w:hAnsi="Times New Roman" w:cs="Times New Roman"/>
+          <w:b/>
+          <w:bCs/>
+          <w:sz w:val="28"/>
+          <w:szCs w:val="28"/>
+          <w:lang w:val="es-ES_tradnl"/>
+        </w:rPr>
+      </w:pPr>
+      <w:r>
+        <w:rPr>
+          <w:rFonts w:ascii="Times New Roman" w:hAnsi="Times New Roman" w:cs="Times New Roman"/>
+          <w:b/>
+          <w:bCs/>
+          <w:noProof/>
+          <w:sz w:val="28"/>
+          <w:szCs w:val="28"/>
+          <w:lang w:val="es-ES_tradnl"/>
+        </w:rPr>
+        <w:drawing>
+          <wp:inline distT="0" distB="0" distL="0" distR="0" wp14:anchorId="2532AEE5" wp14:editId="78FC544A">
+            <wp:extent cx="5612130" cy="2388870"/>
+            <wp:effectExtent l="0" t="0" r="1270" b="0"/>
+            <wp:docPr id="270501364" name="Imagen 5"/>
+            <wp:cNvGraphicFramePr>
+              <a:graphicFrameLocks xmlns:a="http://schemas.openxmlformats.org/drawingml/2006/main" noChangeAspect="1"/>
+            </wp:cNvGraphicFramePr>
+            <a:graphic xmlns:a="http://schemas.openxmlformats.org/drawingml/2006/main">
+              <a:graphicData uri="http://schemas.openxmlformats.org/drawingml/2006/picture">
+                <pic:pic xmlns:pic="http://schemas.openxmlformats.org/drawingml/2006/picture">
+                  <pic:nvPicPr>
+                    <pic:cNvPr id="270501364" name="Imagen 270501364"/>
+                    <pic:cNvPicPr/>
+                  </pic:nvPicPr>
+                  <pic:blipFill>
+                    <a:blip r:embed="rId8" cstate="print">
+                      <a:extLst>
+                        <a:ext uri="{28A0092B-C50C-407E-A947-70E740481C1C}">
+                          <a14:useLocalDpi xmlns:a14="http://schemas.microsoft.com/office/drawing/2010/main" val="0"/>
+                        </a:ext>
+                      </a:extLst>
+                    </a:blip>
+                    <a:stretch>
+                      <a:fillRect/>
+                    </a:stretch>
+                  </pic:blipFill>
+                  <pic:spPr>
+                    <a:xfrm>
+                      <a:off x="0" y="0"/>
+                      <a:ext cx="5612130" cy="2388870"/>
+                    </a:xfrm>
+                    <a:prstGeom prst="rect">
+                      <a:avLst/>
+                    </a:prstGeom>
+                  </pic:spPr>
+                </pic:pic>
+              </a:graphicData>
+            </a:graphic>
+          </wp:inline>
+        </w:drawing>
+      </w:r>
+    </w:p>
+    <w:p>
+      <w:pPr>
+        <w:rPr>
+          <w:rFonts w:ascii="Times New Roman" w:hAnsi="Times New Roman" w:cs="Times New Roman"/>
+          <w:lang w:val="es-ES_tradnl"/>
+        </w:rPr>
+      </w:pPr>
+      <w:r>
+        <w:rPr>
+          <w:rFonts w:ascii="Times New Roman" w:hAnsi="Times New Roman" w:cs="Times New Roman"/>
+          <w:lang w:val="es-ES_tradnl"/>
+        </w:rPr>
+        <w:lastRenderedPageBreak/>
+        <w:t xml:space="preserve">Con el paso 2, el certificado tendrá </w:t>
+      </w:r>
+      <w:r>
+        <w:rPr>
+          <w:rFonts w:ascii="Times New Roman" w:hAnsi="Times New Roman" w:cs="Times New Roman"/>
+          <w:lang w:val="es-ES_tradnl"/>
+        </w:rPr>
+        <w:t>texto introductorio, fecha, nombre del alumno, nombre del curso</w:t>
+      </w:r>
+      <w:r>
+        <w:rPr>
+          <w:rFonts w:ascii="Times New Roman" w:hAnsi="Times New Roman" w:cs="Times New Roman"/>
+          <w:lang w:val="es-ES_tradnl"/>
+        </w:rPr>
+        <w:t>.</w:t>
+      </w:r>
+    </w:p>
+    <w:p>
+      <w:pPr>
+        <w:rPr>
+          <w:rFonts w:ascii="Times New Roman" w:hAnsi="Times New Roman" w:cs="Times New Roman"/>
+          <w:color w:val="00B050"/>
+          <w:lang w:val="es-ES_tradnl"/>
+        </w:rPr>
+      </w:pPr>
+      <w:r>
+        <w:rPr>
+          <w:rFonts w:ascii="Times New Roman" w:hAnsi="Times New Roman" w:cs="Times New Roman"/>
+          <w:lang w:val="es-ES_tradnl"/>
+        </w:rPr>
+        <w:t xml:space="preserve">Importamos la librería, creamos el </w:t>
+      </w:r>
+      <w:proofErr w:type="spellStart"/>
+      <w:r>
+        <w:rPr>
+          <w:rFonts w:ascii="Times New Roman" w:hAnsi="Times New Roman" w:cs="Times New Roman"/>
+          <w:lang w:val="es-ES_tradnl"/>
+        </w:rPr>
+        <w:t>pdf</w:t>
+      </w:r>
+      <w:proofErr w:type="spellEnd"/>
+      <w:r>
+        <w:rPr>
+          <w:rFonts w:ascii="Times New Roman" w:hAnsi="Times New Roman" w:cs="Times New Roman"/>
+          <w:lang w:val="es-ES_tradnl"/>
+        </w:rPr>
+        <w:t xml:space="preserve">, creamos </w:t>
+      </w:r>
+      <w:proofErr w:type="gramStart"/>
+      <w:r>
+        <w:rPr>
+          <w:rFonts w:ascii="Times New Roman" w:hAnsi="Times New Roman" w:cs="Times New Roman"/>
+          <w:lang w:val="es-ES_tradnl"/>
+        </w:rPr>
+        <w:t>un nueva página</w:t>
+      </w:r>
+      <w:proofErr w:type="gramEnd"/>
+      <w:r>
+        <w:rPr>
+          <w:rFonts w:ascii="Times New Roman" w:hAnsi="Times New Roman" w:cs="Times New Roman"/>
+          <w:lang w:val="es-ES_tradnl"/>
+        </w:rPr>
+        <w:t xml:space="preserve">, le damos formato al título con la novedad de dejar un espacio debajo del título. </w:t>
+      </w:r>
+      <w:proofErr w:type="spellStart"/>
+      <w:proofErr w:type="gramStart"/>
+      <w:r>
+        <w:rPr>
+          <w:rFonts w:ascii="Times New Roman" w:hAnsi="Times New Roman" w:cs="Times New Roman"/>
+          <w:color w:val="00B050"/>
+          <w:lang w:val="es-ES_tradnl"/>
+        </w:rPr>
+        <w:t>pdf.ln</w:t>
+      </w:r>
+      <w:proofErr w:type="spellEnd"/>
+      <w:proofErr w:type="gramEnd"/>
+      <w:r>
+        <w:rPr>
+          <w:rFonts w:ascii="Times New Roman" w:hAnsi="Times New Roman" w:cs="Times New Roman"/>
+          <w:color w:val="00B050"/>
+          <w:lang w:val="es-ES_tradnl"/>
+        </w:rPr>
+        <w:t>(“30”)</w:t>
+      </w:r>
+    </w:p>
+    <w:p>
+      <w:pPr>
+        <w:rPr>
+          <w:rFonts w:ascii="Times New Roman" w:hAnsi="Times New Roman" w:cs="Times New Roman"/>
+          <w:lang w:val="es-ES_tradnl"/>
+        </w:rPr>
+      </w:pPr>
+      <w:r>
+        <w:rPr>
+          <w:rFonts w:ascii="Times New Roman" w:hAnsi="Times New Roman" w:cs="Times New Roman"/>
+          <w:lang w:val="es-ES_tradnl"/>
+        </w:rPr>
+        <w:t xml:space="preserve">Ahora creamos los textos con los formatos que necesitamos </w:t>
+      </w:r>
+      <w:proofErr w:type="spellStart"/>
+      <w:proofErr w:type="gramStart"/>
+      <w:r>
+        <w:rPr>
+          <w:rFonts w:ascii="Times New Roman" w:hAnsi="Times New Roman" w:cs="Times New Roman"/>
+          <w:lang w:val="es-ES_tradnl"/>
+        </w:rPr>
+        <w:t>asi</w:t>
+      </w:r>
+      <w:proofErr w:type="spellEnd"/>
+      <w:r>
+        <w:rPr>
+          <w:rFonts w:ascii="Times New Roman" w:hAnsi="Times New Roman" w:cs="Times New Roman"/>
+          <w:lang w:val="es-ES_tradnl"/>
+        </w:rPr>
+        <w:t xml:space="preserve"> :</w:t>
+      </w:r>
+      <w:proofErr w:type="gramEnd"/>
+    </w:p>
+    <w:p>
+      <w:pPr>
+        <w:rPr>
+          <w:rFonts w:ascii="Times New Roman" w:hAnsi="Times New Roman" w:cs="Times New Roman"/>
+          <w:lang w:val="es-ES_tradnl"/>
+        </w:rPr>
+      </w:pPr>
+    </w:p>
+    <w:p>
+      <w:pPr>
+        <w:rPr>
+          <w:rFonts w:ascii="Times New Roman" w:hAnsi="Times New Roman" w:cs="Times New Roman"/>
+          <w:lang w:val="es-ES_tradnl"/>
+        </w:rPr>
+      </w:pPr>
+      <w:r>
+        <w:rPr>
+          <w:rFonts w:ascii="Times New Roman" w:hAnsi="Times New Roman" w:cs="Times New Roman"/>
+          <w:noProof/>
+          <w:lang w:val="es-ES_tradnl"/>
+        </w:rPr>
+        <w:drawing>
+          <wp:inline distT="0" distB="0" distL="0" distR="0" wp14:anchorId="05B0CFF2" wp14:editId="2E2D830F">
+            <wp:extent cx="5612130" cy="3714115"/>
+            <wp:effectExtent l="0" t="0" r="1270" b="0"/>
+            <wp:docPr id="54054877" name="Imagen 6"/>
+            <wp:cNvGraphicFramePr>
+              <a:graphicFrameLocks xmlns:a="http://schemas.openxmlformats.org/drawingml/2006/main" noChangeAspect="1"/>
+            </wp:cNvGraphicFramePr>
+            <a:graphic xmlns:a="http://schemas.openxmlformats.org/drawingml/2006/main">
+              <a:graphicData uri="http://schemas.openxmlformats.org/drawingml/2006/picture">
+                <pic:pic xmlns:pic="http://schemas.openxmlformats.org/drawingml/2006/picture">
+                  <pic:nvPicPr>
+                    <pic:cNvPr id="54054877" name="Imagen 54054877"/>
+                    <pic:cNvPicPr/>
+                  </pic:nvPicPr>
+                  <pic:blipFill>
+                    <a:blip r:embed="rId9" cstate="print">
+                      <a:extLst>
+                        <a:ext uri="{28A0092B-C50C-407E-A947-70E740481C1C}">
+                          <a14:useLocalDpi xmlns:a14="http://schemas.microsoft.com/office/drawing/2010/main" val="0"/>
+                        </a:ext>
+                      </a:extLst>
+                    </a:blip>
+                    <a:stretch>
+                      <a:fillRect/>
+                    </a:stretch>
+                  </pic:blipFill>
+                  <pic:spPr>
+                    <a:xfrm>
+                      <a:off x="0" y="0"/>
+                      <a:ext cx="5612130" cy="3714115"/>
+                    </a:xfrm>
+                    <a:prstGeom prst="rect">
+                      <a:avLst/>
+                    </a:prstGeom>
+                  </pic:spPr>
+                </pic:pic>
+              </a:graphicData>
+            </a:graphic>
+          </wp:inline>
+        </w:drawing>
+      </w:r>
+    </w:p>
+    <w:p>
+      <w:pPr>
+        <w:rPr>
+          <w:rFonts w:ascii="Times New Roman" w:hAnsi="Times New Roman" w:cs="Times New Roman"/>
+          <w:lang w:val="es-ES_tradnl"/>
+        </w:rPr>
+      </w:pPr>
+      <w:r>
+        <w:rPr>
+          <w:rFonts w:ascii="Times New Roman" w:hAnsi="Times New Roman" w:cs="Times New Roman"/>
+          <w:lang w:val="es-ES_tradnl"/>
+        </w:rPr>
+        <w:t>Y guardamos el documento e imprimimos</w:t>
+      </w:r>
+    </w:p>
+    <w:p>
+      <w:pPr>
+        <w:rPr>
+          <w:rFonts w:ascii="Times New Roman" w:hAnsi="Times New Roman" w:cs="Times New Roman"/>
+          <w:lang w:val="es-ES_tradnl"/>
+        </w:rPr>
+      </w:pPr>
+      <w:r>
+        <w:rPr>
+          <w:rFonts w:ascii="Times New Roman" w:hAnsi="Times New Roman" w:cs="Times New Roman"/>
+          <w:noProof/>
+          <w:lang w:val="es-ES_tradnl"/>
+        </w:rPr>
+        <w:drawing>
+          <wp:inline distT="0" distB="0" distL="0" distR="0" wp14:anchorId="2B396D72" wp14:editId="6B314419">
+            <wp:extent cx="5612130" cy="901065"/>
+            <wp:effectExtent l="0" t="0" r="1270" b="635"/>
+            <wp:docPr id="196881579" name="Imagen 7"/>
+            <wp:cNvGraphicFramePr>
+              <a:graphicFrameLocks xmlns:a="http://schemas.openxmlformats.org/drawingml/2006/main" noChangeAspect="1"/>
+            </wp:cNvGraphicFramePr>
+            <a:graphic xmlns:a="http://schemas.openxmlformats.org/drawingml/2006/main">
+              <a:graphicData uri="http://schemas.openxmlformats.org/drawingml/2006/picture">
+                <pic:pic xmlns:pic="http://schemas.openxmlformats.org/drawingml/2006/picture">
+                  <pic:nvPicPr>
+                    <pic:cNvPr id="196881579" name="Imagen 196881579"/>
+                    <pic:cNvPicPr/>
+                  </pic:nvPicPr>
+                  <pic:blipFill>
+                    <a:blip r:embed="rId10" cstate="print">
+                      <a:extLst>
+                        <a:ext uri="{28A0092B-C50C-407E-A947-70E740481C1C}">
+                          <a14:useLocalDpi xmlns:a14="http://schemas.microsoft.com/office/drawing/2010/main" val="0"/>
+                        </a:ext>
+                      </a:extLst>
+                    </a:blip>
+                    <a:stretch>
+                      <a:fillRect/>
+                    </a:stretch>
+                  </pic:blipFill>
+                  <pic:spPr>
+                    <a:xfrm>
+                      <a:off x="0" y="0"/>
+                      <a:ext cx="5612130" cy="901065"/>
+                    </a:xfrm>
+                    <a:prstGeom prst="rect">
+                      <a:avLst/>
+                    </a:prstGeom>
+                  </pic:spPr>
+                </pic:pic>
+              </a:graphicData>
+            </a:graphic>
+          </wp:inline>
+        </w:drawing>
+      </w:r>
+    </w:p>
+    <w:p>
+      <w:pPr>
+        <w:rPr>
+          <w:rFonts w:ascii="Times New Roman" w:hAnsi="Times New Roman" w:cs="Times New Roman"/>
+          <w:lang w:val="es-ES_tradnl"/>
+        </w:rPr>
+      </w:pPr>
+      <w:r>
+        <w:rPr>
+          <w:rFonts w:ascii="Times New Roman" w:hAnsi="Times New Roman" w:cs="Times New Roman"/>
+          <w:noProof/>
+          <w:lang w:val="es-ES_tradnl"/>
+        </w:rPr>
+        <w:drawing>
+          <wp:inline distT="0" distB="0" distL="0" distR="0" wp14:anchorId="079F05B9" wp14:editId="2F590E70">
+            <wp:extent cx="5612130" cy="1397635"/>
+            <wp:effectExtent l="0" t="0" r="1270" b="0"/>
+            <wp:docPr id="261341556" name="Imagen 8"/>
+            <wp:cNvGraphicFramePr>
+              <a:graphicFrameLocks xmlns:a="http://schemas.openxmlformats.org/drawingml/2006/main" noChangeAspect="1"/>
+            </wp:cNvGraphicFramePr>
+            <a:graphic xmlns:a="http://schemas.openxmlformats.org/drawingml/2006/main">
+              <a:graphicData uri="http://schemas.openxmlformats.org/drawingml/2006/picture">
+                <pic:pic xmlns:pic="http://schemas.openxmlformats.org/drawingml/2006/picture">
+                  <pic:nvPicPr>
+                    <pic:cNvPr id="261341556" name="Imagen 261341556"/>
+                    <pic:cNvPicPr/>
+                  </pic:nvPicPr>
+                  <pic:blipFill>
+                    <a:blip r:embed="rId11" cstate="print">
+                      <a:extLst>
+                        <a:ext uri="{28A0092B-C50C-407E-A947-70E740481C1C}">
+                          <a14:useLocalDpi xmlns:a14="http://schemas.microsoft.com/office/drawing/2010/main" val="0"/>
+                        </a:ext>
+                      </a:extLst>
+                    </a:blip>
+                    <a:stretch>
+                      <a:fillRect/>
+                    </a:stretch>
+                  </pic:blipFill>
+                  <pic:spPr>
+                    <a:xfrm>
+                      <a:off x="0" y="0"/>
+                      <a:ext cx="5612130" cy="1397635"/>
+                    </a:xfrm>
+                    <a:prstGeom prst="rect">
+                      <a:avLst/>
+                    </a:prstGeom>
+                  </pic:spPr>
+                </pic:pic>
+              </a:graphicData>
+            </a:graphic>
+          </wp:inline>
+        </w:drawing>
+      </w:r>
     </w:p>
     <w:p>
       <w:pPr>
@@ -997,6 +3419,25 @@
       <w:spacing w:val="5"/>
     </w:rPr>
   </w:style>
+  <w:style w:type="table" w:styleId="Tablaconcuadrcula">
+    <w:name w:val="Table Grid"/>
+    <w:basedOn w:val="Tablanormal"/>
+    <w:uiPriority w:val="39"/>
+    <w:rsid w:val="00D81688"/>
+    <w:pPr>
+      <w:spacing w:after="0" w:line="240" w:lineRule="auto"/>
+    </w:pPr>
+    <w:tblPr>
+      <w:tblBorders>
+        <w:top w:val="single" w:sz="4" w:space="0" w:color="auto"/>
+        <w:left w:val="single" w:sz="4" w:space="0" w:color="auto"/>
+        <w:bottom w:val="single" w:sz="4" w:space="0" w:color="auto"/>
+        <w:right w:val="single" w:sz="4" w:space="0" w:color="auto"/>
+        <w:insideH w:val="single" w:sz="4" w:space="0" w:color="auto"/>
+        <w:insideV w:val="single" w:sz="4" w:space="0" w:color="auto"/>
+      </w:tblBorders>
+    </w:tblPr>
+  </w:style>
 </w:styles>
 </file>
 

</xml_diff>

<commit_message>
Add OOP figure examples and PDF lesson files
Added Python examples for a simple Figure class covering perimeter and area calculations, along with the PDF generator lesson materials. The changes include the new OOP exercise files and accompanying document artifacts used in the lesson.
</commit_message>
<xml_diff>
--- a/sección 7. generador de PDF/GENERADOR DE PDF CON PYTHON.docx
+++ b/sección 7. generador de PDF/GENERADOR DE PDF CON PYTHON.docx
@@ -708,7 +708,7 @@
         </w:rPr>
         <w:lastRenderedPageBreak/>
         <w:drawing>
-          <wp:inline distT="0" distB="0" distL="0" distR="0" wp14:anchorId="0D4F5ECD" wp14:editId="67BD638B">
+          <wp:inline distT="0" distB="0" distL="0" distR="0" wp14:anchorId="0D4F5ECD" wp14:editId="39C39778">
             <wp:extent cx="5612130" cy="5160645"/>
             <wp:effectExtent l="0" t="0" r="1270" b="0"/>
             <wp:docPr id="191468368" name="Imagen 1"/>
@@ -723,7 +723,7 @@
                     <pic:cNvPicPr/>
                   </pic:nvPicPr>
                   <pic:blipFill>
-                    <a:blip r:embed="rId4" cstate="print">
+                    <a:blip r:embed="rId5" cstate="print">
                       <a:extLst>
                         <a:ext uri="{28A0092B-C50C-407E-A947-70E740481C1C}">
                           <a14:useLocalDpi xmlns:a14="http://schemas.microsoft.com/office/drawing/2010/main" val="0"/>
@@ -772,7 +772,7 @@
           <w:lang w:val="es-ES_tradnl"/>
         </w:rPr>
         <w:drawing>
-          <wp:inline distT="0" distB="0" distL="0" distR="0" wp14:anchorId="6D910479" wp14:editId="46B6A3F9">
+          <wp:inline distT="0" distB="0" distL="0" distR="0" wp14:anchorId="6D910479" wp14:editId="272B0DF7">
             <wp:extent cx="5612130" cy="2364105"/>
             <wp:effectExtent l="0" t="0" r="1270" b="0"/>
             <wp:docPr id="853063432" name="Imagen 2"/>
@@ -787,7 +787,7 @@
                     <pic:cNvPicPr/>
                   </pic:nvPicPr>
                   <pic:blipFill>
-                    <a:blip r:embed="rId5" cstate="print">
+                    <a:blip r:embed="rId6" cstate="print">
                       <a:extLst>
                         <a:ext uri="{28A0092B-C50C-407E-A947-70E740481C1C}">
                           <a14:useLocalDpi xmlns:a14="http://schemas.microsoft.com/office/drawing/2010/main" val="0"/>
@@ -861,13 +861,23 @@
         </w:rPr>
         <w:t xml:space="preserve">. </w:t>
       </w:r>
-      <w:r>
-        <w:rPr>
-          <w:rFonts w:ascii="Times New Roman" w:hAnsi="Times New Roman" w:cs="Times New Roman"/>
-          <w:color w:val="00B050"/>
-          <w:lang w:val="es-ES_tradnl"/>
-        </w:rPr>
-        <w:t xml:space="preserve">from </w:t>
+      <w:proofErr w:type="spellStart"/>
+      <w:r>
+        <w:rPr>
+          <w:rFonts w:ascii="Times New Roman" w:hAnsi="Times New Roman" w:cs="Times New Roman"/>
+          <w:color w:val="00B050"/>
+          <w:lang w:val="es-ES_tradnl"/>
+        </w:rPr>
+        <w:t>from</w:t>
+      </w:r>
+      <w:proofErr w:type="spellEnd"/>
+      <w:r>
+        <w:rPr>
+          <w:rFonts w:ascii="Times New Roman" w:hAnsi="Times New Roman" w:cs="Times New Roman"/>
+          <w:color w:val="00B050"/>
+          <w:lang w:val="es-ES_tradnl"/>
+        </w:rPr>
+        <w:t xml:space="preserve"> </w:t>
       </w:r>
       <w:proofErr w:type="spellStart"/>
       <w:r>
@@ -1352,7 +1362,7 @@
           <w:lang w:val="es-ES_tradnl"/>
         </w:rPr>
         <w:drawing>
-          <wp:inline distT="0" distB="0" distL="0" distR="0" wp14:anchorId="70776137" wp14:editId="556F42BC">
+          <wp:inline distT="0" distB="0" distL="0" distR="0" wp14:anchorId="70776137" wp14:editId="7ADA6394">
             <wp:extent cx="5612130" cy="1562735"/>
             <wp:effectExtent l="0" t="0" r="1270" b="0"/>
             <wp:docPr id="120338181" name="Imagen 3"/>
@@ -1367,7 +1377,7 @@
                     <pic:cNvPicPr/>
                   </pic:nvPicPr>
                   <pic:blipFill>
-                    <a:blip r:embed="rId6" cstate="print">
+                    <a:blip r:embed="rId7" cstate="print">
                       <a:extLst>
                         <a:ext uri="{28A0092B-C50C-407E-A947-70E740481C1C}">
                           <a14:useLocalDpi xmlns:a14="http://schemas.microsoft.com/office/drawing/2010/main" val="0"/>
@@ -1453,29 +1463,7 @@
           <w:szCs w:val="28"/>
           <w:lang w:val="es-ES_tradnl"/>
         </w:rPr>
-        <w:t xml:space="preserve"> </w:t>
-      </w:r>
-      <w:r>
-        <w:rPr>
-          <w:rFonts w:ascii="Times New Roman" w:hAnsi="Times New Roman" w:cs="Times New Roman"/>
-          <w:b/>
-          <w:bCs/>
-          <w:sz w:val="28"/>
-          <w:szCs w:val="28"/>
-          <w:lang w:val="es-ES_tradnl"/>
-        </w:rPr>
-        <w:t>2</w:t>
-      </w:r>
-      <w:r>
-        <w:rPr>
-          <w:rFonts w:ascii="Times New Roman" w:hAnsi="Times New Roman" w:cs="Times New Roman"/>
-          <w:b/>
-          <w:bCs/>
-          <w:sz w:val="28"/>
-          <w:szCs w:val="28"/>
-          <w:lang w:val="es-ES_tradnl"/>
-        </w:rPr>
-        <w:t>?</w:t>
+        <w:t xml:space="preserve"> 2?</w:t>
       </w:r>
       <w:proofErr w:type="gramEnd"/>
     </w:p>
@@ -2044,7 +2032,7 @@
         </w:rPr>
         <w:lastRenderedPageBreak/>
         <w:drawing>
-          <wp:inline distT="0" distB="0" distL="0" distR="0" wp14:anchorId="4897BCC9" wp14:editId="033A953F">
+          <wp:inline distT="0" distB="0" distL="0" distR="0" wp14:anchorId="4897BCC9" wp14:editId="172B8001">
             <wp:extent cx="5612130" cy="5207635"/>
             <wp:effectExtent l="0" t="0" r="1270" b="0"/>
             <wp:docPr id="357420074" name="Imagen 4"/>
@@ -2059,7 +2047,7 @@
                     <pic:cNvPicPr/>
                   </pic:nvPicPr>
                   <pic:blipFill>
-                    <a:blip r:embed="rId7" cstate="print">
+                    <a:blip r:embed="rId8" cstate="print">
                       <a:extLst>
                         <a:ext uri="{28A0092B-C50C-407E-A947-70E740481C1C}">
                           <a14:useLocalDpi xmlns:a14="http://schemas.microsoft.com/office/drawing/2010/main" val="0"/>
@@ -2120,7 +2108,7 @@
           <w:lang w:val="es-ES_tradnl"/>
         </w:rPr>
         <w:drawing>
-          <wp:inline distT="0" distB="0" distL="0" distR="0" wp14:anchorId="2532AEE5" wp14:editId="78FC544A">
+          <wp:inline distT="0" distB="0" distL="0" distR="0" wp14:anchorId="2532AEE5" wp14:editId="3CAB6AC3">
             <wp:extent cx="5612130" cy="2388870"/>
             <wp:effectExtent l="0" t="0" r="1270" b="0"/>
             <wp:docPr id="270501364" name="Imagen 5"/>
@@ -2135,7 +2123,7 @@
                     <pic:cNvPicPr/>
                   </pic:nvPicPr>
                   <pic:blipFill>
-                    <a:blip r:embed="rId8" cstate="print">
+                    <a:blip r:embed="rId9" cstate="print">
                       <a:extLst>
                         <a:ext uri="{28A0092B-C50C-407E-A947-70E740481C1C}">
                           <a14:useLocalDpi xmlns:a14="http://schemas.microsoft.com/office/drawing/2010/main" val="0"/>
@@ -2315,7 +2303,7 @@
           <w:lang w:val="es-ES_tradnl"/>
         </w:rPr>
         <w:drawing>
-          <wp:inline distT="0" distB="0" distL="0" distR="0" wp14:anchorId="05B0CFF2" wp14:editId="2E2D830F">
+          <wp:inline distT="0" distB="0" distL="0" distR="0" wp14:anchorId="05B0CFF2" wp14:editId="02EC41F8">
             <wp:extent cx="5612130" cy="3714115"/>
             <wp:effectExtent l="0" t="0" r="1270" b="0"/>
             <wp:docPr id="54054877" name="Imagen 6"/>
@@ -2330,7 +2318,7 @@
                     <pic:cNvPicPr/>
                   </pic:nvPicPr>
                   <pic:blipFill>
-                    <a:blip r:embed="rId9" cstate="print">
+                    <a:blip r:embed="rId10" cstate="print">
                       <a:extLst>
                         <a:ext uri="{28A0092B-C50C-407E-A947-70E740481C1C}">
                           <a14:useLocalDpi xmlns:a14="http://schemas.microsoft.com/office/drawing/2010/main" val="0"/>
@@ -2386,7 +2374,7 @@
           <w:lang w:val="es-ES_tradnl"/>
         </w:rPr>
         <w:drawing>
-          <wp:inline distT="0" distB="0" distL="0" distR="0" wp14:anchorId="2B396D72" wp14:editId="6B314419">
+          <wp:inline distT="0" distB="0" distL="0" distR="0" wp14:anchorId="2B396D72" wp14:editId="271C4769">
             <wp:extent cx="5612130" cy="901065"/>
             <wp:effectExtent l="0" t="0" r="1270" b="635"/>
             <wp:docPr id="196881579" name="Imagen 7"/>
@@ -2401,7 +2389,7 @@
                     <pic:cNvPicPr/>
                   </pic:nvPicPr>
                   <pic:blipFill>
-                    <a:blip r:embed="rId10" cstate="print">
+                    <a:blip r:embed="rId11" cstate="print">
                       <a:extLst>
                         <a:ext uri="{28A0092B-C50C-407E-A947-70E740481C1C}">
                           <a14:useLocalDpi xmlns:a14="http://schemas.microsoft.com/office/drawing/2010/main" val="0"/>
@@ -2442,7 +2430,7 @@
           <w:lang w:val="es-ES_tradnl"/>
         </w:rPr>
         <w:drawing>
-          <wp:inline distT="0" distB="0" distL="0" distR="0" wp14:anchorId="079F05B9" wp14:editId="2F590E70">
+          <wp:inline distT="0" distB="0" distL="0" distR="0" wp14:anchorId="079F05B9" wp14:editId="1AB4DA02">
             <wp:extent cx="5612130" cy="1397635"/>
             <wp:effectExtent l="0" t="0" r="1270" b="0"/>
             <wp:docPr id="261341556" name="Imagen 8"/>
@@ -2457,7 +2445,7 @@
                     <pic:cNvPicPr/>
                   </pic:nvPicPr>
                   <pic:blipFill>
-                    <a:blip r:embed="rId11" cstate="print">
+                    <a:blip r:embed="rId12" cstate="print">
                       <a:extLst>
                         <a:ext uri="{28A0092B-C50C-407E-A947-70E740481C1C}">
                           <a14:useLocalDpi xmlns:a14="http://schemas.microsoft.com/office/drawing/2010/main" val="0"/>
@@ -2491,6 +2479,2616 @@
           <w:lang w:val="es-ES_tradnl"/>
         </w:rPr>
       </w:pPr>
+      <w:r>
+        <w:rPr>
+          <w:rFonts w:ascii="Times New Roman" w:hAnsi="Times New Roman" w:cs="Times New Roman"/>
+          <w:lang w:val="es-ES_tradnl"/>
+        </w:rPr>
+        <w:lastRenderedPageBreak/>
+        <w:t>Haremos que el programa lea un documento de Excel donde guardamos los nombres de los alumnos y el curso y genere los PDF a partir de dicho documento.</w:t>
+      </w:r>
+    </w:p>
+    <w:p>
+      <w:pPr>
+        <w:rPr>
+          <w:rFonts w:ascii="Times New Roman" w:hAnsi="Times New Roman" w:cs="Times New Roman"/>
+          <w:lang w:val="es-ES_tradnl"/>
+        </w:rPr>
+      </w:pPr>
+      <w:r>
+        <w:rPr>
+          <w:rFonts w:ascii="Times New Roman" w:hAnsi="Times New Roman" w:cs="Times New Roman"/>
+          <w:noProof/>
+          <w:lang w:val="es-ES_tradnl"/>
+        </w:rPr>
+        <w:drawing>
+          <wp:inline distT="0" distB="0" distL="0" distR="0" wp14:anchorId="03BAA9DA" wp14:editId="4F0F5821">
+            <wp:extent cx="5612130" cy="3299460"/>
+            <wp:effectExtent l="0" t="0" r="1270" b="2540"/>
+            <wp:docPr id="624140836" name="Imagen 1"/>
+            <wp:cNvGraphicFramePr>
+              <a:graphicFrameLocks xmlns:a="http://schemas.openxmlformats.org/drawingml/2006/main" noChangeAspect="1"/>
+            </wp:cNvGraphicFramePr>
+            <a:graphic xmlns:a="http://schemas.openxmlformats.org/drawingml/2006/main">
+              <a:graphicData uri="http://schemas.openxmlformats.org/drawingml/2006/picture">
+                <pic:pic xmlns:pic="http://schemas.openxmlformats.org/drawingml/2006/picture">
+                  <pic:nvPicPr>
+                    <pic:cNvPr id="624140836" name="Imagen 624140836"/>
+                    <pic:cNvPicPr/>
+                  </pic:nvPicPr>
+                  <pic:blipFill>
+                    <a:blip r:embed="rId13" cstate="print">
+                      <a:extLst>
+                        <a:ext uri="{28A0092B-C50C-407E-A947-70E740481C1C}">
+                          <a14:useLocalDpi xmlns:a14="http://schemas.microsoft.com/office/drawing/2010/main" val="0"/>
+                        </a:ext>
+                      </a:extLst>
+                    </a:blip>
+                    <a:stretch>
+                      <a:fillRect/>
+                    </a:stretch>
+                  </pic:blipFill>
+                  <pic:spPr>
+                    <a:xfrm>
+                      <a:off x="0" y="0"/>
+                      <a:ext cx="5612130" cy="3299460"/>
+                    </a:xfrm>
+                    <a:prstGeom prst="rect">
+                      <a:avLst/>
+                    </a:prstGeom>
+                  </pic:spPr>
+                </pic:pic>
+              </a:graphicData>
+            </a:graphic>
+          </wp:inline>
+        </w:drawing>
+      </w:r>
+    </w:p>
+    <w:p>
+      <w:pPr>
+        <w:rPr>
+          <w:rFonts w:ascii="Times New Roman" w:hAnsi="Times New Roman" w:cs="Times New Roman"/>
+          <w:lang w:val="es-ES_tradnl"/>
+        </w:rPr>
+      </w:pPr>
+      <w:r>
+        <w:rPr>
+          <w:rFonts w:ascii="Times New Roman" w:hAnsi="Times New Roman" w:cs="Times New Roman"/>
+          <w:noProof/>
+          <w:lang w:val="es-ES_tradnl"/>
+        </w:rPr>
+        <w:drawing>
+          <wp:inline distT="0" distB="0" distL="0" distR="0" wp14:anchorId="5291269A" wp14:editId="0BCCE8E5">
+            <wp:extent cx="5612130" cy="1990725"/>
+            <wp:effectExtent l="0" t="0" r="1270" b="3175"/>
+            <wp:docPr id="1938462475" name="Imagen 2"/>
+            <wp:cNvGraphicFramePr>
+              <a:graphicFrameLocks xmlns:a="http://schemas.openxmlformats.org/drawingml/2006/main" noChangeAspect="1"/>
+            </wp:cNvGraphicFramePr>
+            <a:graphic xmlns:a="http://schemas.openxmlformats.org/drawingml/2006/main">
+              <a:graphicData uri="http://schemas.openxmlformats.org/drawingml/2006/picture">
+                <pic:pic xmlns:pic="http://schemas.openxmlformats.org/drawingml/2006/picture">
+                  <pic:nvPicPr>
+                    <pic:cNvPr id="1938462475" name="Imagen 1938462475"/>
+                    <pic:cNvPicPr/>
+                  </pic:nvPicPr>
+                  <pic:blipFill>
+                    <a:blip r:embed="rId14" cstate="print">
+                      <a:extLst>
+                        <a:ext uri="{28A0092B-C50C-407E-A947-70E740481C1C}">
+                          <a14:useLocalDpi xmlns:a14="http://schemas.microsoft.com/office/drawing/2010/main" val="0"/>
+                        </a:ext>
+                      </a:extLst>
+                    </a:blip>
+                    <a:stretch>
+                      <a:fillRect/>
+                    </a:stretch>
+                  </pic:blipFill>
+                  <pic:spPr>
+                    <a:xfrm>
+                      <a:off x="0" y="0"/>
+                      <a:ext cx="5612130" cy="1990725"/>
+                    </a:xfrm>
+                    <a:prstGeom prst="rect">
+                      <a:avLst/>
+                    </a:prstGeom>
+                  </pic:spPr>
+                </pic:pic>
+              </a:graphicData>
+            </a:graphic>
+          </wp:inline>
+        </w:drawing>
+      </w:r>
+    </w:p>
+    <w:p>
+      <w:pPr>
+        <w:rPr>
+          <w:rFonts w:ascii="Times New Roman" w:hAnsi="Times New Roman" w:cs="Times New Roman"/>
+          <w:lang w:val="es-ES_tradnl"/>
+        </w:rPr>
+      </w:pPr>
+      <w:r>
+        <w:rPr>
+          <w:rFonts w:ascii="Times New Roman" w:hAnsi="Times New Roman" w:cs="Times New Roman"/>
+          <w:noProof/>
+          <w:lang w:val="es-ES_tradnl"/>
+        </w:rPr>
+        <w:lastRenderedPageBreak/>
+        <w:drawing>
+          <wp:inline distT="0" distB="0" distL="0" distR="0" wp14:anchorId="29465941" wp14:editId="23263506">
+            <wp:extent cx="5612130" cy="4430395"/>
+            <wp:effectExtent l="0" t="0" r="1270" b="1905"/>
+            <wp:docPr id="1667983078" name="Imagen 3"/>
+            <wp:cNvGraphicFramePr>
+              <a:graphicFrameLocks xmlns:a="http://schemas.openxmlformats.org/drawingml/2006/main" noChangeAspect="1"/>
+            </wp:cNvGraphicFramePr>
+            <a:graphic xmlns:a="http://schemas.openxmlformats.org/drawingml/2006/main">
+              <a:graphicData uri="http://schemas.openxmlformats.org/drawingml/2006/picture">
+                <pic:pic xmlns:pic="http://schemas.openxmlformats.org/drawingml/2006/picture">
+                  <pic:nvPicPr>
+                    <pic:cNvPr id="1667983078" name="Imagen 1667983078"/>
+                    <pic:cNvPicPr/>
+                  </pic:nvPicPr>
+                  <pic:blipFill>
+                    <a:blip r:embed="rId15" cstate="print">
+                      <a:extLst>
+                        <a:ext uri="{28A0092B-C50C-407E-A947-70E740481C1C}">
+                          <a14:useLocalDpi xmlns:a14="http://schemas.microsoft.com/office/drawing/2010/main" val="0"/>
+                        </a:ext>
+                      </a:extLst>
+                    </a:blip>
+                    <a:stretch>
+                      <a:fillRect/>
+                    </a:stretch>
+                  </pic:blipFill>
+                  <pic:spPr>
+                    <a:xfrm>
+                      <a:off x="0" y="0"/>
+                      <a:ext cx="5612130" cy="4430395"/>
+                    </a:xfrm>
+                    <a:prstGeom prst="rect">
+                      <a:avLst/>
+                    </a:prstGeom>
+                  </pic:spPr>
+                </pic:pic>
+              </a:graphicData>
+            </a:graphic>
+          </wp:inline>
+        </w:drawing>
+      </w:r>
+    </w:p>
+    <w:p>
+      <w:pPr>
+        <w:rPr>
+          <w:rFonts w:ascii="Times New Roman" w:hAnsi="Times New Roman" w:cs="Times New Roman"/>
+          <w:lang w:val="es-ES_tradnl"/>
+        </w:rPr>
+      </w:pPr>
+      <w:r>
+        <w:rPr>
+          <w:rFonts w:ascii="Times New Roman" w:hAnsi="Times New Roman" w:cs="Times New Roman"/>
+          <w:noProof/>
+          <w:lang w:val="es-ES_tradnl"/>
+        </w:rPr>
+        <w:drawing>
+          <wp:inline distT="0" distB="0" distL="0" distR="0" wp14:anchorId="0913582A" wp14:editId="43656025">
+            <wp:extent cx="5612130" cy="2483485"/>
+            <wp:effectExtent l="0" t="0" r="1270" b="5715"/>
+            <wp:docPr id="1137248379" name="Imagen 4"/>
+            <wp:cNvGraphicFramePr>
+              <a:graphicFrameLocks xmlns:a="http://schemas.openxmlformats.org/drawingml/2006/main" noChangeAspect="1"/>
+            </wp:cNvGraphicFramePr>
+            <a:graphic xmlns:a="http://schemas.openxmlformats.org/drawingml/2006/main">
+              <a:graphicData uri="http://schemas.openxmlformats.org/drawingml/2006/picture">
+                <pic:pic xmlns:pic="http://schemas.openxmlformats.org/drawingml/2006/picture">
+                  <pic:nvPicPr>
+                    <pic:cNvPr id="1137248379" name="Imagen 1137248379"/>
+                    <pic:cNvPicPr/>
+                  </pic:nvPicPr>
+                  <pic:blipFill>
+                    <a:blip r:embed="rId16" cstate="print">
+                      <a:extLst>
+                        <a:ext uri="{28A0092B-C50C-407E-A947-70E740481C1C}">
+                          <a14:useLocalDpi xmlns:a14="http://schemas.microsoft.com/office/drawing/2010/main" val="0"/>
+                        </a:ext>
+                      </a:extLst>
+                    </a:blip>
+                    <a:stretch>
+                      <a:fillRect/>
+                    </a:stretch>
+                  </pic:blipFill>
+                  <pic:spPr>
+                    <a:xfrm>
+                      <a:off x="0" y="0"/>
+                      <a:ext cx="5612130" cy="2483485"/>
+                    </a:xfrm>
+                    <a:prstGeom prst="rect">
+                      <a:avLst/>
+                    </a:prstGeom>
+                  </pic:spPr>
+                </pic:pic>
+              </a:graphicData>
+            </a:graphic>
+          </wp:inline>
+        </w:drawing>
+      </w:r>
+    </w:p>
+    <w:p>
+      <w:pPr>
+        <w:rPr>
+          <w:rFonts w:ascii="Times New Roman" w:hAnsi="Times New Roman" w:cs="Times New Roman"/>
+          <w:lang w:val="es-ES_tradnl"/>
+        </w:rPr>
+      </w:pPr>
+      <w:r>
+        <w:rPr>
+          <w:rFonts w:ascii="Times New Roman" w:hAnsi="Times New Roman" w:cs="Times New Roman"/>
+          <w:noProof/>
+          <w:lang w:val="es-ES_tradnl"/>
+        </w:rPr>
+        <w:lastRenderedPageBreak/>
+        <w:drawing>
+          <wp:inline distT="0" distB="0" distL="0" distR="0" wp14:anchorId="068DD356" wp14:editId="310753CF">
+            <wp:extent cx="5612130" cy="4574540"/>
+            <wp:effectExtent l="0" t="0" r="1270" b="0"/>
+            <wp:docPr id="1111553644" name="Imagen 5"/>
+            <wp:cNvGraphicFramePr>
+              <a:graphicFrameLocks xmlns:a="http://schemas.openxmlformats.org/drawingml/2006/main" noChangeAspect="1"/>
+            </wp:cNvGraphicFramePr>
+            <a:graphic xmlns:a="http://schemas.openxmlformats.org/drawingml/2006/main">
+              <a:graphicData uri="http://schemas.openxmlformats.org/drawingml/2006/picture">
+                <pic:pic xmlns:pic="http://schemas.openxmlformats.org/drawingml/2006/picture">
+                  <pic:nvPicPr>
+                    <pic:cNvPr id="1111553644" name="Imagen 1111553644"/>
+                    <pic:cNvPicPr/>
+                  </pic:nvPicPr>
+                  <pic:blipFill>
+                    <a:blip r:embed="rId17">
+                      <a:extLst>
+                        <a:ext uri="{28A0092B-C50C-407E-A947-70E740481C1C}">
+                          <a14:useLocalDpi xmlns:a14="http://schemas.microsoft.com/office/drawing/2010/main" val="0"/>
+                        </a:ext>
+                      </a:extLst>
+                    </a:blip>
+                    <a:stretch>
+                      <a:fillRect/>
+                    </a:stretch>
+                  </pic:blipFill>
+                  <pic:spPr>
+                    <a:xfrm>
+                      <a:off x="0" y="0"/>
+                      <a:ext cx="5612130" cy="4574540"/>
+                    </a:xfrm>
+                    <a:prstGeom prst="rect">
+                      <a:avLst/>
+                    </a:prstGeom>
+                  </pic:spPr>
+                </pic:pic>
+              </a:graphicData>
+            </a:graphic>
+          </wp:inline>
+        </w:drawing>
+      </w:r>
+    </w:p>
+    <w:p>
+      <w:pPr>
+        <w:rPr>
+          <w:rFonts w:ascii="Times New Roman" w:hAnsi="Times New Roman" w:cs="Times New Roman"/>
+          <w:lang w:val="es-ES_tradnl"/>
+        </w:rPr>
+      </w:pPr>
+    </w:p>
+    <w:p>
+      <w:pPr>
+        <w:rPr>
+          <w:rFonts w:ascii="Times New Roman" w:hAnsi="Times New Roman" w:cs="Times New Roman"/>
+          <w:lang w:val="es-ES_tradnl"/>
+        </w:rPr>
+      </w:pPr>
+      <w:r>
+        <w:rPr>
+          <w:rFonts w:ascii="Times New Roman" w:hAnsi="Times New Roman" w:cs="Times New Roman"/>
+          <w:noProof/>
+          <w:lang w:val="es-ES_tradnl"/>
+        </w:rPr>
+        <w:drawing>
+          <wp:inline distT="0" distB="0" distL="0" distR="0" wp14:anchorId="4A90D7BD" wp14:editId="4EE8DABE">
+            <wp:extent cx="5612130" cy="2542540"/>
+            <wp:effectExtent l="0" t="0" r="1270" b="0"/>
+            <wp:docPr id="296360368" name="Imagen 6"/>
+            <wp:cNvGraphicFramePr>
+              <a:graphicFrameLocks xmlns:a="http://schemas.openxmlformats.org/drawingml/2006/main" noChangeAspect="1"/>
+            </wp:cNvGraphicFramePr>
+            <a:graphic xmlns:a="http://schemas.openxmlformats.org/drawingml/2006/main">
+              <a:graphicData uri="http://schemas.openxmlformats.org/drawingml/2006/picture">
+                <pic:pic xmlns:pic="http://schemas.openxmlformats.org/drawingml/2006/picture">
+                  <pic:nvPicPr>
+                    <pic:cNvPr id="296360368" name="Imagen 296360368"/>
+                    <pic:cNvPicPr/>
+                  </pic:nvPicPr>
+                  <pic:blipFill>
+                    <a:blip r:embed="rId18">
+                      <a:extLst>
+                        <a:ext uri="{28A0092B-C50C-407E-A947-70E740481C1C}">
+                          <a14:useLocalDpi xmlns:a14="http://schemas.microsoft.com/office/drawing/2010/main" val="0"/>
+                        </a:ext>
+                      </a:extLst>
+                    </a:blip>
+                    <a:stretch>
+                      <a:fillRect/>
+                    </a:stretch>
+                  </pic:blipFill>
+                  <pic:spPr>
+                    <a:xfrm>
+                      <a:off x="0" y="0"/>
+                      <a:ext cx="5612130" cy="2542540"/>
+                    </a:xfrm>
+                    <a:prstGeom prst="rect">
+                      <a:avLst/>
+                    </a:prstGeom>
+                  </pic:spPr>
+                </pic:pic>
+              </a:graphicData>
+            </a:graphic>
+          </wp:inline>
+        </w:drawing>
+      </w:r>
+    </w:p>
+    <w:p>
+      <w:pPr>
+        <w:rPr>
+          <w:rFonts w:ascii="Times New Roman" w:hAnsi="Times New Roman" w:cs="Times New Roman"/>
+          <w:lang w:val="es-ES_tradnl"/>
+        </w:rPr>
+      </w:pPr>
+    </w:p>
+    <w:p>
+      <w:pPr>
+        <w:rPr>
+          <w:rFonts w:ascii="Times New Roman" w:hAnsi="Times New Roman" w:cs="Times New Roman"/>
+          <w:lang w:val="es-ES_tradnl"/>
+        </w:rPr>
+      </w:pPr>
+      <w:r>
+        <w:rPr>
+          <w:rFonts w:ascii="Times New Roman" w:hAnsi="Times New Roman" w:cs="Times New Roman"/>
+          <w:noProof/>
+          <w:lang w:val="es-ES_tradnl"/>
+        </w:rPr>
+        <w:lastRenderedPageBreak/>
+        <w:drawing>
+          <wp:inline distT="0" distB="0" distL="0" distR="0" wp14:anchorId="60CF5DE9" wp14:editId="06DAC6BB">
+            <wp:extent cx="5612130" cy="4017010"/>
+            <wp:effectExtent l="0" t="0" r="1270" b="0"/>
+            <wp:docPr id="1275008643" name="Imagen 7"/>
+            <wp:cNvGraphicFramePr>
+              <a:graphicFrameLocks xmlns:a="http://schemas.openxmlformats.org/drawingml/2006/main" noChangeAspect="1"/>
+            </wp:cNvGraphicFramePr>
+            <a:graphic xmlns:a="http://schemas.openxmlformats.org/drawingml/2006/main">
+              <a:graphicData uri="http://schemas.openxmlformats.org/drawingml/2006/picture">
+                <pic:pic xmlns:pic="http://schemas.openxmlformats.org/drawingml/2006/picture">
+                  <pic:nvPicPr>
+                    <pic:cNvPr id="1275008643" name="Imagen 1275008643"/>
+                    <pic:cNvPicPr/>
+                  </pic:nvPicPr>
+                  <pic:blipFill>
+                    <a:blip r:embed="rId19">
+                      <a:extLst>
+                        <a:ext uri="{28A0092B-C50C-407E-A947-70E740481C1C}">
+                          <a14:useLocalDpi xmlns:a14="http://schemas.microsoft.com/office/drawing/2010/main" val="0"/>
+                        </a:ext>
+                      </a:extLst>
+                    </a:blip>
+                    <a:stretch>
+                      <a:fillRect/>
+                    </a:stretch>
+                  </pic:blipFill>
+                  <pic:spPr>
+                    <a:xfrm>
+                      <a:off x="0" y="0"/>
+                      <a:ext cx="5612130" cy="4017010"/>
+                    </a:xfrm>
+                    <a:prstGeom prst="rect">
+                      <a:avLst/>
+                    </a:prstGeom>
+                  </pic:spPr>
+                </pic:pic>
+              </a:graphicData>
+            </a:graphic>
+          </wp:inline>
+        </w:drawing>
+      </w:r>
+    </w:p>
+    <w:p>
+      <w:pPr>
+        <w:rPr>
+          <w:rFonts w:ascii="Times New Roman" w:hAnsi="Times New Roman" w:cs="Times New Roman"/>
+          <w:lang w:val="es-ES_tradnl"/>
+        </w:rPr>
+      </w:pPr>
+    </w:p>
+    <w:p>
+      <w:pPr>
+        <w:rPr>
+          <w:rFonts w:ascii="Times New Roman" w:hAnsi="Times New Roman" w:cs="Times New Roman"/>
+          <w:lang w:val="es-ES_tradnl"/>
+        </w:rPr>
+      </w:pPr>
+      <w:r>
+        <w:rPr>
+          <w:rFonts w:ascii="Times New Roman" w:hAnsi="Times New Roman" w:cs="Times New Roman"/>
+          <w:lang w:val="es-ES_tradnl"/>
+        </w:rPr>
+        <w:t>Este documento lo que hace es leer el Excel y generar certificados PDF para los alumnos que están allí reportados.</w:t>
+      </w:r>
+    </w:p>
+    <w:p>
+      <w:pPr>
+        <w:rPr>
+          <w:rFonts w:ascii="Times New Roman" w:hAnsi="Times New Roman" w:cs="Times New Roman"/>
+          <w:lang w:val="es-ES_tradnl"/>
+        </w:rPr>
+      </w:pPr>
+      <w:r>
+        <w:rPr>
+          <w:rFonts w:ascii="Times New Roman" w:hAnsi="Times New Roman" w:cs="Times New Roman"/>
+          <w:lang w:val="es-ES_tradnl"/>
+        </w:rPr>
+        <w:t xml:space="preserve">Lo primero es importar las librerías necesarias. </w:t>
+      </w:r>
+    </w:p>
+    <w:p>
+      <w:pPr>
+        <w:rPr>
+          <w:rFonts w:ascii="Times New Roman" w:hAnsi="Times New Roman" w:cs="Times New Roman"/>
+          <w:lang w:val="es-ES_tradnl"/>
+        </w:rPr>
+      </w:pPr>
+      <w:proofErr w:type="spellStart"/>
+      <w:r>
+        <w:rPr>
+          <w:rFonts w:ascii="Times New Roman" w:hAnsi="Times New Roman" w:cs="Times New Roman"/>
+          <w:color w:val="00B050"/>
+          <w:lang w:val="es-ES_tradnl"/>
+        </w:rPr>
+        <w:t>from</w:t>
+      </w:r>
+      <w:proofErr w:type="spellEnd"/>
+      <w:r>
+        <w:rPr>
+          <w:rFonts w:ascii="Times New Roman" w:hAnsi="Times New Roman" w:cs="Times New Roman"/>
+          <w:color w:val="00B050"/>
+          <w:lang w:val="es-ES_tradnl"/>
+        </w:rPr>
+        <w:t xml:space="preserve"> </w:t>
+      </w:r>
+      <w:proofErr w:type="spellStart"/>
+      <w:r>
+        <w:rPr>
+          <w:rFonts w:ascii="Times New Roman" w:hAnsi="Times New Roman" w:cs="Times New Roman"/>
+          <w:color w:val="00B050"/>
+          <w:lang w:val="es-ES_tradnl"/>
+        </w:rPr>
+        <w:t>pathlib</w:t>
+      </w:r>
+      <w:proofErr w:type="spellEnd"/>
+      <w:r>
+        <w:rPr>
+          <w:rFonts w:ascii="Times New Roman" w:hAnsi="Times New Roman" w:cs="Times New Roman"/>
+          <w:color w:val="00B050"/>
+          <w:lang w:val="es-ES_tradnl"/>
+        </w:rPr>
+        <w:t xml:space="preserve"> </w:t>
+      </w:r>
+      <w:proofErr w:type="spellStart"/>
+      <w:r>
+        <w:rPr>
+          <w:rFonts w:ascii="Times New Roman" w:hAnsi="Times New Roman" w:cs="Times New Roman"/>
+          <w:color w:val="00B050"/>
+          <w:lang w:val="es-ES_tradnl"/>
+        </w:rPr>
+        <w:t>import</w:t>
+      </w:r>
+      <w:proofErr w:type="spellEnd"/>
+      <w:r>
+        <w:rPr>
+          <w:rFonts w:ascii="Times New Roman" w:hAnsi="Times New Roman" w:cs="Times New Roman"/>
+          <w:color w:val="00B050"/>
+          <w:lang w:val="es-ES_tradnl"/>
+        </w:rPr>
+        <w:t xml:space="preserve"> PATH </w:t>
+      </w:r>
+      <w:r>
+        <w:rPr>
+          <w:rFonts w:ascii="Times New Roman" w:hAnsi="Times New Roman" w:cs="Times New Roman"/>
+          <w:lang w:val="es-ES_tradnl"/>
+        </w:rPr>
+        <w:t xml:space="preserve"> </w:t>
+      </w:r>
+      <w:r>
+        <w:rPr>
+          <w:rFonts w:ascii="Times New Roman" w:hAnsi="Times New Roman" w:cs="Times New Roman"/>
+          <w:lang w:val="es-ES_tradnl"/>
+        </w:rPr>
+        <w:t xml:space="preserve"> </w:t>
+      </w:r>
+      <w:r>
+        <w:rPr>
+          <w:rFonts w:ascii="Times New Roman" w:hAnsi="Times New Roman" w:cs="Times New Roman"/>
+          <w:lang w:val="es-ES_tradnl"/>
+        </w:rPr>
+        <w:t>sirve para armar rutas de carpetas y archivos de forma segura</w:t>
+      </w:r>
+    </w:p>
+    <w:p>
+      <w:pPr>
+        <w:rPr>
+          <w:rFonts w:ascii="Times New Roman" w:hAnsi="Times New Roman" w:cs="Times New Roman"/>
+          <w:lang w:val="es-ES_tradnl"/>
+        </w:rPr>
+      </w:pPr>
+      <w:proofErr w:type="spellStart"/>
+      <w:r>
+        <w:rPr>
+          <w:rFonts w:ascii="Times New Roman" w:hAnsi="Times New Roman" w:cs="Times New Roman"/>
+          <w:color w:val="00B050"/>
+          <w:lang w:val="es-ES_tradnl"/>
+        </w:rPr>
+        <w:t>from</w:t>
+      </w:r>
+      <w:proofErr w:type="spellEnd"/>
+      <w:r>
+        <w:rPr>
+          <w:rFonts w:ascii="Times New Roman" w:hAnsi="Times New Roman" w:cs="Times New Roman"/>
+          <w:color w:val="00B050"/>
+          <w:lang w:val="es-ES_tradnl"/>
+        </w:rPr>
+        <w:t xml:space="preserve"> </w:t>
+      </w:r>
+      <w:proofErr w:type="spellStart"/>
+      <w:r>
+        <w:rPr>
+          <w:rFonts w:ascii="Times New Roman" w:hAnsi="Times New Roman" w:cs="Times New Roman"/>
+          <w:color w:val="00B050"/>
+          <w:lang w:val="es-ES_tradnl"/>
+        </w:rPr>
+        <w:t>fpdf</w:t>
+      </w:r>
+      <w:proofErr w:type="spellEnd"/>
+      <w:r>
+        <w:rPr>
+          <w:rFonts w:ascii="Times New Roman" w:hAnsi="Times New Roman" w:cs="Times New Roman"/>
+          <w:color w:val="00B050"/>
+          <w:lang w:val="es-ES_tradnl"/>
+        </w:rPr>
+        <w:t xml:space="preserve"> </w:t>
+      </w:r>
+      <w:proofErr w:type="spellStart"/>
+      <w:r>
+        <w:rPr>
+          <w:rFonts w:ascii="Times New Roman" w:hAnsi="Times New Roman" w:cs="Times New Roman"/>
+          <w:color w:val="00B050"/>
+          <w:lang w:val="es-ES_tradnl"/>
+        </w:rPr>
+        <w:t>import</w:t>
+      </w:r>
+      <w:proofErr w:type="spellEnd"/>
+      <w:r>
+        <w:rPr>
+          <w:rFonts w:ascii="Times New Roman" w:hAnsi="Times New Roman" w:cs="Times New Roman"/>
+          <w:color w:val="00B050"/>
+          <w:lang w:val="es-ES_tradnl"/>
+        </w:rPr>
+        <w:t xml:space="preserve"> FPDF</w:t>
+      </w:r>
+      <w:r>
+        <w:rPr>
+          <w:rFonts w:ascii="Times New Roman" w:hAnsi="Times New Roman" w:cs="Times New Roman"/>
+          <w:lang w:val="es-ES_tradnl"/>
+        </w:rPr>
+        <w:t xml:space="preserve"> es el constructor de </w:t>
+      </w:r>
+      <w:proofErr w:type="spellStart"/>
+      <w:r>
+        <w:rPr>
+          <w:rFonts w:ascii="Times New Roman" w:hAnsi="Times New Roman" w:cs="Times New Roman"/>
+          <w:lang w:val="es-ES_tradnl"/>
+        </w:rPr>
+        <w:t>PDFs</w:t>
+      </w:r>
+      <w:proofErr w:type="spellEnd"/>
+    </w:p>
+    <w:p>
+      <w:pPr>
+        <w:rPr>
+          <w:rFonts w:ascii="Times New Roman" w:hAnsi="Times New Roman" w:cs="Times New Roman"/>
+          <w:lang w:val="es-ES_tradnl"/>
+        </w:rPr>
+      </w:pPr>
+      <w:proofErr w:type="spellStart"/>
+      <w:r>
+        <w:rPr>
+          <w:rFonts w:ascii="Times New Roman" w:hAnsi="Times New Roman" w:cs="Times New Roman"/>
+          <w:color w:val="00B050"/>
+          <w:lang w:val="es-ES_tradnl"/>
+        </w:rPr>
+        <w:t>from</w:t>
+      </w:r>
+      <w:proofErr w:type="spellEnd"/>
+      <w:r>
+        <w:rPr>
+          <w:rFonts w:ascii="Times New Roman" w:hAnsi="Times New Roman" w:cs="Times New Roman"/>
+          <w:color w:val="00B050"/>
+          <w:lang w:val="es-ES_tradnl"/>
+        </w:rPr>
+        <w:t xml:space="preserve"> </w:t>
+      </w:r>
+      <w:proofErr w:type="spellStart"/>
+      <w:r>
+        <w:rPr>
+          <w:rFonts w:ascii="Times New Roman" w:hAnsi="Times New Roman" w:cs="Times New Roman"/>
+          <w:color w:val="00B050"/>
+          <w:lang w:val="es-ES_tradnl"/>
+        </w:rPr>
+        <w:t>openpyxl</w:t>
+      </w:r>
+      <w:proofErr w:type="spellEnd"/>
+      <w:r>
+        <w:rPr>
+          <w:rFonts w:ascii="Times New Roman" w:hAnsi="Times New Roman" w:cs="Times New Roman"/>
+          <w:color w:val="00B050"/>
+          <w:lang w:val="es-ES_tradnl"/>
+        </w:rPr>
+        <w:t xml:space="preserve"> </w:t>
+      </w:r>
+      <w:proofErr w:type="spellStart"/>
+      <w:r>
+        <w:rPr>
+          <w:rFonts w:ascii="Times New Roman" w:hAnsi="Times New Roman" w:cs="Times New Roman"/>
+          <w:color w:val="00B050"/>
+          <w:lang w:val="es-ES_tradnl"/>
+        </w:rPr>
+        <w:t>import</w:t>
+      </w:r>
+      <w:proofErr w:type="spellEnd"/>
+      <w:r>
+        <w:rPr>
+          <w:rFonts w:ascii="Times New Roman" w:hAnsi="Times New Roman" w:cs="Times New Roman"/>
+          <w:color w:val="00B050"/>
+          <w:lang w:val="es-ES_tradnl"/>
+        </w:rPr>
+        <w:t xml:space="preserve"> </w:t>
+      </w:r>
+      <w:proofErr w:type="spellStart"/>
+      <w:r>
+        <w:rPr>
+          <w:rFonts w:ascii="Times New Roman" w:hAnsi="Times New Roman" w:cs="Times New Roman"/>
+          <w:color w:val="00B050"/>
+          <w:lang w:val="es-ES_tradnl"/>
+        </w:rPr>
+        <w:t>load_workbook</w:t>
+      </w:r>
+      <w:proofErr w:type="spellEnd"/>
+      <w:r>
+        <w:rPr>
+          <w:rFonts w:ascii="Times New Roman" w:hAnsi="Times New Roman" w:cs="Times New Roman"/>
+          <w:color w:val="00B050"/>
+          <w:lang w:val="es-ES_tradnl"/>
+        </w:rPr>
+        <w:t xml:space="preserve"> </w:t>
+      </w:r>
+      <w:r>
+        <w:rPr>
+          <w:rFonts w:ascii="Times New Roman" w:hAnsi="Times New Roman" w:cs="Times New Roman"/>
+          <w:lang w:val="es-ES_tradnl"/>
+        </w:rPr>
+        <w:t>sirve para abrir el Excel y leer sus celdas</w:t>
+      </w:r>
+    </w:p>
+    <w:p>
+      <w:pPr>
+        <w:rPr>
+          <w:rFonts w:ascii="Times New Roman" w:hAnsi="Times New Roman" w:cs="Times New Roman"/>
+          <w:lang w:val="es-ES_tradnl"/>
+        </w:rPr>
+      </w:pPr>
+      <w:r>
+        <w:rPr>
+          <w:rFonts w:ascii="Times New Roman" w:hAnsi="Times New Roman" w:cs="Times New Roman"/>
+          <w:lang w:val="es-ES_tradnl"/>
+        </w:rPr>
+        <w:t>Ahora creamos la clase Generador de certificados que es la fábrica de certificados a partir de archivos de Excel. Dentro de la clase definimos lo siguiente</w:t>
+      </w:r>
+      <w:r>
+        <w:rPr>
+          <w:rFonts w:ascii="Times New Roman" w:hAnsi="Times New Roman" w:cs="Times New Roman"/>
+          <w:lang w:val="es-ES_tradnl"/>
+        </w:rPr>
+        <w:t>s métodos:</w:t>
+      </w:r>
+    </w:p>
+    <w:p>
+      <w:pPr>
+        <w:rPr>
+          <w:rFonts w:ascii="Times New Roman" w:hAnsi="Times New Roman" w:cs="Times New Roman"/>
+          <w:color w:val="0070C0"/>
+          <w:lang w:val="es-ES_tradnl"/>
+        </w:rPr>
+      </w:pPr>
+      <w:proofErr w:type="spellStart"/>
+      <w:r>
+        <w:rPr>
+          <w:rFonts w:ascii="Times New Roman" w:hAnsi="Times New Roman" w:cs="Times New Roman"/>
+          <w:color w:val="0070C0"/>
+          <w:lang w:val="es-ES_tradnl"/>
+        </w:rPr>
+        <w:t>d</w:t>
+      </w:r>
+      <w:r>
+        <w:rPr>
+          <w:rFonts w:ascii="Times New Roman" w:hAnsi="Times New Roman" w:cs="Times New Roman"/>
+          <w:color w:val="0070C0"/>
+          <w:lang w:val="es-ES_tradnl"/>
+        </w:rPr>
+        <w:t>ef</w:t>
+      </w:r>
+      <w:proofErr w:type="spellEnd"/>
+      <w:r>
+        <w:rPr>
+          <w:rFonts w:ascii="Times New Roman" w:hAnsi="Times New Roman" w:cs="Times New Roman"/>
+          <w:color w:val="0070C0"/>
+          <w:lang w:val="es-ES_tradnl"/>
+        </w:rPr>
+        <w:t xml:space="preserve"> __</w:t>
+      </w:r>
+      <w:proofErr w:type="spellStart"/>
+      <w:r>
+        <w:rPr>
+          <w:rFonts w:ascii="Times New Roman" w:hAnsi="Times New Roman" w:cs="Times New Roman"/>
+          <w:color w:val="0070C0"/>
+          <w:lang w:val="es-ES_tradnl"/>
+        </w:rPr>
+        <w:t>init</w:t>
+      </w:r>
+      <w:proofErr w:type="spellEnd"/>
+      <w:r>
+        <w:rPr>
+          <w:rFonts w:ascii="Times New Roman" w:hAnsi="Times New Roman" w:cs="Times New Roman"/>
+          <w:color w:val="0070C0"/>
+          <w:lang w:val="es-ES_tradnl"/>
+        </w:rPr>
+        <w:t>__(</w:t>
+      </w:r>
+      <w:proofErr w:type="spellStart"/>
+      <w:r>
+        <w:rPr>
+          <w:rFonts w:ascii="Times New Roman" w:hAnsi="Times New Roman" w:cs="Times New Roman"/>
+          <w:color w:val="0070C0"/>
+          <w:lang w:val="es-ES_tradnl"/>
+        </w:rPr>
+        <w:t>self</w:t>
+      </w:r>
+      <w:proofErr w:type="spellEnd"/>
+      <w:r>
+        <w:rPr>
+          <w:rFonts w:ascii="Times New Roman" w:hAnsi="Times New Roman" w:cs="Times New Roman"/>
+          <w:color w:val="0070C0"/>
+          <w:lang w:val="es-ES_tradnl"/>
+        </w:rPr>
+        <w:t>)</w:t>
+      </w:r>
+      <w:r>
+        <w:rPr>
+          <w:rFonts w:ascii="Times New Roman" w:hAnsi="Times New Roman" w:cs="Times New Roman"/>
+          <w:color w:val="0070C0"/>
+          <w:lang w:val="es-ES_tradnl"/>
+        </w:rPr>
+        <w:t>:</w:t>
+      </w:r>
+    </w:p>
+    <w:p>
+      <w:pPr>
+        <w:rPr>
+          <w:rFonts w:ascii="Times New Roman" w:hAnsi="Times New Roman" w:cs="Times New Roman"/>
+          <w:lang w:val="es-ES_tradnl"/>
+        </w:rPr>
+      </w:pPr>
+      <w:proofErr w:type="spellStart"/>
+      <w:proofErr w:type="gramStart"/>
+      <w:r>
+        <w:rPr>
+          <w:rFonts w:ascii="Times New Roman" w:hAnsi="Times New Roman" w:cs="Times New Roman"/>
+          <w:color w:val="00B050"/>
+          <w:lang w:val="es-ES_tradnl"/>
+        </w:rPr>
+        <w:t>self.carpeta</w:t>
+      </w:r>
+      <w:proofErr w:type="spellEnd"/>
+      <w:proofErr w:type="gramEnd"/>
+      <w:r>
+        <w:rPr>
+          <w:rFonts w:ascii="Times New Roman" w:hAnsi="Times New Roman" w:cs="Times New Roman"/>
+          <w:lang w:val="es-ES_tradnl"/>
+        </w:rPr>
+        <w:t xml:space="preserve"> es la carpeta donde está este script</w:t>
+      </w:r>
+      <w:r>
+        <w:rPr>
+          <w:rFonts w:ascii="Times New Roman" w:hAnsi="Times New Roman" w:cs="Times New Roman"/>
+          <w:lang w:val="es-ES_tradnl"/>
+        </w:rPr>
+        <w:t>. _file_ es la ruta del propio archivo</w:t>
+      </w:r>
+    </w:p>
+    <w:p>
+      <w:pPr>
+        <w:rPr>
+          <w:rFonts w:ascii="Times New Roman" w:hAnsi="Times New Roman" w:cs="Times New Roman"/>
+          <w:lang w:val="es-ES_tradnl"/>
+        </w:rPr>
+      </w:pPr>
+      <w:proofErr w:type="spellStart"/>
+      <w:proofErr w:type="gramStart"/>
+      <w:r>
+        <w:rPr>
+          <w:rFonts w:ascii="Times New Roman" w:hAnsi="Times New Roman" w:cs="Times New Roman"/>
+          <w:color w:val="00B050"/>
+          <w:lang w:val="es-ES_tradnl"/>
+        </w:rPr>
+        <w:t>self.carpeta</w:t>
+      </w:r>
+      <w:proofErr w:type="gramEnd"/>
+      <w:r>
+        <w:rPr>
+          <w:rFonts w:ascii="Times New Roman" w:hAnsi="Times New Roman" w:cs="Times New Roman"/>
+          <w:color w:val="00B050"/>
+          <w:lang w:val="es-ES_tradnl"/>
+        </w:rPr>
+        <w:t>_salida</w:t>
+      </w:r>
+      <w:proofErr w:type="spellEnd"/>
+      <w:r>
+        <w:rPr>
+          <w:rFonts w:ascii="Times New Roman" w:hAnsi="Times New Roman" w:cs="Times New Roman"/>
+          <w:lang w:val="es-ES_tradnl"/>
+        </w:rPr>
+        <w:t xml:space="preserve"> es la misma carpeta más certificados_excel</w:t>
+      </w:r>
+      <w:r>
+        <w:rPr>
+          <w:rFonts w:ascii="Times New Roman" w:hAnsi="Times New Roman" w:cs="Times New Roman"/>
+          <w:lang w:val="es-ES_tradnl"/>
+        </w:rPr>
+        <w:t xml:space="preserve">. El / de </w:t>
+      </w:r>
+      <w:proofErr w:type="spellStart"/>
+      <w:r>
+        <w:rPr>
+          <w:rFonts w:ascii="Times New Roman" w:hAnsi="Times New Roman" w:cs="Times New Roman"/>
+          <w:lang w:val="es-ES_tradnl"/>
+        </w:rPr>
+        <w:t>path</w:t>
+      </w:r>
+      <w:proofErr w:type="spellEnd"/>
+      <w:r>
+        <w:rPr>
+          <w:rFonts w:ascii="Times New Roman" w:hAnsi="Times New Roman" w:cs="Times New Roman"/>
+          <w:lang w:val="es-ES_tradnl"/>
+        </w:rPr>
+        <w:t>, une carpetas</w:t>
+      </w:r>
+    </w:p>
+    <w:p>
+      <w:pPr>
+        <w:rPr>
+          <w:rFonts w:ascii="Times New Roman" w:hAnsi="Times New Roman" w:cs="Times New Roman"/>
+          <w:lang w:val="es-ES_tradnl"/>
+        </w:rPr>
+      </w:pPr>
+      <w:proofErr w:type="spellStart"/>
+      <w:r>
+        <w:rPr>
+          <w:rFonts w:ascii="Times New Roman" w:hAnsi="Times New Roman" w:cs="Times New Roman"/>
+          <w:color w:val="00B050"/>
+          <w:lang w:val="es-ES_tradnl"/>
+        </w:rPr>
+        <w:t>mkdir_exist_ok</w:t>
+      </w:r>
+      <w:proofErr w:type="spellEnd"/>
+      <w:r>
+        <w:rPr>
+          <w:rFonts w:ascii="Times New Roman" w:hAnsi="Times New Roman" w:cs="Times New Roman"/>
+          <w:color w:val="00B050"/>
+          <w:lang w:val="es-ES_tradnl"/>
+        </w:rPr>
+        <w:t xml:space="preserve"> = true</w:t>
+      </w:r>
+      <w:r>
+        <w:rPr>
+          <w:rFonts w:ascii="Times New Roman" w:hAnsi="Times New Roman" w:cs="Times New Roman"/>
+          <w:lang w:val="es-ES_tradnl"/>
+        </w:rPr>
+        <w:t xml:space="preserve"> crea la carpeta: Si ya </w:t>
+      </w:r>
+      <w:proofErr w:type="gramStart"/>
+      <w:r>
+        <w:rPr>
+          <w:rFonts w:ascii="Times New Roman" w:hAnsi="Times New Roman" w:cs="Times New Roman"/>
+          <w:lang w:val="es-ES_tradnl"/>
+        </w:rPr>
+        <w:t>existe ,</w:t>
+      </w:r>
+      <w:proofErr w:type="gramEnd"/>
+      <w:r>
+        <w:rPr>
+          <w:rFonts w:ascii="Times New Roman" w:hAnsi="Times New Roman" w:cs="Times New Roman"/>
+          <w:lang w:val="es-ES_tradnl"/>
+        </w:rPr>
+        <w:t xml:space="preserve"> no da error</w:t>
+      </w:r>
+    </w:p>
+    <w:p>
+      <w:pPr>
+        <w:rPr>
+          <w:rFonts w:ascii="Times New Roman" w:hAnsi="Times New Roman" w:cs="Times New Roman"/>
+          <w:lang w:val="es-ES_tradnl"/>
+        </w:rPr>
+      </w:pPr>
+      <w:r>
+        <w:rPr>
+          <w:rFonts w:ascii="Times New Roman" w:hAnsi="Times New Roman" w:cs="Times New Roman"/>
+          <w:lang w:val="es-ES_tradnl"/>
+        </w:rPr>
+        <w:t>Se guardan las rutas de tres fuentes Arial normal, negrita y cursi</w:t>
+      </w:r>
+      <w:r>
+        <w:rPr>
+          <w:rFonts w:ascii="Times New Roman" w:hAnsi="Times New Roman" w:cs="Times New Roman"/>
+          <w:lang w:val="es-ES_tradnl"/>
+        </w:rPr>
+        <w:t>va</w:t>
+      </w:r>
+    </w:p>
+    <w:p>
+      <w:pPr>
+        <w:rPr>
+          <w:rFonts w:ascii="Times New Roman" w:hAnsi="Times New Roman" w:cs="Times New Roman"/>
+          <w:lang w:val="es-ES_tradnl"/>
+        </w:rPr>
+      </w:pPr>
+      <w:r>
+        <w:rPr>
+          <w:rFonts w:ascii="Times New Roman" w:hAnsi="Times New Roman" w:cs="Times New Roman"/>
+          <w:lang w:val="es-ES_tradnl"/>
+        </w:rPr>
+        <w:lastRenderedPageBreak/>
+        <w:t xml:space="preserve">Se dejan vacíos nombre, curso y fecha que cada certificado los llena después </w:t>
+      </w:r>
+    </w:p>
+    <w:p>
+      <w:pPr>
+        <w:rPr>
+          <w:rFonts w:ascii="Times New Roman" w:hAnsi="Times New Roman" w:cs="Times New Roman"/>
+          <w:lang w:val="es-ES_tradnl"/>
+        </w:rPr>
+      </w:pPr>
+      <w:r>
+        <w:rPr>
+          <w:rFonts w:ascii="Times New Roman" w:hAnsi="Times New Roman" w:cs="Times New Roman"/>
+          <w:lang w:val="es-ES_tradnl"/>
+        </w:rPr>
+        <w:t xml:space="preserve">Ahora creamos el método para leer los </w:t>
+      </w:r>
+      <w:proofErr w:type="spellStart"/>
+      <w:r>
+        <w:rPr>
+          <w:rFonts w:ascii="Times New Roman" w:hAnsi="Times New Roman" w:cs="Times New Roman"/>
+          <w:lang w:val="es-ES_tradnl"/>
+        </w:rPr>
+        <w:t>PDFs</w:t>
+      </w:r>
+      <w:proofErr w:type="spellEnd"/>
+      <w:r>
+        <w:rPr>
+          <w:rFonts w:ascii="Times New Roman" w:hAnsi="Times New Roman" w:cs="Times New Roman"/>
+          <w:lang w:val="es-ES_tradnl"/>
+        </w:rPr>
+        <w:t>.</w:t>
+      </w:r>
+    </w:p>
+    <w:p>
+      <w:pPr>
+        <w:rPr>
+          <w:rFonts w:ascii="Times New Roman" w:hAnsi="Times New Roman" w:cs="Times New Roman"/>
+          <w:color w:val="00B050"/>
+          <w:lang w:val="es-ES_tradnl"/>
+        </w:rPr>
+      </w:pPr>
+      <w:proofErr w:type="spellStart"/>
+      <w:proofErr w:type="gramStart"/>
+      <w:r>
+        <w:rPr>
+          <w:rFonts w:ascii="Times New Roman" w:hAnsi="Times New Roman" w:cs="Times New Roman"/>
+          <w:color w:val="00B050"/>
+          <w:lang w:val="es-ES_tradnl"/>
+        </w:rPr>
+        <w:t>def</w:t>
+      </w:r>
+      <w:proofErr w:type="spellEnd"/>
+      <w:r>
+        <w:rPr>
+          <w:rFonts w:ascii="Times New Roman" w:hAnsi="Times New Roman" w:cs="Times New Roman"/>
+          <w:color w:val="00B050"/>
+          <w:lang w:val="es-ES_tradnl"/>
+        </w:rPr>
+        <w:t xml:space="preserve">  </w:t>
+      </w:r>
+      <w:proofErr w:type="spellStart"/>
+      <w:r>
+        <w:rPr>
+          <w:rFonts w:ascii="Times New Roman" w:hAnsi="Times New Roman" w:cs="Times New Roman"/>
+          <w:color w:val="00B050"/>
+          <w:lang w:val="es-ES_tradnl"/>
+        </w:rPr>
+        <w:t>leer</w:t>
+      </w:r>
+      <w:proofErr w:type="gramEnd"/>
+      <w:r>
+        <w:rPr>
+          <w:rFonts w:ascii="Times New Roman" w:hAnsi="Times New Roman" w:cs="Times New Roman"/>
+          <w:color w:val="00B050"/>
+          <w:lang w:val="es-ES_tradnl"/>
+        </w:rPr>
+        <w:t>_</w:t>
+      </w:r>
+      <w:proofErr w:type="gramStart"/>
+      <w:r>
+        <w:rPr>
+          <w:rFonts w:ascii="Times New Roman" w:hAnsi="Times New Roman" w:cs="Times New Roman"/>
+          <w:color w:val="00B050"/>
+          <w:lang w:val="es-ES_tradnl"/>
+        </w:rPr>
+        <w:t>excel</w:t>
+      </w:r>
+      <w:proofErr w:type="spellEnd"/>
+      <w:r>
+        <w:rPr>
+          <w:rFonts w:ascii="Times New Roman" w:hAnsi="Times New Roman" w:cs="Times New Roman"/>
+          <w:color w:val="00B050"/>
+          <w:lang w:val="es-ES_tradnl"/>
+        </w:rPr>
+        <w:t>(</w:t>
+      </w:r>
+      <w:proofErr w:type="spellStart"/>
+      <w:proofErr w:type="gramEnd"/>
+      <w:r>
+        <w:rPr>
+          <w:rFonts w:ascii="Times New Roman" w:hAnsi="Times New Roman" w:cs="Times New Roman"/>
+          <w:color w:val="00B050"/>
+          <w:lang w:val="es-ES_tradnl"/>
+        </w:rPr>
+        <w:t>self</w:t>
+      </w:r>
+      <w:proofErr w:type="spellEnd"/>
+      <w:r>
+        <w:rPr>
+          <w:rFonts w:ascii="Times New Roman" w:hAnsi="Times New Roman" w:cs="Times New Roman"/>
+          <w:color w:val="00B050"/>
+          <w:lang w:val="es-ES_tradnl"/>
+        </w:rPr>
+        <w:t xml:space="preserve">, </w:t>
+      </w:r>
+      <w:proofErr w:type="spellStart"/>
+      <w:r>
+        <w:rPr>
+          <w:rFonts w:ascii="Times New Roman" w:hAnsi="Times New Roman" w:cs="Times New Roman"/>
+          <w:color w:val="00B050"/>
+          <w:lang w:val="es-ES_tradnl"/>
+        </w:rPr>
+        <w:t>nombre_archivo</w:t>
+      </w:r>
+      <w:proofErr w:type="spellEnd"/>
+      <w:r>
+        <w:rPr>
+          <w:rFonts w:ascii="Times New Roman" w:hAnsi="Times New Roman" w:cs="Times New Roman"/>
+          <w:color w:val="00B050"/>
+          <w:lang w:val="es-ES_tradnl"/>
+        </w:rPr>
+        <w:t xml:space="preserve"> = “alumnos.xlsx”)</w:t>
+      </w:r>
+    </w:p>
+    <w:p>
+      <w:pPr>
+        <w:rPr>
+          <w:rFonts w:ascii="Times New Roman" w:hAnsi="Times New Roman" w:cs="Times New Roman"/>
+          <w:lang w:val="es-ES_tradnl"/>
+        </w:rPr>
+      </w:pPr>
+      <w:r>
+        <w:rPr>
+          <w:rFonts w:ascii="Times New Roman" w:hAnsi="Times New Roman" w:cs="Times New Roman"/>
+          <w:lang w:val="es-ES_tradnl"/>
+        </w:rPr>
+        <w:t xml:space="preserve">Este método abre el Excel y devuelve una lista de </w:t>
+      </w:r>
+      <w:proofErr w:type="gramStart"/>
+      <w:r>
+        <w:rPr>
+          <w:rFonts w:ascii="Times New Roman" w:hAnsi="Times New Roman" w:cs="Times New Roman"/>
+          <w:lang w:val="es-ES_tradnl"/>
+        </w:rPr>
+        <w:t xml:space="preserve">diccionarios </w:t>
+      </w:r>
+      <w:r>
+        <w:rPr>
+          <w:rFonts w:ascii="Times New Roman" w:hAnsi="Times New Roman" w:cs="Times New Roman"/>
+          <w:lang w:val="es-ES_tradnl"/>
+        </w:rPr>
+        <w:t>.</w:t>
+      </w:r>
+      <w:proofErr w:type="gramEnd"/>
+      <w:r>
+        <w:rPr>
+          <w:rFonts w:ascii="Times New Roman" w:hAnsi="Times New Roman" w:cs="Times New Roman"/>
+          <w:lang w:val="es-ES_tradnl"/>
+        </w:rPr>
+        <w:t xml:space="preserve"> Definimos la variable </w:t>
+      </w:r>
+      <w:r>
+        <w:rPr>
+          <w:rFonts w:ascii="Times New Roman" w:hAnsi="Times New Roman" w:cs="Times New Roman"/>
+          <w:color w:val="00B050"/>
+          <w:lang w:val="es-ES_tradnl"/>
+        </w:rPr>
+        <w:t>ruta</w:t>
+      </w:r>
+      <w:r>
+        <w:rPr>
+          <w:rFonts w:ascii="Times New Roman" w:hAnsi="Times New Roman" w:cs="Times New Roman"/>
+          <w:lang w:val="es-ES_tradnl"/>
+        </w:rPr>
+        <w:t xml:space="preserve"> que es igual a </w:t>
+      </w:r>
+      <w:proofErr w:type="spellStart"/>
+      <w:proofErr w:type="gramStart"/>
+      <w:r>
+        <w:rPr>
+          <w:rFonts w:ascii="Times New Roman" w:hAnsi="Times New Roman" w:cs="Times New Roman"/>
+          <w:color w:val="00B050"/>
+          <w:lang w:val="es-ES_tradnl"/>
+        </w:rPr>
+        <w:t>self.carpeta</w:t>
+      </w:r>
+      <w:proofErr w:type="spellEnd"/>
+      <w:proofErr w:type="gramEnd"/>
+      <w:r>
+        <w:rPr>
+          <w:rFonts w:ascii="Times New Roman" w:hAnsi="Times New Roman" w:cs="Times New Roman"/>
+          <w:color w:val="00B050"/>
+          <w:lang w:val="es-ES_tradnl"/>
+        </w:rPr>
+        <w:t xml:space="preserve"> / </w:t>
+      </w:r>
+      <w:proofErr w:type="spellStart"/>
+      <w:r>
+        <w:rPr>
+          <w:rFonts w:ascii="Times New Roman" w:hAnsi="Times New Roman" w:cs="Times New Roman"/>
+          <w:color w:val="00B050"/>
+          <w:lang w:val="es-ES_tradnl"/>
+        </w:rPr>
+        <w:t>nombre_archivo</w:t>
+      </w:r>
+      <w:proofErr w:type="spellEnd"/>
+      <w:r>
+        <w:rPr>
+          <w:rFonts w:ascii="Times New Roman" w:hAnsi="Times New Roman" w:cs="Times New Roman"/>
+          <w:color w:val="00B050"/>
+          <w:lang w:val="es-ES_tradnl"/>
+        </w:rPr>
+        <w:t xml:space="preserve">, </w:t>
+      </w:r>
+      <w:r>
+        <w:rPr>
+          <w:rFonts w:ascii="Times New Roman" w:hAnsi="Times New Roman" w:cs="Times New Roman"/>
+          <w:lang w:val="es-ES_tradnl"/>
+        </w:rPr>
+        <w:t>ponemos una condición que diga que si la ruta no existe nos arroje un</w:t>
+      </w:r>
+      <w:r>
+        <w:rPr>
+          <w:rFonts w:ascii="Times New Roman" w:hAnsi="Times New Roman" w:cs="Times New Roman"/>
+          <w:lang w:val="es-ES_tradnl"/>
+        </w:rPr>
+        <w:t xml:space="preserve"> mensaje </w:t>
+      </w:r>
+      <w:proofErr w:type="gramStart"/>
+      <w:r>
+        <w:rPr>
+          <w:rFonts w:ascii="Times New Roman" w:hAnsi="Times New Roman" w:cs="Times New Roman"/>
+          <w:lang w:val="es-ES_tradnl"/>
+        </w:rPr>
+        <w:t xml:space="preserve">de </w:t>
+      </w:r>
+      <w:r>
+        <w:rPr>
+          <w:rFonts w:ascii="Times New Roman" w:hAnsi="Times New Roman" w:cs="Times New Roman"/>
+          <w:lang w:val="es-ES_tradnl"/>
+        </w:rPr>
+        <w:t xml:space="preserve"> error</w:t>
+      </w:r>
+      <w:proofErr w:type="gramEnd"/>
+    </w:p>
+    <w:p>
+      <w:pPr>
+        <w:rPr>
+          <w:rFonts w:ascii="Times New Roman" w:hAnsi="Times New Roman" w:cs="Times New Roman"/>
+          <w:lang w:val="es-ES_tradnl"/>
+        </w:rPr>
+      </w:pPr>
+      <w:r>
+        <w:rPr>
+          <w:rFonts w:ascii="Times New Roman" w:hAnsi="Times New Roman" w:cs="Times New Roman"/>
+          <w:lang w:val="es-ES_tradnl"/>
+        </w:rPr>
+        <w:t xml:space="preserve">La variable </w:t>
+      </w:r>
+      <w:r>
+        <w:rPr>
+          <w:rFonts w:ascii="Times New Roman" w:hAnsi="Times New Roman" w:cs="Times New Roman"/>
+          <w:color w:val="00B050"/>
+          <w:lang w:val="es-ES_tradnl"/>
+        </w:rPr>
+        <w:t>libro</w:t>
+      </w:r>
+      <w:r>
+        <w:rPr>
+          <w:rFonts w:ascii="Times New Roman" w:hAnsi="Times New Roman" w:cs="Times New Roman"/>
+          <w:color w:val="00B050"/>
+          <w:lang w:val="es-ES_tradnl"/>
+        </w:rPr>
+        <w:t xml:space="preserve"> = </w:t>
+      </w:r>
+      <w:proofErr w:type="spellStart"/>
+      <w:r>
+        <w:rPr>
+          <w:rFonts w:ascii="Times New Roman" w:hAnsi="Times New Roman" w:cs="Times New Roman"/>
+          <w:color w:val="00B050"/>
+          <w:lang w:val="es-ES_tradnl"/>
+        </w:rPr>
+        <w:t>load_workbook</w:t>
+      </w:r>
+      <w:proofErr w:type="spellEnd"/>
+      <w:r>
+        <w:rPr>
+          <w:rFonts w:ascii="Times New Roman" w:hAnsi="Times New Roman" w:cs="Times New Roman"/>
+          <w:color w:val="00B050"/>
+          <w:lang w:val="es-ES_tradnl"/>
+        </w:rPr>
+        <w:t>(ruta)</w:t>
+      </w:r>
+      <w:r>
+        <w:rPr>
+          <w:rFonts w:ascii="Times New Roman" w:hAnsi="Times New Roman" w:cs="Times New Roman"/>
+          <w:color w:val="00B050"/>
+          <w:lang w:val="es-ES_tradnl"/>
+        </w:rPr>
+        <w:t xml:space="preserve"> </w:t>
+      </w:r>
+      <w:r>
+        <w:rPr>
+          <w:rFonts w:ascii="Times New Roman" w:hAnsi="Times New Roman" w:cs="Times New Roman"/>
+          <w:lang w:val="es-ES_tradnl"/>
+        </w:rPr>
+        <w:t xml:space="preserve">abre el libro y la variable </w:t>
+      </w:r>
+      <w:r>
+        <w:rPr>
+          <w:rFonts w:ascii="Times New Roman" w:hAnsi="Times New Roman" w:cs="Times New Roman"/>
+          <w:color w:val="00B050"/>
+          <w:lang w:val="es-ES_tradnl"/>
+        </w:rPr>
+        <w:t xml:space="preserve">hoja = </w:t>
+      </w:r>
+      <w:proofErr w:type="spellStart"/>
+      <w:proofErr w:type="gramStart"/>
+      <w:r>
+        <w:rPr>
+          <w:rFonts w:ascii="Times New Roman" w:hAnsi="Times New Roman" w:cs="Times New Roman"/>
+          <w:color w:val="00B050"/>
+          <w:lang w:val="es-ES_tradnl"/>
+        </w:rPr>
+        <w:t>libro.active</w:t>
+      </w:r>
+      <w:proofErr w:type="spellEnd"/>
+      <w:proofErr w:type="gramEnd"/>
+      <w:r>
+        <w:rPr>
+          <w:rFonts w:ascii="Times New Roman" w:hAnsi="Times New Roman" w:cs="Times New Roman"/>
+          <w:lang w:val="es-ES_tradnl"/>
+        </w:rPr>
+        <w:t xml:space="preserve">, </w:t>
+      </w:r>
+      <w:r>
+        <w:rPr>
+          <w:rFonts w:ascii="Times New Roman" w:hAnsi="Times New Roman" w:cs="Times New Roman"/>
+          <w:lang w:val="es-ES_tradnl"/>
+        </w:rPr>
+        <w:t xml:space="preserve">abre </w:t>
+      </w:r>
+      <w:r>
+        <w:rPr>
+          <w:rFonts w:ascii="Times New Roman" w:hAnsi="Times New Roman" w:cs="Times New Roman"/>
+          <w:lang w:val="es-ES_tradnl"/>
+        </w:rPr>
+        <w:t>la primera hoja.</w:t>
+      </w:r>
+    </w:p>
+    <w:p>
+      <w:pPr>
+        <w:rPr>
+          <w:rFonts w:ascii="Times New Roman" w:hAnsi="Times New Roman" w:cs="Times New Roman"/>
+          <w:lang w:val="es-ES_tradnl"/>
+        </w:rPr>
+      </w:pPr>
+      <w:r>
+        <w:rPr>
+          <w:rFonts w:ascii="Times New Roman" w:hAnsi="Times New Roman" w:cs="Times New Roman"/>
+          <w:lang w:val="es-ES_tradnl"/>
+        </w:rPr>
+        <w:t xml:space="preserve">Vamos a buscar los encabezados y las columnas nombre y curso. </w:t>
+      </w:r>
+      <w:r>
+        <w:rPr>
+          <w:rFonts w:ascii="Times New Roman" w:hAnsi="Times New Roman" w:cs="Times New Roman"/>
+          <w:lang w:val="es-ES_tradnl"/>
+        </w:rPr>
+        <w:t xml:space="preserve">Creamos la variable </w:t>
+      </w:r>
+      <w:r>
+        <w:rPr>
+          <w:rFonts w:ascii="Times New Roman" w:hAnsi="Times New Roman" w:cs="Times New Roman"/>
+          <w:color w:val="00B050"/>
+          <w:lang w:val="es-ES_tradnl"/>
+        </w:rPr>
+        <w:t>encabezados</w:t>
+      </w:r>
+      <w:r>
+        <w:rPr>
+          <w:rFonts w:ascii="Times New Roman" w:hAnsi="Times New Roman" w:cs="Times New Roman"/>
+          <w:color w:val="00B050"/>
+          <w:lang w:val="es-ES_tradnl"/>
+        </w:rPr>
+        <w:t xml:space="preserve"> = [</w:t>
+      </w:r>
+      <w:proofErr w:type="spellStart"/>
+      <w:r>
+        <w:rPr>
+          <w:rFonts w:ascii="Times New Roman" w:hAnsi="Times New Roman" w:cs="Times New Roman"/>
+          <w:color w:val="00B050"/>
+          <w:lang w:val="es-ES_tradnl"/>
+        </w:rPr>
+        <w:t>celda.value</w:t>
+      </w:r>
+      <w:proofErr w:type="spellEnd"/>
+      <w:r>
+        <w:rPr>
+          <w:rFonts w:ascii="Times New Roman" w:hAnsi="Times New Roman" w:cs="Times New Roman"/>
+          <w:color w:val="00B050"/>
+          <w:lang w:val="es-ES_tradnl"/>
+        </w:rPr>
+        <w:t xml:space="preserve"> </w:t>
+      </w:r>
+      <w:proofErr w:type="spellStart"/>
+      <w:r>
+        <w:rPr>
+          <w:rFonts w:ascii="Times New Roman" w:hAnsi="Times New Roman" w:cs="Times New Roman"/>
+          <w:color w:val="00B050"/>
+          <w:lang w:val="es-ES_tradnl"/>
+        </w:rPr>
+        <w:t>for</w:t>
+      </w:r>
+      <w:proofErr w:type="spellEnd"/>
+      <w:r>
+        <w:rPr>
+          <w:rFonts w:ascii="Times New Roman" w:hAnsi="Times New Roman" w:cs="Times New Roman"/>
+          <w:color w:val="00B050"/>
+          <w:lang w:val="es-ES_tradnl"/>
+        </w:rPr>
+        <w:t xml:space="preserve"> celda in </w:t>
+      </w:r>
+      <w:proofErr w:type="gramStart"/>
+      <w:r>
+        <w:rPr>
+          <w:rFonts w:ascii="Times New Roman" w:hAnsi="Times New Roman" w:cs="Times New Roman"/>
+          <w:color w:val="00B050"/>
+          <w:lang w:val="es-ES_tradnl"/>
+        </w:rPr>
+        <w:t>hoja[</w:t>
+      </w:r>
+      <w:proofErr w:type="gramEnd"/>
+      <w:r>
+        <w:rPr>
+          <w:rFonts w:ascii="Times New Roman" w:hAnsi="Times New Roman" w:cs="Times New Roman"/>
+          <w:color w:val="00B050"/>
+          <w:lang w:val="es-ES_tradnl"/>
+        </w:rPr>
+        <w:t>1]]</w:t>
+      </w:r>
+      <w:r>
+        <w:rPr>
+          <w:rFonts w:ascii="Times New Roman" w:hAnsi="Times New Roman" w:cs="Times New Roman"/>
+          <w:color w:val="00B050"/>
+          <w:lang w:val="es-ES_tradnl"/>
+        </w:rPr>
+        <w:t xml:space="preserve"> </w:t>
+      </w:r>
+      <w:r>
+        <w:rPr>
+          <w:rFonts w:ascii="Times New Roman" w:hAnsi="Times New Roman" w:cs="Times New Roman"/>
+          <w:lang w:val="es-ES_tradnl"/>
+        </w:rPr>
+        <w:t>que será la que lee la fila 1 y normaliza los títulos, quita espacios y permite que mayúscula y minúscula se lean igual</w:t>
+      </w:r>
+      <w:r>
+        <w:rPr>
+          <w:rFonts w:ascii="Times New Roman" w:hAnsi="Times New Roman" w:cs="Times New Roman"/>
+          <w:lang w:val="es-ES_tradnl"/>
+        </w:rPr>
+        <w:t>.</w:t>
+      </w:r>
+    </w:p>
+    <w:p>
+      <w:pPr>
+        <w:rPr>
+          <w:rFonts w:ascii="Times New Roman" w:hAnsi="Times New Roman" w:cs="Times New Roman"/>
+          <w:color w:val="00B050"/>
+          <w:lang w:val="es-ES_tradnl"/>
+        </w:rPr>
+      </w:pPr>
+      <w:r>
+        <w:rPr>
+          <w:rFonts w:ascii="Times New Roman" w:hAnsi="Times New Roman" w:cs="Times New Roman"/>
+          <w:lang w:val="es-ES_tradnl"/>
+        </w:rPr>
+        <w:t xml:space="preserve">Creamos la variable </w:t>
+      </w:r>
+      <w:proofErr w:type="spellStart"/>
+      <w:r>
+        <w:rPr>
+          <w:rFonts w:ascii="Times New Roman" w:hAnsi="Times New Roman" w:cs="Times New Roman"/>
+          <w:color w:val="00B050"/>
+          <w:lang w:val="es-ES_tradnl"/>
+        </w:rPr>
+        <w:t>encabezados_norm</w:t>
+      </w:r>
+      <w:proofErr w:type="spellEnd"/>
+      <w:r>
+        <w:rPr>
+          <w:rFonts w:ascii="Times New Roman" w:hAnsi="Times New Roman" w:cs="Times New Roman"/>
+          <w:color w:val="00B050"/>
+          <w:lang w:val="es-ES_tradnl"/>
+        </w:rPr>
+        <w:t xml:space="preserve"> = [(h </w:t>
+      </w:r>
+      <w:proofErr w:type="spellStart"/>
+      <w:r>
+        <w:rPr>
+          <w:rFonts w:ascii="Times New Roman" w:hAnsi="Times New Roman" w:cs="Times New Roman"/>
+          <w:color w:val="00B050"/>
+          <w:lang w:val="es-ES_tradnl"/>
+        </w:rPr>
+        <w:t>or</w:t>
+      </w:r>
+      <w:proofErr w:type="spellEnd"/>
+      <w:r>
+        <w:rPr>
+          <w:rFonts w:ascii="Times New Roman" w:hAnsi="Times New Roman" w:cs="Times New Roman"/>
+          <w:color w:val="00B050"/>
+          <w:lang w:val="es-ES_tradnl"/>
+        </w:rPr>
+        <w:t xml:space="preserve"> “”</w:t>
+      </w:r>
+      <w:proofErr w:type="gramStart"/>
+      <w:r>
+        <w:rPr>
+          <w:rFonts w:ascii="Times New Roman" w:hAnsi="Times New Roman" w:cs="Times New Roman"/>
+          <w:color w:val="00B050"/>
+          <w:lang w:val="es-ES_tradnl"/>
+        </w:rPr>
+        <w:t>).</w:t>
+      </w:r>
+      <w:proofErr w:type="spellStart"/>
+      <w:r>
+        <w:rPr>
+          <w:rFonts w:ascii="Times New Roman" w:hAnsi="Times New Roman" w:cs="Times New Roman"/>
+          <w:color w:val="00B050"/>
+          <w:lang w:val="es-ES_tradnl"/>
+        </w:rPr>
+        <w:t>strip</w:t>
+      </w:r>
+      <w:proofErr w:type="spellEnd"/>
+      <w:r>
+        <w:rPr>
+          <w:rFonts w:ascii="Times New Roman" w:hAnsi="Times New Roman" w:cs="Times New Roman"/>
+          <w:color w:val="00B050"/>
+          <w:lang w:val="es-ES_tradnl"/>
+        </w:rPr>
+        <w:t>( )</w:t>
+      </w:r>
+      <w:proofErr w:type="gramEnd"/>
+      <w:r>
+        <w:rPr>
+          <w:rFonts w:ascii="Times New Roman" w:hAnsi="Times New Roman" w:cs="Times New Roman"/>
+          <w:color w:val="00B050"/>
+          <w:lang w:val="es-ES_tradnl"/>
+        </w:rPr>
+        <w:t xml:space="preserve">. </w:t>
+      </w:r>
+      <w:proofErr w:type="gramStart"/>
+      <w:r>
+        <w:rPr>
+          <w:rFonts w:ascii="Times New Roman" w:hAnsi="Times New Roman" w:cs="Times New Roman"/>
+          <w:color w:val="00B050"/>
+          <w:lang w:val="es-ES_tradnl"/>
+        </w:rPr>
+        <w:t>Lower( )</w:t>
+      </w:r>
+      <w:proofErr w:type="gramEnd"/>
+      <w:r>
+        <w:rPr>
+          <w:rFonts w:ascii="Times New Roman" w:hAnsi="Times New Roman" w:cs="Times New Roman"/>
+          <w:color w:val="00B050"/>
+          <w:lang w:val="es-ES_tradnl"/>
+        </w:rPr>
+        <w:t xml:space="preserve"> </w:t>
+      </w:r>
+      <w:proofErr w:type="spellStart"/>
+      <w:r>
+        <w:rPr>
+          <w:rFonts w:ascii="Times New Roman" w:hAnsi="Times New Roman" w:cs="Times New Roman"/>
+          <w:color w:val="00B050"/>
+          <w:lang w:val="es-ES_tradnl"/>
+        </w:rPr>
+        <w:t>for</w:t>
+      </w:r>
+      <w:proofErr w:type="spellEnd"/>
+      <w:r>
+        <w:rPr>
+          <w:rFonts w:ascii="Times New Roman" w:hAnsi="Times New Roman" w:cs="Times New Roman"/>
+          <w:color w:val="00B050"/>
+          <w:lang w:val="es-ES_tradnl"/>
+        </w:rPr>
+        <w:t xml:space="preserve"> h in encabezados]</w:t>
+      </w:r>
+    </w:p>
+    <w:p>
+      <w:pPr>
+        <w:rPr>
+          <w:rFonts w:ascii="Times New Roman" w:hAnsi="Times New Roman" w:cs="Times New Roman"/>
+          <w:lang w:val="es-ES_tradnl"/>
+        </w:rPr>
+      </w:pPr>
+      <w:r>
+        <w:rPr>
+          <w:rFonts w:ascii="Times New Roman" w:hAnsi="Times New Roman" w:cs="Times New Roman"/>
+          <w:lang w:val="es-ES_tradnl"/>
+        </w:rPr>
+        <w:t xml:space="preserve">Ejecutamos con </w:t>
+      </w:r>
+      <w:r>
+        <w:rPr>
+          <w:rFonts w:ascii="Times New Roman" w:hAnsi="Times New Roman" w:cs="Times New Roman"/>
+          <w:color w:val="00B050"/>
+          <w:lang w:val="es-ES_tradnl"/>
+        </w:rPr>
+        <w:t>try</w:t>
+      </w:r>
+      <w:r>
+        <w:rPr>
+          <w:rFonts w:ascii="Times New Roman" w:hAnsi="Times New Roman" w:cs="Times New Roman"/>
+          <w:color w:val="00B050"/>
+          <w:lang w:val="es-ES_tradnl"/>
+        </w:rPr>
+        <w:t xml:space="preserve"> </w:t>
+      </w:r>
+      <w:r>
+        <w:rPr>
+          <w:rFonts w:ascii="Times New Roman" w:hAnsi="Times New Roman" w:cs="Times New Roman"/>
+          <w:lang w:val="es-ES_tradnl"/>
+        </w:rPr>
+        <w:t xml:space="preserve">para intentar ejecutar un bloque de código que puede generar un error permitiendo capturarlo con </w:t>
+      </w:r>
+      <w:proofErr w:type="spellStart"/>
+      <w:proofErr w:type="gramStart"/>
+      <w:r>
+        <w:rPr>
+          <w:rFonts w:ascii="Times New Roman" w:hAnsi="Times New Roman" w:cs="Times New Roman"/>
+          <w:color w:val="00B050"/>
+          <w:lang w:val="es-ES_tradnl"/>
+        </w:rPr>
+        <w:t>except</w:t>
+      </w:r>
+      <w:proofErr w:type="spellEnd"/>
+      <w:r>
+        <w:rPr>
+          <w:rFonts w:ascii="Times New Roman" w:hAnsi="Times New Roman" w:cs="Times New Roman"/>
+          <w:color w:val="00B050"/>
+          <w:lang w:val="es-ES_tradnl"/>
+        </w:rPr>
+        <w:t xml:space="preserve"> </w:t>
+      </w:r>
+      <w:r>
+        <w:rPr>
+          <w:rFonts w:ascii="Times New Roman" w:hAnsi="Times New Roman" w:cs="Times New Roman"/>
+          <w:lang w:val="es-ES_tradnl"/>
+        </w:rPr>
+        <w:t xml:space="preserve"> para</w:t>
+      </w:r>
+      <w:proofErr w:type="gramEnd"/>
+      <w:r>
+        <w:rPr>
+          <w:rFonts w:ascii="Times New Roman" w:hAnsi="Times New Roman" w:cs="Times New Roman"/>
+          <w:lang w:val="es-ES_tradnl"/>
+        </w:rPr>
+        <w:t xml:space="preserve"> que el programa no se detenga.</w:t>
+      </w:r>
+    </w:p>
+    <w:p>
+      <w:pPr>
+        <w:rPr>
+          <w:rFonts w:ascii="Times New Roman" w:hAnsi="Times New Roman" w:cs="Times New Roman"/>
+          <w:color w:val="00B050"/>
+          <w:lang w:val="es-ES_tradnl"/>
+        </w:rPr>
+      </w:pPr>
+      <w:r>
+        <w:rPr>
+          <w:rFonts w:ascii="Times New Roman" w:hAnsi="Times New Roman" w:cs="Times New Roman"/>
+          <w:lang w:val="es-ES_tradnl"/>
+        </w:rPr>
+        <w:t xml:space="preserve">Creamos la lista vacía alumnos </w:t>
+      </w:r>
+      <w:proofErr w:type="spellStart"/>
+      <w:r>
+        <w:rPr>
+          <w:rFonts w:ascii="Times New Roman" w:hAnsi="Times New Roman" w:cs="Times New Roman"/>
+          <w:color w:val="00B050"/>
+          <w:lang w:val="es-ES_tradnl"/>
+        </w:rPr>
+        <w:t>alumnos</w:t>
+      </w:r>
+      <w:proofErr w:type="spellEnd"/>
+      <w:r>
+        <w:rPr>
+          <w:rFonts w:ascii="Times New Roman" w:hAnsi="Times New Roman" w:cs="Times New Roman"/>
+          <w:color w:val="00B050"/>
+          <w:lang w:val="es-ES_tradnl"/>
+        </w:rPr>
+        <w:t xml:space="preserve"> </w:t>
+      </w:r>
+      <w:proofErr w:type="gramStart"/>
+      <w:r>
+        <w:rPr>
+          <w:rFonts w:ascii="Times New Roman" w:hAnsi="Times New Roman" w:cs="Times New Roman"/>
+          <w:color w:val="00B050"/>
+          <w:lang w:val="es-ES_tradnl"/>
+        </w:rPr>
+        <w:t>[</w:t>
+      </w:r>
+      <w:r>
+        <w:rPr>
+          <w:rFonts w:ascii="Times New Roman" w:hAnsi="Times New Roman" w:cs="Times New Roman"/>
+          <w:color w:val="00B050"/>
+          <w:lang w:val="es-ES_tradnl"/>
+        </w:rPr>
+        <w:t xml:space="preserve"> </w:t>
+      </w:r>
+      <w:r>
+        <w:rPr>
+          <w:rFonts w:ascii="Times New Roman" w:hAnsi="Times New Roman" w:cs="Times New Roman"/>
+          <w:color w:val="00B050"/>
+          <w:lang w:val="es-ES_tradnl"/>
+        </w:rPr>
+        <w:t>]</w:t>
+      </w:r>
+      <w:proofErr w:type="gramEnd"/>
+      <w:r>
+        <w:rPr>
+          <w:rFonts w:ascii="Times New Roman" w:hAnsi="Times New Roman" w:cs="Times New Roman"/>
+          <w:color w:val="00B050"/>
+          <w:lang w:val="es-ES_tradnl"/>
+        </w:rPr>
+        <w:t xml:space="preserve"> </w:t>
+      </w:r>
+      <w:r>
+        <w:rPr>
+          <w:rFonts w:ascii="Times New Roman" w:hAnsi="Times New Roman" w:cs="Times New Roman"/>
+          <w:color w:val="00B050"/>
+          <w:lang w:val="es-ES_tradnl"/>
+        </w:rPr>
+        <w:t xml:space="preserve">. </w:t>
+      </w:r>
+      <w:r>
+        <w:rPr>
+          <w:rFonts w:ascii="Times New Roman" w:hAnsi="Times New Roman" w:cs="Times New Roman"/>
+          <w:lang w:val="es-ES_tradnl"/>
+        </w:rPr>
+        <w:t xml:space="preserve">Creamos un ciclo </w:t>
+      </w:r>
+      <w:proofErr w:type="spellStart"/>
+      <w:r>
+        <w:rPr>
+          <w:rFonts w:ascii="Times New Roman" w:hAnsi="Times New Roman" w:cs="Times New Roman"/>
+          <w:color w:val="00B050"/>
+          <w:lang w:val="es-ES_tradnl"/>
+        </w:rPr>
+        <w:t>for</w:t>
+      </w:r>
+      <w:proofErr w:type="spellEnd"/>
+      <w:r>
+        <w:rPr>
+          <w:rFonts w:ascii="Times New Roman" w:hAnsi="Times New Roman" w:cs="Times New Roman"/>
+          <w:color w:val="00B050"/>
+          <w:lang w:val="es-ES_tradnl"/>
+        </w:rPr>
+        <w:t xml:space="preserve"> </w:t>
+      </w:r>
+      <w:r>
+        <w:rPr>
+          <w:rFonts w:ascii="Times New Roman" w:hAnsi="Times New Roman" w:cs="Times New Roman"/>
+          <w:lang w:val="es-ES_tradnl"/>
+        </w:rPr>
+        <w:t>para que busque en qué columna está nombre y curso. Index devuelve la posición empezando en cero y se le suma uno por</w:t>
+      </w:r>
+      <w:r>
+        <w:rPr>
+          <w:rFonts w:ascii="Times New Roman" w:hAnsi="Times New Roman" w:cs="Times New Roman"/>
+          <w:lang w:val="es-ES_tradnl"/>
+        </w:rPr>
+        <w:t>que</w:t>
+      </w:r>
+      <w:r>
+        <w:rPr>
+          <w:rFonts w:ascii="Times New Roman" w:hAnsi="Times New Roman" w:cs="Times New Roman"/>
+          <w:lang w:val="es-ES_tradnl"/>
+        </w:rPr>
+        <w:t xml:space="preserve"> </w:t>
+      </w:r>
+      <w:proofErr w:type="spellStart"/>
+      <w:r>
+        <w:rPr>
+          <w:rFonts w:ascii="Times New Roman" w:hAnsi="Times New Roman" w:cs="Times New Roman"/>
+          <w:color w:val="00B050"/>
+          <w:lang w:val="es-ES_tradnl"/>
+        </w:rPr>
+        <w:t>openpyxl</w:t>
+      </w:r>
+      <w:proofErr w:type="spellEnd"/>
+      <w:r>
+        <w:rPr>
+          <w:rFonts w:ascii="Times New Roman" w:hAnsi="Times New Roman" w:cs="Times New Roman"/>
+          <w:lang w:val="es-ES_tradnl"/>
+        </w:rPr>
+        <w:t xml:space="preserve"> numera las columnas desde uno, si falta alguna columna, lanza </w:t>
+      </w:r>
+      <w:proofErr w:type="spellStart"/>
+      <w:r>
+        <w:rPr>
+          <w:rFonts w:ascii="Times New Roman" w:hAnsi="Times New Roman" w:cs="Times New Roman"/>
+          <w:color w:val="00B050"/>
+          <w:lang w:val="es-ES_tradnl"/>
+        </w:rPr>
+        <w:t>ValueError</w:t>
+      </w:r>
+      <w:proofErr w:type="spellEnd"/>
+      <w:r>
+        <w:rPr>
+          <w:rFonts w:ascii="Times New Roman" w:hAnsi="Times New Roman" w:cs="Times New Roman"/>
+          <w:color w:val="00B050"/>
+          <w:lang w:val="es-ES_tradnl"/>
+        </w:rPr>
+        <w:t>.</w:t>
+      </w:r>
+    </w:p>
+    <w:p>
+      <w:pPr>
+        <w:rPr>
+          <w:rFonts w:ascii="Times New Roman" w:hAnsi="Times New Roman" w:cs="Times New Roman"/>
+          <w:lang w:val="es-ES_tradnl"/>
+        </w:rPr>
+      </w:pPr>
+      <w:r>
+        <w:rPr>
+          <w:rFonts w:ascii="Times New Roman" w:hAnsi="Times New Roman" w:cs="Times New Roman"/>
+          <w:lang w:val="es-ES_tradnl"/>
+        </w:rPr>
+        <w:t xml:space="preserve">Recorre desde la fila dos hasta </w:t>
+      </w:r>
+      <w:proofErr w:type="spellStart"/>
+      <w:r>
+        <w:rPr>
+          <w:rFonts w:ascii="Times New Roman" w:hAnsi="Times New Roman" w:cs="Times New Roman"/>
+          <w:color w:val="00B050"/>
+          <w:lang w:val="es-ES_tradnl"/>
+        </w:rPr>
+        <w:t>hoja.max_row</w:t>
+      </w:r>
+      <w:proofErr w:type="spellEnd"/>
+      <w:r>
+        <w:rPr>
+          <w:rFonts w:ascii="Times New Roman" w:hAnsi="Times New Roman" w:cs="Times New Roman"/>
+          <w:color w:val="00B050"/>
+          <w:lang w:val="es-ES_tradnl"/>
+        </w:rPr>
+        <w:t xml:space="preserve"> </w:t>
+      </w:r>
+    </w:p>
+    <w:p>
+      <w:pPr>
+        <w:rPr>
+          <w:rFonts w:ascii="Times New Roman" w:hAnsi="Times New Roman" w:cs="Times New Roman"/>
+          <w:lang w:val="es-ES_tradnl"/>
+        </w:rPr>
+      </w:pPr>
+      <w:r>
+        <w:rPr>
+          <w:rFonts w:ascii="Times New Roman" w:hAnsi="Times New Roman" w:cs="Times New Roman"/>
+          <w:lang w:val="es-ES_tradnl"/>
+        </w:rPr>
+        <w:t xml:space="preserve">Si una fila no tiene nombre ni curso, la salta con </w:t>
+      </w:r>
+      <w:r>
+        <w:rPr>
+          <w:rFonts w:ascii="Times New Roman" w:hAnsi="Times New Roman" w:cs="Times New Roman"/>
+          <w:color w:val="00B050"/>
+          <w:lang w:val="es-ES_tradnl"/>
+        </w:rPr>
+        <w:t>continue</w:t>
+      </w:r>
+      <w:r>
+        <w:rPr>
+          <w:rFonts w:ascii="Times New Roman" w:hAnsi="Times New Roman" w:cs="Times New Roman"/>
+          <w:color w:val="00B050"/>
+          <w:lang w:val="es-ES_tradnl"/>
+        </w:rPr>
+        <w:t xml:space="preserve"> </w:t>
+      </w:r>
+    </w:p>
+    <w:p>
+      <w:pPr>
+        <w:rPr>
+          <w:rFonts w:ascii="Times New Roman" w:hAnsi="Times New Roman" w:cs="Times New Roman"/>
+          <w:color w:val="00B050"/>
+          <w:lang w:val="es-ES_tradnl"/>
+        </w:rPr>
+      </w:pPr>
+      <w:r>
+        <w:rPr>
+          <w:rFonts w:ascii="Times New Roman" w:hAnsi="Times New Roman" w:cs="Times New Roman"/>
+          <w:lang w:val="es-ES_tradnl"/>
+        </w:rPr>
+        <w:t xml:space="preserve">Si tiene datos, los mete en un diccionario y los añade a la lista de </w:t>
+      </w:r>
+      <w:r>
+        <w:rPr>
+          <w:rFonts w:ascii="Times New Roman" w:hAnsi="Times New Roman" w:cs="Times New Roman"/>
+          <w:color w:val="00B050"/>
+          <w:lang w:val="es-ES_tradnl"/>
+        </w:rPr>
+        <w:t>alumnos</w:t>
+      </w:r>
+    </w:p>
+    <w:p>
+      <w:pPr>
+        <w:rPr>
+          <w:rFonts w:ascii="Times New Roman" w:hAnsi="Times New Roman" w:cs="Times New Roman"/>
+          <w:color w:val="00B050"/>
+          <w:lang w:val="es-ES_tradnl"/>
+        </w:rPr>
+      </w:pPr>
+      <w:r>
+        <w:rPr>
+          <w:rFonts w:ascii="Times New Roman" w:hAnsi="Times New Roman" w:cs="Times New Roman"/>
+          <w:lang w:val="es-ES_tradnl"/>
+        </w:rPr>
+        <w:t xml:space="preserve">Al final devuelve esa lista con </w:t>
+      </w:r>
+      <w:proofErr w:type="spellStart"/>
+      <w:r>
+        <w:rPr>
+          <w:rFonts w:ascii="Times New Roman" w:hAnsi="Times New Roman" w:cs="Times New Roman"/>
+          <w:color w:val="00B050"/>
+          <w:lang w:val="es-ES_tradnl"/>
+        </w:rPr>
+        <w:t>return</w:t>
+      </w:r>
+      <w:proofErr w:type="spellEnd"/>
+      <w:r>
+        <w:rPr>
+          <w:rFonts w:ascii="Times New Roman" w:hAnsi="Times New Roman" w:cs="Times New Roman"/>
+          <w:color w:val="00B050"/>
+          <w:lang w:val="es-ES_tradnl"/>
+        </w:rPr>
+        <w:t>.</w:t>
+      </w:r>
+    </w:p>
+    <w:p>
+      <w:pPr>
+        <w:rPr>
+          <w:rFonts w:ascii="Times New Roman" w:hAnsi="Times New Roman" w:cs="Times New Roman"/>
+          <w:color w:val="00B050"/>
+          <w:lang w:val="es-ES_tradnl"/>
+        </w:rPr>
+      </w:pPr>
+      <w:r>
+        <w:rPr>
+          <w:rFonts w:ascii="Times New Roman" w:hAnsi="Times New Roman" w:cs="Times New Roman"/>
+          <w:lang w:val="es-ES_tradnl"/>
+        </w:rPr>
+        <w:t>Ahora creamos el método para crear los PDF</w:t>
+      </w:r>
+      <w:proofErr w:type="spellStart"/>
+      <w:r>
+        <w:rPr>
+          <w:rFonts w:ascii="Times New Roman" w:hAnsi="Times New Roman" w:cs="Times New Roman"/>
+          <w:lang w:val="es-ES_tradnl"/>
+        </w:rPr>
+        <w:t>s</w:t>
+      </w:r>
+      <w:proofErr w:type="spellEnd"/>
+      <w:r>
+        <w:rPr>
+          <w:rFonts w:ascii="Times New Roman" w:hAnsi="Times New Roman" w:cs="Times New Roman"/>
+          <w:lang w:val="es-ES_tradnl"/>
+        </w:rPr>
+        <w:t xml:space="preserve">. </w:t>
+      </w:r>
+      <w:r>
+        <w:rPr>
+          <w:rFonts w:ascii="Times New Roman" w:hAnsi="Times New Roman" w:cs="Times New Roman"/>
+          <w:lang w:val="es-ES_tradnl"/>
+        </w:rPr>
+        <w:t xml:space="preserve">Lo configuramos, añadimos la hoja y devolvemos el PDF con </w:t>
+      </w:r>
+      <w:proofErr w:type="spellStart"/>
+      <w:r>
+        <w:rPr>
+          <w:rFonts w:ascii="Times New Roman" w:hAnsi="Times New Roman" w:cs="Times New Roman"/>
+          <w:color w:val="00B050"/>
+          <w:lang w:val="es-ES_tradnl"/>
+        </w:rPr>
+        <w:t>return</w:t>
+      </w:r>
+      <w:proofErr w:type="spellEnd"/>
+      <w:r>
+        <w:rPr>
+          <w:rFonts w:ascii="Times New Roman" w:hAnsi="Times New Roman" w:cs="Times New Roman"/>
+          <w:color w:val="00B050"/>
+          <w:lang w:val="es-ES_tradnl"/>
+        </w:rPr>
+        <w:t xml:space="preserve"> </w:t>
+      </w:r>
+      <w:proofErr w:type="spellStart"/>
+      <w:r>
+        <w:rPr>
+          <w:rFonts w:ascii="Times New Roman" w:hAnsi="Times New Roman" w:cs="Times New Roman"/>
+          <w:color w:val="00B050"/>
+          <w:lang w:val="es-ES_tradnl"/>
+        </w:rPr>
+        <w:t>pdf</w:t>
+      </w:r>
+      <w:proofErr w:type="spellEnd"/>
+      <w:r>
+        <w:rPr>
+          <w:rFonts w:ascii="Times New Roman" w:hAnsi="Times New Roman" w:cs="Times New Roman"/>
+          <w:color w:val="00B050"/>
+          <w:lang w:val="es-ES_tradnl"/>
+        </w:rPr>
+        <w:t xml:space="preserve"> </w:t>
+      </w:r>
+    </w:p>
+    <w:p>
+      <w:pPr>
+        <w:rPr>
+          <w:rFonts w:ascii="Times New Roman" w:hAnsi="Times New Roman" w:cs="Times New Roman"/>
+          <w:lang w:val="es-ES_tradnl"/>
+        </w:rPr>
+      </w:pPr>
+      <w:r>
+        <w:rPr>
+          <w:rFonts w:ascii="Times New Roman" w:hAnsi="Times New Roman" w:cs="Times New Roman"/>
+          <w:lang w:val="es-ES_tradnl"/>
+        </w:rPr>
+        <w:t xml:space="preserve">Ahora creamos el método de </w:t>
+      </w:r>
+      <w:proofErr w:type="spellStart"/>
+      <w:r>
+        <w:rPr>
+          <w:rFonts w:ascii="Times New Roman" w:hAnsi="Times New Roman" w:cs="Times New Roman"/>
+          <w:color w:val="00B050"/>
+          <w:lang w:val="es-ES_tradnl"/>
+        </w:rPr>
+        <w:t>nombre_archivo_seguro</w:t>
+      </w:r>
+      <w:proofErr w:type="spellEnd"/>
+      <w:r>
+        <w:rPr>
+          <w:rFonts w:ascii="Times New Roman" w:hAnsi="Times New Roman" w:cs="Times New Roman"/>
+          <w:color w:val="00B050"/>
+          <w:lang w:val="es-ES_tradnl"/>
+        </w:rPr>
+        <w:t xml:space="preserve"> </w:t>
+      </w:r>
+      <w:r>
+        <w:rPr>
+          <w:rFonts w:ascii="Times New Roman" w:hAnsi="Times New Roman" w:cs="Times New Roman"/>
+          <w:lang w:val="es-ES_tradnl"/>
+        </w:rPr>
+        <w:t>y lo retornamos.</w:t>
+      </w:r>
+    </w:p>
+    <w:p>
+      <w:pPr>
+        <w:rPr>
+          <w:rFonts w:ascii="Times New Roman" w:hAnsi="Times New Roman" w:cs="Times New Roman"/>
+          <w:lang w:val="es-ES_tradnl"/>
+        </w:rPr>
+      </w:pPr>
+      <w:r>
+        <w:rPr>
+          <w:rFonts w:ascii="Times New Roman" w:hAnsi="Times New Roman" w:cs="Times New Roman"/>
+          <w:lang w:val="es-ES_tradnl"/>
+        </w:rPr>
+        <w:t xml:space="preserve">Creamos el método </w:t>
+      </w:r>
+      <w:r>
+        <w:rPr>
+          <w:rFonts w:ascii="Times New Roman" w:hAnsi="Times New Roman" w:cs="Times New Roman"/>
+          <w:color w:val="00B050"/>
+          <w:lang w:val="es-ES_tradnl"/>
+        </w:rPr>
+        <w:t xml:space="preserve">guardar </w:t>
+      </w:r>
+      <w:r>
+        <w:rPr>
+          <w:rFonts w:ascii="Times New Roman" w:hAnsi="Times New Roman" w:cs="Times New Roman"/>
+          <w:lang w:val="es-ES_tradnl"/>
+        </w:rPr>
+        <w:t xml:space="preserve">con sus </w:t>
+      </w:r>
+      <w:proofErr w:type="gramStart"/>
+      <w:r>
+        <w:rPr>
+          <w:rFonts w:ascii="Times New Roman" w:hAnsi="Times New Roman" w:cs="Times New Roman"/>
+          <w:lang w:val="es-ES_tradnl"/>
+        </w:rPr>
+        <w:t>instrucciones ,</w:t>
+      </w:r>
+      <w:proofErr w:type="gramEnd"/>
+      <w:r>
+        <w:rPr>
+          <w:rFonts w:ascii="Times New Roman" w:hAnsi="Times New Roman" w:cs="Times New Roman"/>
+          <w:lang w:val="es-ES_tradnl"/>
+        </w:rPr>
+        <w:t xml:space="preserve"> luego creamos el método </w:t>
+      </w:r>
+      <w:proofErr w:type="spellStart"/>
+      <w:r>
+        <w:rPr>
+          <w:rFonts w:ascii="Times New Roman" w:hAnsi="Times New Roman" w:cs="Times New Roman"/>
+          <w:color w:val="00B050"/>
+          <w:lang w:val="es-ES_tradnl"/>
+        </w:rPr>
+        <w:t>generar_desde_excel</w:t>
+      </w:r>
+      <w:proofErr w:type="spellEnd"/>
+      <w:r>
+        <w:rPr>
+          <w:rFonts w:ascii="Times New Roman" w:hAnsi="Times New Roman" w:cs="Times New Roman"/>
+          <w:color w:val="00B050"/>
+          <w:lang w:val="es-ES_tradnl"/>
+        </w:rPr>
+        <w:t xml:space="preserve"> </w:t>
+      </w:r>
+      <w:r>
+        <w:rPr>
+          <w:rFonts w:ascii="Times New Roman" w:hAnsi="Times New Roman" w:cs="Times New Roman"/>
+          <w:lang w:val="es-ES_tradnl"/>
+        </w:rPr>
+        <w:t>que lee el Excel y crea un PDF por cada alumno</w:t>
+      </w:r>
+    </w:p>
+    <w:p>
+      <w:pPr>
+        <w:rPr>
+          <w:rFonts w:ascii="Times New Roman" w:hAnsi="Times New Roman" w:cs="Times New Roman"/>
+          <w:lang w:val="es-ES_tradnl"/>
+        </w:rPr>
+      </w:pPr>
+      <w:r>
+        <w:rPr>
+          <w:rFonts w:ascii="Times New Roman" w:hAnsi="Times New Roman" w:cs="Times New Roman"/>
+          <w:lang w:val="es-ES_tradnl"/>
+        </w:rPr>
+        <w:t>Si no pasan os una fecha, la pide por teclado. Esa fecha es ara todos</w:t>
+      </w:r>
+    </w:p>
+    <w:p>
+      <w:pPr>
+        <w:rPr>
+          <w:rFonts w:ascii="Times New Roman" w:hAnsi="Times New Roman" w:cs="Times New Roman"/>
+          <w:lang w:val="es-ES_tradnl"/>
+        </w:rPr>
+      </w:pPr>
+      <w:r>
+        <w:rPr>
+          <w:rFonts w:ascii="Times New Roman" w:hAnsi="Times New Roman" w:cs="Times New Roman"/>
+          <w:lang w:val="es-ES_tradnl"/>
+        </w:rPr>
+        <w:t xml:space="preserve">Llama a </w:t>
+      </w:r>
+      <w:proofErr w:type="spellStart"/>
+      <w:r>
+        <w:rPr>
+          <w:rFonts w:ascii="Times New Roman" w:hAnsi="Times New Roman" w:cs="Times New Roman"/>
+          <w:color w:val="00B050"/>
+          <w:lang w:val="es-ES_tradnl"/>
+        </w:rPr>
+        <w:t>leer_</w:t>
+      </w:r>
+      <w:proofErr w:type="gramStart"/>
+      <w:r>
+        <w:rPr>
+          <w:rFonts w:ascii="Times New Roman" w:hAnsi="Times New Roman" w:cs="Times New Roman"/>
+          <w:color w:val="00B050"/>
+          <w:lang w:val="es-ES_tradnl"/>
+        </w:rPr>
+        <w:t>excel</w:t>
+      </w:r>
+      <w:proofErr w:type="spellEnd"/>
+      <w:r>
+        <w:rPr>
+          <w:rFonts w:ascii="Times New Roman" w:hAnsi="Times New Roman" w:cs="Times New Roman"/>
+          <w:color w:val="00B050"/>
+          <w:lang w:val="es-ES_tradnl"/>
+        </w:rPr>
+        <w:t xml:space="preserve">  </w:t>
+      </w:r>
+      <w:r>
+        <w:rPr>
+          <w:rFonts w:ascii="Times New Roman" w:hAnsi="Times New Roman" w:cs="Times New Roman"/>
+          <w:lang w:val="es-ES_tradnl"/>
+        </w:rPr>
+        <w:t>y</w:t>
+      </w:r>
+      <w:proofErr w:type="gramEnd"/>
+      <w:r>
+        <w:rPr>
+          <w:rFonts w:ascii="Times New Roman" w:hAnsi="Times New Roman" w:cs="Times New Roman"/>
+          <w:lang w:val="es-ES_tradnl"/>
+        </w:rPr>
+        <w:t xml:space="preserve"> obtiene la lista de alumnos</w:t>
+      </w:r>
+    </w:p>
+    <w:p>
+      <w:pPr>
+        <w:rPr>
+          <w:rFonts w:ascii="Times New Roman" w:hAnsi="Times New Roman" w:cs="Times New Roman"/>
+          <w:lang w:val="es-ES_tradnl"/>
+        </w:rPr>
+      </w:pPr>
+      <w:r>
+        <w:rPr>
+          <w:rFonts w:ascii="Times New Roman" w:hAnsi="Times New Roman" w:cs="Times New Roman"/>
+          <w:lang w:val="es-ES_tradnl"/>
+        </w:rPr>
+        <w:t>Por cada alumno copia nombre y curso al objeto, crea el PDF, calcula el nombre del archivo y lo guarda.</w:t>
+      </w:r>
+    </w:p>
+    <w:p>
+      <w:pPr>
+        <w:rPr>
+          <w:rFonts w:ascii="Times New Roman" w:hAnsi="Times New Roman" w:cs="Times New Roman"/>
+          <w:lang w:val="es-ES_tradnl"/>
+        </w:rPr>
+      </w:pPr>
+      <w:r>
+        <w:rPr>
+          <w:rFonts w:ascii="Times New Roman" w:hAnsi="Times New Roman" w:cs="Times New Roman"/>
+          <w:lang w:val="es-ES_tradnl"/>
+        </w:rPr>
+        <w:lastRenderedPageBreak/>
+        <w:t xml:space="preserve">Imprime un OK por cada uno y al final </w:t>
+      </w:r>
+      <w:r>
+        <w:rPr>
+          <w:rFonts w:ascii="Times New Roman" w:hAnsi="Times New Roman" w:cs="Times New Roman"/>
+          <w:lang w:val="es-ES_tradnl"/>
+        </w:rPr>
+        <w:t>la carpeta donde quedaron.</w:t>
+      </w:r>
+    </w:p>
+    <w:p>
+      <w:pPr>
+        <w:rPr>
+          <w:rFonts w:ascii="Times New Roman" w:hAnsi="Times New Roman" w:cs="Times New Roman"/>
+          <w:lang w:val="es-ES_tradnl"/>
+        </w:rPr>
+      </w:pPr>
+      <w:r>
+        <w:rPr>
+          <w:rFonts w:ascii="Times New Roman" w:hAnsi="Times New Roman" w:cs="Times New Roman"/>
+          <w:lang w:val="es-ES_tradnl"/>
+        </w:rPr>
+        <w:t xml:space="preserve">El </w:t>
+      </w:r>
+      <w:proofErr w:type="spellStart"/>
+      <w:r>
+        <w:rPr>
+          <w:rFonts w:ascii="Times New Roman" w:hAnsi="Times New Roman" w:cs="Times New Roman"/>
+          <w:lang w:val="es-ES_tradnl"/>
+        </w:rPr>
+        <w:t>for</w:t>
+      </w:r>
+      <w:proofErr w:type="spellEnd"/>
+      <w:r>
+        <w:rPr>
+          <w:rFonts w:ascii="Times New Roman" w:hAnsi="Times New Roman" w:cs="Times New Roman"/>
+          <w:lang w:val="es-ES_tradnl"/>
+        </w:rPr>
+        <w:t xml:space="preserve"> es el corazón: una fila del Excel se convierte en un PDF</w:t>
+      </w:r>
+    </w:p>
+    <w:p>
+      <w:pPr>
+        <w:rPr>
+          <w:rFonts w:ascii="Times New Roman" w:hAnsi="Times New Roman" w:cs="Times New Roman"/>
+          <w:lang w:val="es-ES_tradnl"/>
+        </w:rPr>
+      </w:pPr>
+      <w:r>
+        <w:rPr>
+          <w:rFonts w:ascii="Times New Roman" w:hAnsi="Times New Roman" w:cs="Times New Roman"/>
+          <w:lang w:val="es-ES_tradnl"/>
+        </w:rPr>
+        <w:t>Al final, arrancamos el programa:</w:t>
+      </w:r>
+    </w:p>
+    <w:p>
+      <w:pPr>
+        <w:rPr>
+          <w:rFonts w:ascii="Times New Roman" w:hAnsi="Times New Roman" w:cs="Times New Roman"/>
+          <w:lang w:val="es-ES_tradnl"/>
+        </w:rPr>
+      </w:pPr>
+      <w:r>
+        <w:rPr>
+          <w:rFonts w:ascii="Times New Roman" w:hAnsi="Times New Roman" w:cs="Times New Roman"/>
+          <w:lang w:val="es-ES_tradnl"/>
+        </w:rPr>
+        <w:t xml:space="preserve">El </w:t>
+      </w:r>
+      <w:proofErr w:type="spellStart"/>
+      <w:r>
+        <w:rPr>
+          <w:rFonts w:ascii="Times New Roman" w:hAnsi="Times New Roman" w:cs="Times New Roman"/>
+          <w:lang w:val="es-ES_tradnl"/>
+        </w:rPr>
+        <w:t>if</w:t>
+      </w:r>
+      <w:proofErr w:type="spellEnd"/>
+      <w:r>
+        <w:rPr>
+          <w:rFonts w:ascii="Times New Roman" w:hAnsi="Times New Roman" w:cs="Times New Roman"/>
+          <w:lang w:val="es-ES_tradnl"/>
+        </w:rPr>
+        <w:t xml:space="preserve"> sólo se cumple cuando ejecutas el archivo directamente</w:t>
+      </w:r>
+      <w:r>
+        <w:rPr>
+          <w:rFonts w:ascii="Times New Roman" w:hAnsi="Times New Roman" w:cs="Times New Roman"/>
+          <w:lang w:val="es-ES_tradnl"/>
+        </w:rPr>
+        <w:t xml:space="preserve">. Crea </w:t>
+      </w:r>
+      <w:r>
+        <w:rPr>
+          <w:rFonts w:ascii="Times New Roman" w:hAnsi="Times New Roman" w:cs="Times New Roman"/>
+          <w:lang w:val="es-ES_tradnl"/>
+        </w:rPr>
+        <w:t xml:space="preserve">un objeto de la clase y le pide </w:t>
+      </w:r>
+      <w:r>
+        <w:rPr>
+          <w:rFonts w:ascii="Times New Roman" w:hAnsi="Times New Roman" w:cs="Times New Roman"/>
+          <w:lang w:val="es-ES_tradnl"/>
+        </w:rPr>
+        <w:t xml:space="preserve">que genere los certificados desde </w:t>
+      </w:r>
+      <w:proofErr w:type="spellStart"/>
+      <w:proofErr w:type="gramStart"/>
+      <w:r>
+        <w:rPr>
+          <w:rFonts w:ascii="Times New Roman" w:hAnsi="Times New Roman" w:cs="Times New Roman"/>
+          <w:lang w:val="es-ES_tradnl"/>
+        </w:rPr>
+        <w:t>alumnos.xslx</w:t>
+      </w:r>
+      <w:proofErr w:type="spellEnd"/>
+      <w:proofErr w:type="gramEnd"/>
+      <w:r>
+        <w:rPr>
+          <w:rFonts w:ascii="Times New Roman" w:hAnsi="Times New Roman" w:cs="Times New Roman"/>
+          <w:lang w:val="es-ES_tradnl"/>
+        </w:rPr>
+        <w:t xml:space="preserve">. </w:t>
+      </w:r>
+    </w:p>
+    <w:p>
+      <w:pPr>
+        <w:rPr>
+          <w:rFonts w:ascii="Times New Roman" w:hAnsi="Times New Roman" w:cs="Times New Roman"/>
+          <w:lang w:val="es-ES_tradnl"/>
+        </w:rPr>
+      </w:pPr>
+      <w:r>
+        <w:rPr>
+          <w:rFonts w:ascii="Times New Roman" w:hAnsi="Times New Roman" w:cs="Times New Roman"/>
+          <w:lang w:val="es-ES_tradnl"/>
+        </w:rPr>
+        <w:t>Este sería el orden real de la ejecución: Aunque los métodos están definidos de arriba hacía abajo, el programa no los llama en ese orden.</w:t>
+      </w:r>
+    </w:p>
+    <w:p>
+      <w:pPr>
+        <w:pStyle w:val="Prrafodelista"/>
+        <w:numPr>
+          <w:ilvl w:val="0"/>
+          <w:numId w:val="1"/>
+        </w:numPr>
+        <w:rPr>
+          <w:rFonts w:ascii="Times New Roman" w:hAnsi="Times New Roman" w:cs="Times New Roman"/>
+          <w:lang w:val="es-ES_tradnl"/>
+        </w:rPr>
+      </w:pPr>
+      <w:r>
+        <w:rPr>
+          <w:rFonts w:ascii="Times New Roman" w:hAnsi="Times New Roman" w:cs="Times New Roman"/>
+          <w:lang w:val="es-ES_tradnl"/>
+        </w:rPr>
+        <w:t xml:space="preserve">Se crea generador y </w:t>
+      </w:r>
+      <w:r>
+        <w:rPr>
+          <w:rFonts w:ascii="Times New Roman" w:hAnsi="Times New Roman" w:cs="Times New Roman"/>
+          <w:color w:val="00B050"/>
+          <w:lang w:val="es-ES_tradnl"/>
+        </w:rPr>
+        <w:t>__</w:t>
+      </w:r>
+      <w:proofErr w:type="spellStart"/>
+      <w:r>
+        <w:rPr>
+          <w:rFonts w:ascii="Times New Roman" w:hAnsi="Times New Roman" w:cs="Times New Roman"/>
+          <w:color w:val="00B050"/>
+          <w:lang w:val="es-ES_tradnl"/>
+        </w:rPr>
+        <w:t>init</w:t>
+      </w:r>
+      <w:proofErr w:type="spellEnd"/>
+      <w:r>
+        <w:rPr>
+          <w:rFonts w:ascii="Times New Roman" w:hAnsi="Times New Roman" w:cs="Times New Roman"/>
+          <w:color w:val="00B050"/>
+          <w:lang w:val="es-ES_tradnl"/>
+        </w:rPr>
+        <w:t xml:space="preserve">__ </w:t>
+      </w:r>
+      <w:r>
+        <w:rPr>
+          <w:rFonts w:ascii="Times New Roman" w:hAnsi="Times New Roman" w:cs="Times New Roman"/>
+          <w:lang w:val="es-ES_tradnl"/>
+        </w:rPr>
+        <w:t>prepara carpetas, fuentes y variables vacías.</w:t>
+      </w:r>
+    </w:p>
+    <w:p>
+      <w:pPr>
+        <w:pStyle w:val="Prrafodelista"/>
+        <w:numPr>
+          <w:ilvl w:val="0"/>
+          <w:numId w:val="1"/>
+        </w:numPr>
+        <w:rPr>
+          <w:rFonts w:ascii="Times New Roman" w:hAnsi="Times New Roman" w:cs="Times New Roman"/>
+          <w:lang w:val="es-ES_tradnl"/>
+        </w:rPr>
+      </w:pPr>
+      <w:proofErr w:type="spellStart"/>
+      <w:r>
+        <w:rPr>
+          <w:rFonts w:ascii="Times New Roman" w:hAnsi="Times New Roman" w:cs="Times New Roman"/>
+          <w:color w:val="00B050"/>
+          <w:lang w:val="es-ES_tradnl"/>
+        </w:rPr>
+        <w:t>generar_desde_excel</w:t>
+      </w:r>
+      <w:proofErr w:type="spellEnd"/>
+      <w:r>
+        <w:rPr>
+          <w:rFonts w:ascii="Times New Roman" w:hAnsi="Times New Roman" w:cs="Times New Roman"/>
+          <w:lang w:val="es-ES_tradnl"/>
+        </w:rPr>
+        <w:t xml:space="preserve"> pide la fecha.</w:t>
+      </w:r>
+    </w:p>
+    <w:p>
+      <w:pPr>
+        <w:pStyle w:val="Prrafodelista"/>
+        <w:numPr>
+          <w:ilvl w:val="0"/>
+          <w:numId w:val="1"/>
+        </w:numPr>
+        <w:rPr>
+          <w:rFonts w:ascii="Times New Roman" w:hAnsi="Times New Roman" w:cs="Times New Roman"/>
+          <w:lang w:val="es-ES_tradnl"/>
+        </w:rPr>
+      </w:pPr>
+      <w:proofErr w:type="spellStart"/>
+      <w:r>
+        <w:rPr>
+          <w:rFonts w:ascii="Times New Roman" w:hAnsi="Times New Roman" w:cs="Times New Roman"/>
+          <w:color w:val="00B050"/>
+          <w:lang w:val="es-ES_tradnl"/>
+        </w:rPr>
+        <w:t>leer_excel</w:t>
+      </w:r>
+      <w:proofErr w:type="spellEnd"/>
+      <w:r>
+        <w:rPr>
+          <w:rFonts w:ascii="Times New Roman" w:hAnsi="Times New Roman" w:cs="Times New Roman"/>
+          <w:lang w:val="es-ES_tradnl"/>
+        </w:rPr>
+        <w:t xml:space="preserve"> arma la lista de alumnos.</w:t>
+      </w:r>
+    </w:p>
+    <w:p>
+      <w:pPr>
+        <w:pStyle w:val="Prrafodelista"/>
+        <w:numPr>
+          <w:ilvl w:val="0"/>
+          <w:numId w:val="1"/>
+        </w:numPr>
+        <w:rPr>
+          <w:rFonts w:ascii="Times New Roman" w:hAnsi="Times New Roman" w:cs="Times New Roman"/>
+          <w:lang w:val="es-ES_tradnl"/>
+        </w:rPr>
+      </w:pPr>
+      <w:r>
+        <w:rPr>
+          <w:rFonts w:ascii="Times New Roman" w:hAnsi="Times New Roman" w:cs="Times New Roman"/>
+          <w:lang w:val="es-ES_tradnl"/>
+        </w:rPr>
+        <w:t xml:space="preserve">Por cada alumno: </w:t>
+      </w:r>
+      <w:proofErr w:type="spellStart"/>
+      <w:r>
+        <w:rPr>
+          <w:rFonts w:ascii="Times New Roman" w:hAnsi="Times New Roman" w:cs="Times New Roman"/>
+          <w:color w:val="00B050"/>
+          <w:lang w:val="es-ES_tradnl"/>
+        </w:rPr>
+        <w:t>crear_pdf</w:t>
+      </w:r>
+      <w:proofErr w:type="spellEnd"/>
+      <w:r>
+        <w:rPr>
+          <w:rFonts w:ascii="Times New Roman" w:hAnsi="Times New Roman" w:cs="Times New Roman"/>
+          <w:color w:val="00B050"/>
+          <w:lang w:val="es-ES_tradnl"/>
+        </w:rPr>
+        <w:t xml:space="preserve"> </w:t>
+      </w:r>
+      <w:r>
+        <w:rPr>
+          <w:rFonts w:ascii="Times New Roman" w:hAnsi="Times New Roman" w:cs="Times New Roman"/>
+          <w:lang w:val="es-ES_tradnl"/>
+        </w:rPr>
+        <w:t xml:space="preserve">– </w:t>
+      </w:r>
+      <w:proofErr w:type="spellStart"/>
+      <w:r>
+        <w:rPr>
+          <w:rFonts w:ascii="Times New Roman" w:hAnsi="Times New Roman" w:cs="Times New Roman"/>
+          <w:color w:val="00B050"/>
+          <w:lang w:val="es-ES_tradnl"/>
+        </w:rPr>
+        <w:t>nombre_archivo_seguro</w:t>
+      </w:r>
+      <w:proofErr w:type="spellEnd"/>
+      <w:r>
+        <w:rPr>
+          <w:rFonts w:ascii="Times New Roman" w:hAnsi="Times New Roman" w:cs="Times New Roman"/>
+          <w:lang w:val="es-ES_tradnl"/>
+        </w:rPr>
+        <w:t xml:space="preserve"> </w:t>
+      </w:r>
+      <w:r>
+        <w:rPr>
+          <w:rFonts w:ascii="Times New Roman" w:hAnsi="Times New Roman" w:cs="Times New Roman"/>
+          <w:lang w:val="es-ES_tradnl"/>
+        </w:rPr>
+        <w:t>–</w:t>
+      </w:r>
+      <w:r>
+        <w:rPr>
+          <w:rFonts w:ascii="Times New Roman" w:hAnsi="Times New Roman" w:cs="Times New Roman"/>
+          <w:lang w:val="es-ES_tradnl"/>
+        </w:rPr>
+        <w:t xml:space="preserve"> </w:t>
+      </w:r>
+      <w:r>
+        <w:rPr>
+          <w:rFonts w:ascii="Times New Roman" w:hAnsi="Times New Roman" w:cs="Times New Roman"/>
+          <w:color w:val="00B050"/>
+          <w:lang w:val="es-ES_tradnl"/>
+        </w:rPr>
+        <w:t>guardar</w:t>
+      </w:r>
+    </w:p>
+    <w:p>
+      <w:pPr>
+        <w:pStyle w:val="Prrafodelista"/>
+        <w:numPr>
+          <w:ilvl w:val="0"/>
+          <w:numId w:val="1"/>
+        </w:numPr>
+        <w:rPr>
+          <w:rFonts w:ascii="Times New Roman" w:hAnsi="Times New Roman" w:cs="Times New Roman"/>
+          <w:lang w:val="es-ES_tradnl"/>
+        </w:rPr>
+      </w:pPr>
+      <w:r>
+        <w:rPr>
+          <w:rFonts w:ascii="Times New Roman" w:hAnsi="Times New Roman" w:cs="Times New Roman"/>
+          <w:lang w:val="es-ES_tradnl"/>
+        </w:rPr>
+        <w:t>Termina e imprime la carpeta</w:t>
+      </w:r>
+      <w:r>
+        <w:rPr>
+          <w:rFonts w:ascii="Times New Roman" w:hAnsi="Times New Roman" w:cs="Times New Roman"/>
+          <w:color w:val="00B050"/>
+          <w:lang w:val="es-ES_tradnl"/>
+        </w:rPr>
+        <w:t xml:space="preserve"> </w:t>
+      </w:r>
+      <w:proofErr w:type="spellStart"/>
+      <w:r>
+        <w:rPr>
+          <w:rFonts w:ascii="Times New Roman" w:hAnsi="Times New Roman" w:cs="Times New Roman"/>
+          <w:color w:val="00B050"/>
+          <w:lang w:val="es-ES_tradnl"/>
+        </w:rPr>
+        <w:t>certificados_excel</w:t>
+      </w:r>
+      <w:proofErr w:type="spellEnd"/>
+    </w:p>
+    <w:p>
+      <w:pPr>
+        <w:rPr>
+          <w:rFonts w:ascii="Times New Roman" w:hAnsi="Times New Roman" w:cs="Times New Roman"/>
+          <w:lang w:val="es-ES_tradnl"/>
+        </w:rPr>
+      </w:pPr>
+    </w:p>
+    <w:p>
+      <w:pPr>
+        <w:rPr>
+          <w:rFonts w:ascii="Times New Roman" w:hAnsi="Times New Roman" w:cs="Times New Roman"/>
+          <w:lang w:val="es-ES_tradnl"/>
+        </w:rPr>
+      </w:pPr>
     </w:p>
     <w:sectPr>
       <w:pgSz w:w="12240" w:h="15840"/>
@@ -2500,6 +5098,103 @@
     </w:sectPr>
   </w:body>
 </w:document>
+</file>
+
+<file path=word/numbering.xml><?xml version="1.0" encoding="utf-8"?>
+<w:numbering xmlns:wpc="http://schemas.microsoft.com/office/word/2010/wordprocessingCanvas" xmlns:cx="http://schemas.microsoft.com/office/drawing/2014/chartex" xmlns:cx1="http://schemas.microsoft.com/office/drawing/2015/9/8/chartex" xmlns:cx2="http://schemas.microsoft.com/office/drawing/2015/10/21/chartex" xmlns:cx3="http://schemas.microsoft.com/office/drawing/2016/5/9/chartex" xmlns:cx4="http://schemas.microsoft.com/office/drawing/2016/5/10/chartex" xmlns:cx5="http://schemas.microsoft.com/office/drawing/2016/5/11/chartex" xmlns:cx6="http://schemas.microsoft.com/office/drawing/2016/5/12/chartex" xmlns:cx7="http://schemas.microsoft.com/office/drawing/2016/5/13/chartex" xmlns:cx8="http://schemas.microsoft.com/office/drawing/2016/5/14/chartex" xmlns:mc="http://schemas.openxmlformats.org/markup-compatibility/2006" xmlns:m="http://schemas.openxmlformats.org/officeDocument/2006/math" xmlns:aink="http://schemas.microsoft.com/office/drawing/2016/ink" xmlns:am3d="http://schemas.microsoft.com/office/drawing/2017/model3d" xmlns:oel="http://schemas.microsoft.com/office/2019/extlst" xmlns:r="http://schemas.openxmlformats.org/officeDocument/2006/relationships" xmlns:wp14="http://schemas.microsoft.com/office/word/2010/wordprocessingDrawing" xmlns:wp="http://schemas.openxmlformats.org/drawingml/2006/wordprocessingDrawing" xmlns:wpg="http://schemas.microsoft.com/office/word/2010/wordprocessingGroup" xmlns:wpi="http://schemas.microsoft.com/office/word/2010/wordprocessingInk" xmlns:wps="http://schemas.microsoft.com/office/word/2010/wordprocessingShape" xmlns:o="urn:schemas-microsoft-com:office:office" xmlns:v="urn:schemas-microsoft-com:vml" xmlns:w10="urn:schemas-microsoft-com:office:word" xmlns:w="http://schemas.openxmlformats.org/wordprocessingml/2006/main" xmlns:w14="http://schemas.microsoft.com/office/word/2010/wordml" xmlns:w15="http://schemas.microsoft.com/office/word/2012/wordml" xmlns:w16cex="http://schemas.microsoft.com/office/word/2018/wordml/cex" xmlns:w16cid="http://schemas.microsoft.com/office/word/2016/wordml/cid" xmlns:w16="http://schemas.microsoft.com/office/word/2018/wordml" xmlns:w16sdtdh="http://schemas.microsoft.com/office/word/2020/wordml/sdtdatahash" xmlns:w16sdtfl="http://schemas.microsoft.com/office/word/2024/wordml/sdtformatlock" xmlns:w16se="http://schemas.microsoft.com/office/word/2015/wordml/symex" xmlns:w16du="http://schemas.microsoft.com/office/word/2023/wordml/word16du" xmlns:wne="http://schemas.microsoft.com/office/word/2006/wordml" mc:Ignorable="w14 w15 w16se w16cid w16 w16cex w16sdtdh w16sdtfl w16du wp14">
+  <w:abstractNum w:abstractNumId="0" w15:restartNumberingAfterBreak="0">
+    <w:nsid w:val="10EB2CDC"/>
+    <w:multiLevelType w:val="hybridMultilevel"/>
+    <w:tmpl w:val="B20608D0"/>
+    <w:lvl w:ilvl="0" w:tplc="080A000F">
+      <w:start w:val="1"/>
+      <w:numFmt w:val="decimal"/>
+      <w:lvlText w:val="%1."/>
+      <w:lvlJc w:val="left"/>
+      <w:pPr>
+        <w:ind w:left="720" w:hanging="360"/>
+      </w:pPr>
+      <w:rPr>
+        <w:rFonts w:hint="default"/>
+      </w:rPr>
+    </w:lvl>
+    <w:lvl w:ilvl="1" w:tplc="080A0019" w:tentative="1">
+      <w:start w:val="1"/>
+      <w:numFmt w:val="lowerLetter"/>
+      <w:lvlText w:val="%2."/>
+      <w:lvlJc w:val="left"/>
+      <w:pPr>
+        <w:ind w:left="1440" w:hanging="360"/>
+      </w:pPr>
+    </w:lvl>
+    <w:lvl w:ilvl="2" w:tplc="080A001B" w:tentative="1">
+      <w:start w:val="1"/>
+      <w:numFmt w:val="lowerRoman"/>
+      <w:lvlText w:val="%3."/>
+      <w:lvlJc w:val="right"/>
+      <w:pPr>
+        <w:ind w:left="2160" w:hanging="180"/>
+      </w:pPr>
+    </w:lvl>
+    <w:lvl w:ilvl="3" w:tplc="080A000F" w:tentative="1">
+      <w:start w:val="1"/>
+      <w:numFmt w:val="decimal"/>
+      <w:lvlText w:val="%4."/>
+      <w:lvlJc w:val="left"/>
+      <w:pPr>
+        <w:ind w:left="2880" w:hanging="360"/>
+      </w:pPr>
+    </w:lvl>
+    <w:lvl w:ilvl="4" w:tplc="080A0019" w:tentative="1">
+      <w:start w:val="1"/>
+      <w:numFmt w:val="lowerLetter"/>
+      <w:lvlText w:val="%5."/>
+      <w:lvlJc w:val="left"/>
+      <w:pPr>
+        <w:ind w:left="3600" w:hanging="360"/>
+      </w:pPr>
+    </w:lvl>
+    <w:lvl w:ilvl="5" w:tplc="080A001B" w:tentative="1">
+      <w:start w:val="1"/>
+      <w:numFmt w:val="lowerRoman"/>
+      <w:lvlText w:val="%6."/>
+      <w:lvlJc w:val="right"/>
+      <w:pPr>
+        <w:ind w:left="4320" w:hanging="180"/>
+      </w:pPr>
+    </w:lvl>
+    <w:lvl w:ilvl="6" w:tplc="080A000F" w:tentative="1">
+      <w:start w:val="1"/>
+      <w:numFmt w:val="decimal"/>
+      <w:lvlText w:val="%7."/>
+      <w:lvlJc w:val="left"/>
+      <w:pPr>
+        <w:ind w:left="5040" w:hanging="360"/>
+      </w:pPr>
+    </w:lvl>
+    <w:lvl w:ilvl="7" w:tplc="080A0019" w:tentative="1">
+      <w:start w:val="1"/>
+      <w:numFmt w:val="lowerLetter"/>
+      <w:lvlText w:val="%8."/>
+      <w:lvlJc w:val="left"/>
+      <w:pPr>
+        <w:ind w:left="5760" w:hanging="360"/>
+      </w:pPr>
+    </w:lvl>
+    <w:lvl w:ilvl="8" w:tplc="080A001B" w:tentative="1">
+      <w:start w:val="1"/>
+      <w:numFmt w:val="lowerRoman"/>
+      <w:lvlText w:val="%9."/>
+      <w:lvlJc w:val="right"/>
+      <w:pPr>
+        <w:ind w:left="6480" w:hanging="180"/>
+      </w:pPr>
+    </w:lvl>
+  </w:abstractNum>
+  <w:num w:numId="1" w16cid:durableId="759911054">
+    <w:abstractNumId w:val="0"/>
+  </w:num>
+</w:numbering>
 </file>
 
 <file path=word/styles.xml><?xml version="1.0" encoding="utf-8"?>

</xml_diff>